<commit_message>
Updated tables to flextable as kable doesn't work with docx.
</commit_message>
<xml_diff>
--- a/treatment-calibration-trident-protocol.docx
+++ b/treatment-calibration-trident-protocol.docx
@@ -1388,222 +1388,916 @@
         <w:t xml:space="preserve">Comparison of AIC</w:t>
       </w:r>
     </w:p>
-    <w:tbl>
+    <w:tbl xmlns:w="http://schemas.openxmlformats.org/wordprocessingml/2006/main" xmlns:r="http://schemas.openxmlformats.org/officeDocument/2006/relationships" xmlns:w14="http://schemas.microsoft.com/office/word/2010/wordml" xmlns:wp="http://schemas.openxmlformats.org/drawingml/2006/wordprocessingDrawing" xmlns:a="http://schemas.openxmlformats.org/drawingml/2006/main" xmlns:pic="http://schemas.openxmlformats.org/drawingml/2006/picture">
       <w:tblPr>
-        <w:tblStyle w:val="Table"/>
-        <w:tblW w:type="auto" w:w="0"/>
-        <w:tblLook w:firstRow="1" w:lastRow="0" w:firstColumn="0" w:lastColumn="0" w:noHBand="0" w:noVBand="0" w:val="0020"/>
+        <w:tblLayout w:type="fixed"/>
+        <w:jc w:val="center"/>
+        <w:tblLook w:firstRow="1" w:lastRow="0" w:firstColumn="0" w:lastColumn="0" w:noHBand="0" w:noVBand="1"/>
       </w:tblPr>
       <w:tblGrid>
-        <w:gridCol w:w="3960"/>
-        <w:gridCol w:w="3960"/>
+        <w:gridCol w:w="2121"/>
+        <w:gridCol w:w="1043"/>
       </w:tblGrid>
       <w:tr>
         <w:trPr>
-          <w:tblHeader w:val="on"/>
+          <w:trHeight w:val="360" w:hRule="auto"/>
+          <w:tblHeader/>
         </w:trPr>
         <w:tc>
-          <w:tcPr/>
+          <w:tcPr>
+            <w:tcBorders>
+              <w:bottom w:val="single" w:sz="12" w:space="0" w:color="666666"/>
+              <w:top w:val="single" w:sz="12" w:space="0" w:color="666666"/>
+              <w:left w:val="none" w:sz="0" w:space="0" w:color="000000"/>
+              <w:right w:val="none" w:sz="0" w:space="0" w:color="000000"/>
+            </w:tcBorders>
+            <w:shd w:val="clear" w:color="auto" w:fill="FFFFFF"/>
+            <w:tcMar>
+              <w:top w:w="0" w:type="dxa"/>
+              <w:bottom w:w="0" w:type="dxa"/>
+              <w:left w:w="0" w:type="dxa"/>
+              <w:right w:w="0" w:type="dxa"/>
+            </w:tcMar>
+            <w:vAlign w:val="center"/>
+          </w:tcPr>
           <w:p>
             <w:pPr>
-              <w:pStyle w:val="Compact"/>
               <w:jc w:val="left"/>
+              <w:pBdr>
+                <w:bottom w:val="none" w:sz="0" w:space="0" w:color="000000"/>
+                <w:top w:val="none" w:sz="0" w:space="0" w:color="000000"/>
+                <w:left w:val="none" w:sz="0" w:space="0" w:color="000000"/>
+                <w:right w:val="none" w:sz="0" w:space="0" w:color="000000"/>
+              </w:pBdr>
+              <w:spacing w:after="120" w:before="120" w:line="240"/>
+              <w:ind w:left="120" w:right="120" w:firstLine="0" w:firstLineChars="0"/>
+              <w:rPr>
+                <w:rFonts w:ascii="Helvetica" w:hAnsi="Helvetica" w:eastAsia="Helvetica" w:cs="Helvetica"/>
+                <w:i w:val="false"/>
+                <w:b w:val="true"/>
+                <w:u w:val="none"/>
+                <w:strike w:val="false"/>
+                <w:sz w:val="20"/>
+                <w:szCs w:val="20"/>
+                <w:color w:val="000000"/>
+              </w:rPr>
             </w:pPr>
-            <w:r>
+            <w:r xmlns:w="http://schemas.openxmlformats.org/wordprocessingml/2006/main" xmlns:wp="http://schemas.openxmlformats.org/drawingml/2006/wordprocessingDrawing" xmlns:r="http://schemas.openxmlformats.org/officeDocument/2006/relationships" xmlns:w14="http://schemas.microsoft.com/office/word/2010/wordml">
+              <w:rPr>
+                <w:rFonts w:ascii="Helvetica" w:hAnsi="Helvetica" w:eastAsia="Helvetica" w:cs="Helvetica"/>
+                <w:i w:val="false"/>
+                <w:b w:val="true"/>
+                <w:u w:val="none"/>
+                <w:strike w:val="false"/>
+                <w:sz w:val="20"/>
+                <w:szCs w:val="20"/>
+                <w:color w:val="000000"/>
+              </w:rPr>
               <w:t xml:space="preserve">Model</w:t>
             </w:r>
           </w:p>
         </w:tc>
         <w:tc>
-          <w:tcPr/>
+          <w:tcPr>
+            <w:tcBorders>
+              <w:bottom w:val="single" w:sz="12" w:space="0" w:color="666666"/>
+              <w:top w:val="single" w:sz="12" w:space="0" w:color="666666"/>
+              <w:left w:val="none" w:sz="0" w:space="0" w:color="000000"/>
+              <w:right w:val="none" w:sz="0" w:space="0" w:color="000000"/>
+            </w:tcBorders>
+            <w:shd w:val="clear" w:color="auto" w:fill="FFFFFF"/>
+            <w:tcMar>
+              <w:top w:w="0" w:type="dxa"/>
+              <w:bottom w:w="0" w:type="dxa"/>
+              <w:left w:w="0" w:type="dxa"/>
+              <w:right w:w="0" w:type="dxa"/>
+            </w:tcMar>
+            <w:vAlign w:val="center"/>
+          </w:tcPr>
           <w:p>
             <w:pPr>
-              <w:pStyle w:val="Compact"/>
               <w:jc w:val="left"/>
+              <w:pBdr>
+                <w:bottom w:val="none" w:sz="0" w:space="0" w:color="000000"/>
+                <w:top w:val="none" w:sz="0" w:space="0" w:color="000000"/>
+                <w:left w:val="none" w:sz="0" w:space="0" w:color="000000"/>
+                <w:right w:val="none" w:sz="0" w:space="0" w:color="000000"/>
+              </w:pBdr>
+              <w:spacing w:after="120" w:before="120" w:line="240"/>
+              <w:ind w:left="120" w:right="120" w:firstLine="0" w:firstLineChars="0"/>
+              <w:rPr>
+                <w:rFonts w:ascii="Helvetica" w:hAnsi="Helvetica" w:eastAsia="Helvetica" w:cs="Helvetica"/>
+                <w:i w:val="false"/>
+                <w:b w:val="true"/>
+                <w:u w:val="none"/>
+                <w:strike w:val="false"/>
+                <w:sz w:val="20"/>
+                <w:szCs w:val="20"/>
+                <w:color w:val="000000"/>
+              </w:rPr>
             </w:pPr>
-            <w:r>
+            <w:r xmlns:w="http://schemas.openxmlformats.org/wordprocessingml/2006/main" xmlns:wp="http://schemas.openxmlformats.org/drawingml/2006/wordprocessingDrawing" xmlns:r="http://schemas.openxmlformats.org/officeDocument/2006/relationships" xmlns:w14="http://schemas.microsoft.com/office/word/2010/wordml">
+              <w:rPr>
+                <w:rFonts w:ascii="Helvetica" w:hAnsi="Helvetica" w:eastAsia="Helvetica" w:cs="Helvetica"/>
+                <w:i w:val="false"/>
+                <w:b w:val="true"/>
+                <w:u w:val="none"/>
+                <w:strike w:val="false"/>
+                <w:sz w:val="20"/>
+                <w:szCs w:val="20"/>
+                <w:color w:val="000000"/>
+              </w:rPr>
               <w:t xml:space="preserve">AIC</w:t>
             </w:r>
           </w:p>
         </w:tc>
       </w:tr>
       <w:tr>
+        <w:trPr>
+          <w:trHeight w:val="360" w:hRule="auto"/>
+        </w:trPr>
         <w:tc>
-          <w:tcPr/>
+          <w:tcPr>
+            <w:tcBorders>
+              <w:bottom w:val="single" w:sz="6" w:space="0" w:color="666666"/>
+              <w:top w:val="single" w:sz="12" w:space="0" w:color="666666"/>
+              <w:left w:val="none" w:sz="0" w:space="0" w:color="000000"/>
+              <w:right w:val="none" w:sz="0" w:space="0" w:color="000000"/>
+            </w:tcBorders>
+            <w:shd w:val="clear" w:color="auto" w:fill="FFFFFF"/>
+            <w:tcMar>
+              <w:top w:w="0" w:type="dxa"/>
+              <w:bottom w:w="0" w:type="dxa"/>
+              <w:left w:w="0" w:type="dxa"/>
+              <w:right w:w="0" w:type="dxa"/>
+            </w:tcMar>
+            <w:vAlign w:val="center"/>
+          </w:tcPr>
           <w:p>
             <w:pPr>
-              <w:pStyle w:val="Compact"/>
               <w:jc w:val="left"/>
+              <w:pBdr>
+                <w:bottom w:val="none" w:sz="0" w:space="0" w:color="000000"/>
+                <w:top w:val="none" w:sz="0" w:space="0" w:color="000000"/>
+                <w:left w:val="none" w:sz="0" w:space="0" w:color="000000"/>
+                <w:right w:val="none" w:sz="0" w:space="0" w:color="000000"/>
+              </w:pBdr>
+              <w:spacing w:after="120" w:before="120" w:line="240"/>
+              <w:ind w:left="120" w:right="120" w:firstLine="0" w:firstLineChars="0"/>
+              <w:rPr>
+                <w:rFonts w:ascii="Helvetica" w:hAnsi="Helvetica" w:eastAsia="Helvetica" w:cs="Helvetica"/>
+                <w:i w:val="false"/>
+                <w:b w:val="false"/>
+                <w:u w:val="none"/>
+                <w:strike w:val="false"/>
+                <w:sz w:val="20"/>
+                <w:szCs w:val="20"/>
+                <w:color w:val="000000"/>
+              </w:rPr>
             </w:pPr>
-            <w:r>
+            <w:r xmlns:w="http://schemas.openxmlformats.org/wordprocessingml/2006/main" xmlns:wp="http://schemas.openxmlformats.org/drawingml/2006/wordprocessingDrawing" xmlns:r="http://schemas.openxmlformats.org/officeDocument/2006/relationships" xmlns:w14="http://schemas.microsoft.com/office/word/2010/wordml">
+              <w:rPr>
+                <w:rFonts w:ascii="Helvetica" w:hAnsi="Helvetica" w:eastAsia="Helvetica" w:cs="Helvetica"/>
+                <w:i w:val="false"/>
+                <w:b w:val="false"/>
+                <w:u w:val="none"/>
+                <w:strike w:val="false"/>
+                <w:sz w:val="20"/>
+                <w:szCs w:val="20"/>
+                <w:color w:val="000000"/>
+              </w:rPr>
               <w:t xml:space="preserve">Exponential</w:t>
             </w:r>
           </w:p>
         </w:tc>
         <w:tc>
-          <w:tcPr/>
+          <w:tcPr>
+            <w:tcBorders>
+              <w:bottom w:val="single" w:sz="6" w:space="0" w:color="666666"/>
+              <w:top w:val="single" w:sz="12" w:space="0" w:color="666666"/>
+              <w:left w:val="none" w:sz="0" w:space="0" w:color="000000"/>
+              <w:right w:val="none" w:sz="0" w:space="0" w:color="000000"/>
+            </w:tcBorders>
+            <w:shd w:val="clear" w:color="auto" w:fill="FFFFFF"/>
+            <w:tcMar>
+              <w:top w:w="0" w:type="dxa"/>
+              <w:bottom w:w="0" w:type="dxa"/>
+              <w:left w:w="0" w:type="dxa"/>
+              <w:right w:w="0" w:type="dxa"/>
+            </w:tcMar>
+            <w:vAlign w:val="center"/>
+          </w:tcPr>
           <w:p>
             <w:pPr>
-              <w:pStyle w:val="Compact"/>
               <w:jc w:val="left"/>
+              <w:pBdr>
+                <w:bottom w:val="none" w:sz="0" w:space="0" w:color="000000"/>
+                <w:top w:val="none" w:sz="0" w:space="0" w:color="000000"/>
+                <w:left w:val="none" w:sz="0" w:space="0" w:color="000000"/>
+                <w:right w:val="none" w:sz="0" w:space="0" w:color="000000"/>
+              </w:pBdr>
+              <w:spacing w:after="120" w:before="120" w:line="240"/>
+              <w:ind w:left="120" w:right="120" w:firstLine="0" w:firstLineChars="0"/>
+              <w:rPr>
+                <w:rFonts w:ascii="Helvetica" w:hAnsi="Helvetica" w:eastAsia="Helvetica" w:cs="Helvetica"/>
+                <w:i w:val="false"/>
+                <w:b w:val="false"/>
+                <w:u w:val="none"/>
+                <w:strike w:val="false"/>
+                <w:sz w:val="20"/>
+                <w:szCs w:val="20"/>
+                <w:color w:val="000000"/>
+              </w:rPr>
             </w:pPr>
-            <w:r>
+            <w:r xmlns:w="http://schemas.openxmlformats.org/wordprocessingml/2006/main" xmlns:wp="http://schemas.openxmlformats.org/drawingml/2006/wordprocessingDrawing" xmlns:r="http://schemas.openxmlformats.org/officeDocument/2006/relationships" xmlns:w14="http://schemas.microsoft.com/office/word/2010/wordml">
+              <w:rPr>
+                <w:rFonts w:ascii="Helvetica" w:hAnsi="Helvetica" w:eastAsia="Helvetica" w:cs="Helvetica"/>
+                <w:i w:val="false"/>
+                <w:b w:val="false"/>
+                <w:u w:val="none"/>
+                <w:strike w:val="false"/>
+                <w:sz w:val="20"/>
+                <w:szCs w:val="20"/>
+                <w:color w:val="000000"/>
+              </w:rPr>
               <w:t xml:space="preserve">1603.12</w:t>
             </w:r>
           </w:p>
         </w:tc>
       </w:tr>
       <w:tr>
+        <w:trPr>
+          <w:trHeight w:val="360" w:hRule="auto"/>
+        </w:trPr>
         <w:tc>
-          <w:tcPr/>
+          <w:tcPr>
+            <w:tcBorders>
+              <w:bottom w:val="single" w:sz="6" w:space="0" w:color="666666"/>
+              <w:top w:val="single" w:sz="6" w:space="0" w:color="666666"/>
+              <w:left w:val="none" w:sz="0" w:space="0" w:color="000000"/>
+              <w:right w:val="none" w:sz="0" w:space="0" w:color="000000"/>
+            </w:tcBorders>
+            <w:shd w:val="clear" w:color="auto" w:fill="FFFFFF"/>
+            <w:tcMar>
+              <w:top w:w="0" w:type="dxa"/>
+              <w:bottom w:w="0" w:type="dxa"/>
+              <w:left w:w="0" w:type="dxa"/>
+              <w:right w:w="0" w:type="dxa"/>
+            </w:tcMar>
+            <w:vAlign w:val="center"/>
+          </w:tcPr>
           <w:p>
             <w:pPr>
-              <w:pStyle w:val="Compact"/>
               <w:jc w:val="left"/>
+              <w:pBdr>
+                <w:bottom w:val="none" w:sz="0" w:space="0" w:color="000000"/>
+                <w:top w:val="none" w:sz="0" w:space="0" w:color="000000"/>
+                <w:left w:val="none" w:sz="0" w:space="0" w:color="000000"/>
+                <w:right w:val="none" w:sz="0" w:space="0" w:color="000000"/>
+              </w:pBdr>
+              <w:spacing w:after="120" w:before="120" w:line="240"/>
+              <w:ind w:left="120" w:right="120" w:firstLine="0" w:firstLineChars="0"/>
+              <w:rPr>
+                <w:rFonts w:ascii="Helvetica" w:hAnsi="Helvetica" w:eastAsia="Helvetica" w:cs="Helvetica"/>
+                <w:i w:val="false"/>
+                <w:b w:val="false"/>
+                <w:u w:val="none"/>
+                <w:strike w:val="false"/>
+                <w:sz w:val="20"/>
+                <w:szCs w:val="20"/>
+                <w:color w:val="000000"/>
+              </w:rPr>
             </w:pPr>
-            <w:r>
+            <w:r xmlns:w="http://schemas.openxmlformats.org/wordprocessingml/2006/main" xmlns:wp="http://schemas.openxmlformats.org/drawingml/2006/wordprocessingDrawing" xmlns:r="http://schemas.openxmlformats.org/officeDocument/2006/relationships" xmlns:w14="http://schemas.microsoft.com/office/word/2010/wordml">
+              <w:rPr>
+                <w:rFonts w:ascii="Helvetica" w:hAnsi="Helvetica" w:eastAsia="Helvetica" w:cs="Helvetica"/>
+                <w:i w:val="false"/>
+                <w:b w:val="false"/>
+                <w:u w:val="none"/>
+                <w:strike w:val="false"/>
+                <w:sz w:val="20"/>
+                <w:szCs w:val="20"/>
+                <w:color w:val="000000"/>
+              </w:rPr>
               <w:t xml:space="preserve">Weibull (AFT)</w:t>
             </w:r>
           </w:p>
         </w:tc>
         <w:tc>
-          <w:tcPr/>
+          <w:tcPr>
+            <w:tcBorders>
+              <w:bottom w:val="single" w:sz="6" w:space="0" w:color="666666"/>
+              <w:top w:val="single" w:sz="6" w:space="0" w:color="666666"/>
+              <w:left w:val="none" w:sz="0" w:space="0" w:color="000000"/>
+              <w:right w:val="none" w:sz="0" w:space="0" w:color="000000"/>
+            </w:tcBorders>
+            <w:shd w:val="clear" w:color="auto" w:fill="FFFFFF"/>
+            <w:tcMar>
+              <w:top w:w="0" w:type="dxa"/>
+              <w:bottom w:w="0" w:type="dxa"/>
+              <w:left w:w="0" w:type="dxa"/>
+              <w:right w:w="0" w:type="dxa"/>
+            </w:tcMar>
+            <w:vAlign w:val="center"/>
+          </w:tcPr>
           <w:p>
             <w:pPr>
-              <w:pStyle w:val="Compact"/>
               <w:jc w:val="left"/>
+              <w:pBdr>
+                <w:bottom w:val="none" w:sz="0" w:space="0" w:color="000000"/>
+                <w:top w:val="none" w:sz="0" w:space="0" w:color="000000"/>
+                <w:left w:val="none" w:sz="0" w:space="0" w:color="000000"/>
+                <w:right w:val="none" w:sz="0" w:space="0" w:color="000000"/>
+              </w:pBdr>
+              <w:spacing w:after="120" w:before="120" w:line="240"/>
+              <w:ind w:left="120" w:right="120" w:firstLine="0" w:firstLineChars="0"/>
+              <w:rPr>
+                <w:rFonts w:ascii="Helvetica" w:hAnsi="Helvetica" w:eastAsia="Helvetica" w:cs="Helvetica"/>
+                <w:i w:val="false"/>
+                <w:b w:val="false"/>
+                <w:u w:val="none"/>
+                <w:strike w:val="false"/>
+                <w:sz w:val="20"/>
+                <w:szCs w:val="20"/>
+                <w:color w:val="000000"/>
+              </w:rPr>
             </w:pPr>
-            <w:r>
+            <w:r xmlns:w="http://schemas.openxmlformats.org/wordprocessingml/2006/main" xmlns:wp="http://schemas.openxmlformats.org/drawingml/2006/wordprocessingDrawing" xmlns:r="http://schemas.openxmlformats.org/officeDocument/2006/relationships" xmlns:w14="http://schemas.microsoft.com/office/word/2010/wordml">
+              <w:rPr>
+                <w:rFonts w:ascii="Helvetica" w:hAnsi="Helvetica" w:eastAsia="Helvetica" w:cs="Helvetica"/>
+                <w:i w:val="false"/>
+                <w:b w:val="false"/>
+                <w:u w:val="none"/>
+                <w:strike w:val="false"/>
+                <w:sz w:val="20"/>
+                <w:szCs w:val="20"/>
+                <w:color w:val="000000"/>
+              </w:rPr>
               <w:t xml:space="preserve">1594.4</w:t>
             </w:r>
           </w:p>
         </w:tc>
       </w:tr>
       <w:tr>
+        <w:trPr>
+          <w:trHeight w:val="360" w:hRule="auto"/>
+        </w:trPr>
         <w:tc>
-          <w:tcPr/>
+          <w:tcPr>
+            <w:tcBorders>
+              <w:bottom w:val="single" w:sz="6" w:space="0" w:color="666666"/>
+              <w:top w:val="single" w:sz="6" w:space="0" w:color="666666"/>
+              <w:left w:val="none" w:sz="0" w:space="0" w:color="000000"/>
+              <w:right w:val="none" w:sz="0" w:space="0" w:color="000000"/>
+            </w:tcBorders>
+            <w:shd w:val="clear" w:color="auto" w:fill="FFFFFF"/>
+            <w:tcMar>
+              <w:top w:w="0" w:type="dxa"/>
+              <w:bottom w:w="0" w:type="dxa"/>
+              <w:left w:w="0" w:type="dxa"/>
+              <w:right w:w="0" w:type="dxa"/>
+            </w:tcMar>
+            <w:vAlign w:val="center"/>
+          </w:tcPr>
           <w:p>
             <w:pPr>
-              <w:pStyle w:val="Compact"/>
               <w:jc w:val="left"/>
+              <w:pBdr>
+                <w:bottom w:val="none" w:sz="0" w:space="0" w:color="000000"/>
+                <w:top w:val="none" w:sz="0" w:space="0" w:color="000000"/>
+                <w:left w:val="none" w:sz="0" w:space="0" w:color="000000"/>
+                <w:right w:val="none" w:sz="0" w:space="0" w:color="000000"/>
+              </w:pBdr>
+              <w:spacing w:after="120" w:before="120" w:line="240"/>
+              <w:ind w:left="120" w:right="120" w:firstLine="0" w:firstLineChars="0"/>
+              <w:rPr>
+                <w:rFonts w:ascii="Helvetica" w:hAnsi="Helvetica" w:eastAsia="Helvetica" w:cs="Helvetica"/>
+                <w:i w:val="false"/>
+                <w:b w:val="false"/>
+                <w:u w:val="none"/>
+                <w:strike w:val="false"/>
+                <w:sz w:val="20"/>
+                <w:szCs w:val="20"/>
+                <w:color w:val="000000"/>
+              </w:rPr>
             </w:pPr>
-            <w:r>
+            <w:r xmlns:w="http://schemas.openxmlformats.org/wordprocessingml/2006/main" xmlns:wp="http://schemas.openxmlformats.org/drawingml/2006/wordprocessingDrawing" xmlns:r="http://schemas.openxmlformats.org/officeDocument/2006/relationships" xmlns:w14="http://schemas.microsoft.com/office/word/2010/wordml">
+              <w:rPr>
+                <w:rFonts w:ascii="Helvetica" w:hAnsi="Helvetica" w:eastAsia="Helvetica" w:cs="Helvetica"/>
+                <w:i w:val="false"/>
+                <w:b w:val="false"/>
+                <w:u w:val="none"/>
+                <w:strike w:val="false"/>
+                <w:sz w:val="20"/>
+                <w:szCs w:val="20"/>
+                <w:color w:val="000000"/>
+              </w:rPr>
               <w:t xml:space="preserve">Gamma</w:t>
             </w:r>
           </w:p>
         </w:tc>
         <w:tc>
-          <w:tcPr/>
+          <w:tcPr>
+            <w:tcBorders>
+              <w:bottom w:val="single" w:sz="6" w:space="0" w:color="666666"/>
+              <w:top w:val="single" w:sz="6" w:space="0" w:color="666666"/>
+              <w:left w:val="none" w:sz="0" w:space="0" w:color="000000"/>
+              <w:right w:val="none" w:sz="0" w:space="0" w:color="000000"/>
+            </w:tcBorders>
+            <w:shd w:val="clear" w:color="auto" w:fill="FFFFFF"/>
+            <w:tcMar>
+              <w:top w:w="0" w:type="dxa"/>
+              <w:bottom w:w="0" w:type="dxa"/>
+              <w:left w:w="0" w:type="dxa"/>
+              <w:right w:w="0" w:type="dxa"/>
+            </w:tcMar>
+            <w:vAlign w:val="center"/>
+          </w:tcPr>
           <w:p>
             <w:pPr>
-              <w:pStyle w:val="Compact"/>
               <w:jc w:val="left"/>
+              <w:pBdr>
+                <w:bottom w:val="none" w:sz="0" w:space="0" w:color="000000"/>
+                <w:top w:val="none" w:sz="0" w:space="0" w:color="000000"/>
+                <w:left w:val="none" w:sz="0" w:space="0" w:color="000000"/>
+                <w:right w:val="none" w:sz="0" w:space="0" w:color="000000"/>
+              </w:pBdr>
+              <w:spacing w:after="120" w:before="120" w:line="240"/>
+              <w:ind w:left="120" w:right="120" w:firstLine="0" w:firstLineChars="0"/>
+              <w:rPr>
+                <w:rFonts w:ascii="Helvetica" w:hAnsi="Helvetica" w:eastAsia="Helvetica" w:cs="Helvetica"/>
+                <w:i w:val="false"/>
+                <w:b w:val="false"/>
+                <w:u w:val="none"/>
+                <w:strike w:val="false"/>
+                <w:sz w:val="20"/>
+                <w:szCs w:val="20"/>
+                <w:color w:val="000000"/>
+              </w:rPr>
             </w:pPr>
-            <w:r>
+            <w:r xmlns:w="http://schemas.openxmlformats.org/wordprocessingml/2006/main" xmlns:wp="http://schemas.openxmlformats.org/drawingml/2006/wordprocessingDrawing" xmlns:r="http://schemas.openxmlformats.org/officeDocument/2006/relationships" xmlns:w14="http://schemas.microsoft.com/office/word/2010/wordml">
+              <w:rPr>
+                <w:rFonts w:ascii="Helvetica" w:hAnsi="Helvetica" w:eastAsia="Helvetica" w:cs="Helvetica"/>
+                <w:i w:val="false"/>
+                <w:b w:val="false"/>
+                <w:u w:val="none"/>
+                <w:strike w:val="false"/>
+                <w:sz w:val="20"/>
+                <w:szCs w:val="20"/>
+                <w:color w:val="000000"/>
+              </w:rPr>
               <w:t xml:space="preserve">1594.48</w:t>
             </w:r>
           </w:p>
         </w:tc>
       </w:tr>
       <w:tr>
+        <w:trPr>
+          <w:trHeight w:val="360" w:hRule="auto"/>
+        </w:trPr>
         <w:tc>
-          <w:tcPr/>
+          <w:tcPr>
+            <w:tcBorders>
+              <w:bottom w:val="single" w:sz="6" w:space="0" w:color="666666"/>
+              <w:top w:val="single" w:sz="6" w:space="0" w:color="666666"/>
+              <w:left w:val="none" w:sz="0" w:space="0" w:color="000000"/>
+              <w:right w:val="none" w:sz="0" w:space="0" w:color="000000"/>
+            </w:tcBorders>
+            <w:shd w:val="clear" w:color="auto" w:fill="FFFFFF"/>
+            <w:tcMar>
+              <w:top w:w="0" w:type="dxa"/>
+              <w:bottom w:w="0" w:type="dxa"/>
+              <w:left w:w="0" w:type="dxa"/>
+              <w:right w:w="0" w:type="dxa"/>
+            </w:tcMar>
+            <w:vAlign w:val="center"/>
+          </w:tcPr>
           <w:p>
             <w:pPr>
-              <w:pStyle w:val="Compact"/>
               <w:jc w:val="left"/>
+              <w:pBdr>
+                <w:bottom w:val="none" w:sz="0" w:space="0" w:color="000000"/>
+                <w:top w:val="none" w:sz="0" w:space="0" w:color="000000"/>
+                <w:left w:val="none" w:sz="0" w:space="0" w:color="000000"/>
+                <w:right w:val="none" w:sz="0" w:space="0" w:color="000000"/>
+              </w:pBdr>
+              <w:spacing w:after="120" w:before="120" w:line="240"/>
+              <w:ind w:left="120" w:right="120" w:firstLine="0" w:firstLineChars="0"/>
+              <w:rPr>
+                <w:rFonts w:ascii="Helvetica" w:hAnsi="Helvetica" w:eastAsia="Helvetica" w:cs="Helvetica"/>
+                <w:i w:val="false"/>
+                <w:b w:val="false"/>
+                <w:u w:val="none"/>
+                <w:strike w:val="false"/>
+                <w:sz w:val="20"/>
+                <w:szCs w:val="20"/>
+                <w:color w:val="000000"/>
+              </w:rPr>
             </w:pPr>
-            <w:r>
+            <w:r xmlns:w="http://schemas.openxmlformats.org/wordprocessingml/2006/main" xmlns:wp="http://schemas.openxmlformats.org/drawingml/2006/wordprocessingDrawing" xmlns:r="http://schemas.openxmlformats.org/officeDocument/2006/relationships" xmlns:w14="http://schemas.microsoft.com/office/word/2010/wordml">
+              <w:rPr>
+                <w:rFonts w:ascii="Helvetica" w:hAnsi="Helvetica" w:eastAsia="Helvetica" w:cs="Helvetica"/>
+                <w:i w:val="false"/>
+                <w:b w:val="false"/>
+                <w:u w:val="none"/>
+                <w:strike w:val="false"/>
+                <w:sz w:val="20"/>
+                <w:szCs w:val="20"/>
+                <w:color w:val="000000"/>
+              </w:rPr>
               <w:t xml:space="preserve">Lognormal</w:t>
             </w:r>
           </w:p>
         </w:tc>
         <w:tc>
-          <w:tcPr/>
+          <w:tcPr>
+            <w:tcBorders>
+              <w:bottom w:val="single" w:sz="6" w:space="0" w:color="666666"/>
+              <w:top w:val="single" w:sz="6" w:space="0" w:color="666666"/>
+              <w:left w:val="none" w:sz="0" w:space="0" w:color="000000"/>
+              <w:right w:val="none" w:sz="0" w:space="0" w:color="000000"/>
+            </w:tcBorders>
+            <w:shd w:val="clear" w:color="auto" w:fill="FFFFFF"/>
+            <w:tcMar>
+              <w:top w:w="0" w:type="dxa"/>
+              <w:bottom w:w="0" w:type="dxa"/>
+              <w:left w:w="0" w:type="dxa"/>
+              <w:right w:w="0" w:type="dxa"/>
+            </w:tcMar>
+            <w:vAlign w:val="center"/>
+          </w:tcPr>
           <w:p>
             <w:pPr>
-              <w:pStyle w:val="Compact"/>
               <w:jc w:val="left"/>
+              <w:pBdr>
+                <w:bottom w:val="none" w:sz="0" w:space="0" w:color="000000"/>
+                <w:top w:val="none" w:sz="0" w:space="0" w:color="000000"/>
+                <w:left w:val="none" w:sz="0" w:space="0" w:color="000000"/>
+                <w:right w:val="none" w:sz="0" w:space="0" w:color="000000"/>
+              </w:pBdr>
+              <w:spacing w:after="120" w:before="120" w:line="240"/>
+              <w:ind w:left="120" w:right="120" w:firstLine="0" w:firstLineChars="0"/>
+              <w:rPr>
+                <w:rFonts w:ascii="Helvetica" w:hAnsi="Helvetica" w:eastAsia="Helvetica" w:cs="Helvetica"/>
+                <w:i w:val="false"/>
+                <w:b w:val="false"/>
+                <w:u w:val="none"/>
+                <w:strike w:val="false"/>
+                <w:sz w:val="20"/>
+                <w:szCs w:val="20"/>
+                <w:color w:val="000000"/>
+              </w:rPr>
             </w:pPr>
-            <w:r>
+            <w:r xmlns:w="http://schemas.openxmlformats.org/wordprocessingml/2006/main" xmlns:wp="http://schemas.openxmlformats.org/drawingml/2006/wordprocessingDrawing" xmlns:r="http://schemas.openxmlformats.org/officeDocument/2006/relationships" xmlns:w14="http://schemas.microsoft.com/office/word/2010/wordml">
+              <w:rPr>
+                <w:rFonts w:ascii="Helvetica" w:hAnsi="Helvetica" w:eastAsia="Helvetica" w:cs="Helvetica"/>
+                <w:i w:val="false"/>
+                <w:b w:val="false"/>
+                <w:u w:val="none"/>
+                <w:strike w:val="false"/>
+                <w:sz w:val="20"/>
+                <w:szCs w:val="20"/>
+                <w:color w:val="000000"/>
+              </w:rPr>
               <w:t xml:space="preserve">1594.71</w:t>
             </w:r>
           </w:p>
         </w:tc>
       </w:tr>
       <w:tr>
+        <w:trPr>
+          <w:trHeight w:val="360" w:hRule="auto"/>
+        </w:trPr>
         <w:tc>
-          <w:tcPr/>
+          <w:tcPr>
+            <w:tcBorders>
+              <w:bottom w:val="single" w:sz="6" w:space="0" w:color="666666"/>
+              <w:top w:val="single" w:sz="6" w:space="0" w:color="666666"/>
+              <w:left w:val="none" w:sz="0" w:space="0" w:color="000000"/>
+              <w:right w:val="none" w:sz="0" w:space="0" w:color="000000"/>
+            </w:tcBorders>
+            <w:shd w:val="clear" w:color="auto" w:fill="FFFFFF"/>
+            <w:tcMar>
+              <w:top w:w="0" w:type="dxa"/>
+              <w:bottom w:w="0" w:type="dxa"/>
+              <w:left w:w="0" w:type="dxa"/>
+              <w:right w:w="0" w:type="dxa"/>
+            </w:tcMar>
+            <w:vAlign w:val="center"/>
+          </w:tcPr>
           <w:p>
             <w:pPr>
-              <w:pStyle w:val="Compact"/>
               <w:jc w:val="left"/>
+              <w:pBdr>
+                <w:bottom w:val="none" w:sz="0" w:space="0" w:color="000000"/>
+                <w:top w:val="none" w:sz="0" w:space="0" w:color="000000"/>
+                <w:left w:val="none" w:sz="0" w:space="0" w:color="000000"/>
+                <w:right w:val="none" w:sz="0" w:space="0" w:color="000000"/>
+              </w:pBdr>
+              <w:spacing w:after="120" w:before="120" w:line="240"/>
+              <w:ind w:left="120" w:right="120" w:firstLine="0" w:firstLineChars="0"/>
+              <w:rPr>
+                <w:rFonts w:ascii="Helvetica" w:hAnsi="Helvetica" w:eastAsia="Helvetica" w:cs="Helvetica"/>
+                <w:i w:val="false"/>
+                <w:b w:val="false"/>
+                <w:u w:val="none"/>
+                <w:strike w:val="false"/>
+                <w:sz w:val="20"/>
+                <w:szCs w:val="20"/>
+                <w:color w:val="000000"/>
+              </w:rPr>
             </w:pPr>
-            <w:r>
+            <w:r xmlns:w="http://schemas.openxmlformats.org/wordprocessingml/2006/main" xmlns:wp="http://schemas.openxmlformats.org/drawingml/2006/wordprocessingDrawing" xmlns:r="http://schemas.openxmlformats.org/officeDocument/2006/relationships" xmlns:w14="http://schemas.microsoft.com/office/word/2010/wordml">
+              <w:rPr>
+                <w:rFonts w:ascii="Helvetica" w:hAnsi="Helvetica" w:eastAsia="Helvetica" w:cs="Helvetica"/>
+                <w:i w:val="false"/>
+                <w:b w:val="false"/>
+                <w:u w:val="none"/>
+                <w:strike w:val="false"/>
+                <w:sz w:val="20"/>
+                <w:szCs w:val="20"/>
+                <w:color w:val="000000"/>
+              </w:rPr>
               <w:t xml:space="preserve">Log-logistic</w:t>
             </w:r>
           </w:p>
         </w:tc>
         <w:tc>
-          <w:tcPr/>
+          <w:tcPr>
+            <w:tcBorders>
+              <w:bottom w:val="single" w:sz="6" w:space="0" w:color="666666"/>
+              <w:top w:val="single" w:sz="6" w:space="0" w:color="666666"/>
+              <w:left w:val="none" w:sz="0" w:space="0" w:color="000000"/>
+              <w:right w:val="none" w:sz="0" w:space="0" w:color="000000"/>
+            </w:tcBorders>
+            <w:shd w:val="clear" w:color="auto" w:fill="FFFFFF"/>
+            <w:tcMar>
+              <w:top w:w="0" w:type="dxa"/>
+              <w:bottom w:w="0" w:type="dxa"/>
+              <w:left w:w="0" w:type="dxa"/>
+              <w:right w:w="0" w:type="dxa"/>
+            </w:tcMar>
+            <w:vAlign w:val="center"/>
+          </w:tcPr>
           <w:p>
             <w:pPr>
-              <w:pStyle w:val="Compact"/>
               <w:jc w:val="left"/>
+              <w:pBdr>
+                <w:bottom w:val="none" w:sz="0" w:space="0" w:color="000000"/>
+                <w:top w:val="none" w:sz="0" w:space="0" w:color="000000"/>
+                <w:left w:val="none" w:sz="0" w:space="0" w:color="000000"/>
+                <w:right w:val="none" w:sz="0" w:space="0" w:color="000000"/>
+              </w:pBdr>
+              <w:spacing w:after="120" w:before="120" w:line="240"/>
+              <w:ind w:left="120" w:right="120" w:firstLine="0" w:firstLineChars="0"/>
+              <w:rPr>
+                <w:rFonts w:ascii="Helvetica" w:hAnsi="Helvetica" w:eastAsia="Helvetica" w:cs="Helvetica"/>
+                <w:i w:val="false"/>
+                <w:b w:val="false"/>
+                <w:u w:val="none"/>
+                <w:strike w:val="false"/>
+                <w:sz w:val="20"/>
+                <w:szCs w:val="20"/>
+                <w:color w:val="000000"/>
+              </w:rPr>
             </w:pPr>
-            <w:r>
+            <w:r xmlns:w="http://schemas.openxmlformats.org/wordprocessingml/2006/main" xmlns:wp="http://schemas.openxmlformats.org/drawingml/2006/wordprocessingDrawing" xmlns:r="http://schemas.openxmlformats.org/officeDocument/2006/relationships" xmlns:w14="http://schemas.microsoft.com/office/word/2010/wordml">
+              <w:rPr>
+                <w:rFonts w:ascii="Helvetica" w:hAnsi="Helvetica" w:eastAsia="Helvetica" w:cs="Helvetica"/>
+                <w:i w:val="false"/>
+                <w:b w:val="false"/>
+                <w:u w:val="none"/>
+                <w:strike w:val="false"/>
+                <w:sz w:val="20"/>
+                <w:szCs w:val="20"/>
+                <w:color w:val="000000"/>
+              </w:rPr>
               <w:t xml:space="preserve">1594.53</w:t>
             </w:r>
           </w:p>
         </w:tc>
       </w:tr>
       <w:tr>
+        <w:trPr>
+          <w:trHeight w:val="360" w:hRule="auto"/>
+        </w:trPr>
         <w:tc>
-          <w:tcPr/>
+          <w:tcPr>
+            <w:tcBorders>
+              <w:bottom w:val="single" w:sz="6" w:space="0" w:color="666666"/>
+              <w:top w:val="single" w:sz="6" w:space="0" w:color="666666"/>
+              <w:left w:val="none" w:sz="0" w:space="0" w:color="000000"/>
+              <w:right w:val="none" w:sz="0" w:space="0" w:color="000000"/>
+            </w:tcBorders>
+            <w:shd w:val="clear" w:color="auto" w:fill="FFFFFF"/>
+            <w:tcMar>
+              <w:top w:w="0" w:type="dxa"/>
+              <w:bottom w:w="0" w:type="dxa"/>
+              <w:left w:w="0" w:type="dxa"/>
+              <w:right w:w="0" w:type="dxa"/>
+            </w:tcMar>
+            <w:vAlign w:val="center"/>
+          </w:tcPr>
           <w:p>
             <w:pPr>
-              <w:pStyle w:val="Compact"/>
               <w:jc w:val="left"/>
+              <w:pBdr>
+                <w:bottom w:val="none" w:sz="0" w:space="0" w:color="000000"/>
+                <w:top w:val="none" w:sz="0" w:space="0" w:color="000000"/>
+                <w:left w:val="none" w:sz="0" w:space="0" w:color="000000"/>
+                <w:right w:val="none" w:sz="0" w:space="0" w:color="000000"/>
+              </w:pBdr>
+              <w:spacing w:after="120" w:before="120" w:line="240"/>
+              <w:ind w:left="120" w:right="120" w:firstLine="0" w:firstLineChars="0"/>
+              <w:rPr>
+                <w:rFonts w:ascii="Helvetica" w:hAnsi="Helvetica" w:eastAsia="Helvetica" w:cs="Helvetica"/>
+                <w:i w:val="false"/>
+                <w:b w:val="false"/>
+                <w:u w:val="none"/>
+                <w:strike w:val="false"/>
+                <w:sz w:val="20"/>
+                <w:szCs w:val="20"/>
+                <w:color w:val="000000"/>
+              </w:rPr>
             </w:pPr>
-            <w:r>
+            <w:r xmlns:w="http://schemas.openxmlformats.org/wordprocessingml/2006/main" xmlns:wp="http://schemas.openxmlformats.org/drawingml/2006/wordprocessingDrawing" xmlns:r="http://schemas.openxmlformats.org/officeDocument/2006/relationships" xmlns:w14="http://schemas.microsoft.com/office/word/2010/wordml">
+              <w:rPr>
+                <w:rFonts w:ascii="Helvetica" w:hAnsi="Helvetica" w:eastAsia="Helvetica" w:cs="Helvetica"/>
+                <w:i w:val="false"/>
+                <w:b w:val="false"/>
+                <w:u w:val="none"/>
+                <w:strike w:val="false"/>
+                <w:sz w:val="20"/>
+                <w:szCs w:val="20"/>
+                <w:color w:val="000000"/>
+              </w:rPr>
               <w:t xml:space="preserve">Generalized gamma</w:t>
             </w:r>
           </w:p>
         </w:tc>
         <w:tc>
-          <w:tcPr/>
+          <w:tcPr>
+            <w:tcBorders>
+              <w:bottom w:val="single" w:sz="6" w:space="0" w:color="666666"/>
+              <w:top w:val="single" w:sz="6" w:space="0" w:color="666666"/>
+              <w:left w:val="none" w:sz="0" w:space="0" w:color="000000"/>
+              <w:right w:val="none" w:sz="0" w:space="0" w:color="000000"/>
+            </w:tcBorders>
+            <w:shd w:val="clear" w:color="auto" w:fill="FFFFFF"/>
+            <w:tcMar>
+              <w:top w:w="0" w:type="dxa"/>
+              <w:bottom w:w="0" w:type="dxa"/>
+              <w:left w:w="0" w:type="dxa"/>
+              <w:right w:w="0" w:type="dxa"/>
+            </w:tcMar>
+            <w:vAlign w:val="center"/>
+          </w:tcPr>
           <w:p>
             <w:pPr>
-              <w:pStyle w:val="Compact"/>
               <w:jc w:val="left"/>
+              <w:pBdr>
+                <w:bottom w:val="none" w:sz="0" w:space="0" w:color="000000"/>
+                <w:top w:val="none" w:sz="0" w:space="0" w:color="000000"/>
+                <w:left w:val="none" w:sz="0" w:space="0" w:color="000000"/>
+                <w:right w:val="none" w:sz="0" w:space="0" w:color="000000"/>
+              </w:pBdr>
+              <w:spacing w:after="120" w:before="120" w:line="240"/>
+              <w:ind w:left="120" w:right="120" w:firstLine="0" w:firstLineChars="0"/>
+              <w:rPr>
+                <w:rFonts w:ascii="Helvetica" w:hAnsi="Helvetica" w:eastAsia="Helvetica" w:cs="Helvetica"/>
+                <w:i w:val="false"/>
+                <w:b w:val="false"/>
+                <w:u w:val="none"/>
+                <w:strike w:val="false"/>
+                <w:sz w:val="20"/>
+                <w:szCs w:val="20"/>
+                <w:color w:val="000000"/>
+              </w:rPr>
             </w:pPr>
-            <w:r>
+            <w:r xmlns:w="http://schemas.openxmlformats.org/wordprocessingml/2006/main" xmlns:wp="http://schemas.openxmlformats.org/drawingml/2006/wordprocessingDrawing" xmlns:r="http://schemas.openxmlformats.org/officeDocument/2006/relationships" xmlns:w14="http://schemas.microsoft.com/office/word/2010/wordml">
+              <w:rPr>
+                <w:rFonts w:ascii="Helvetica" w:hAnsi="Helvetica" w:eastAsia="Helvetica" w:cs="Helvetica"/>
+                <w:i w:val="false"/>
+                <w:b w:val="false"/>
+                <w:u w:val="none"/>
+                <w:strike w:val="false"/>
+                <w:sz w:val="20"/>
+                <w:szCs w:val="20"/>
+                <w:color w:val="000000"/>
+              </w:rPr>
               <w:t xml:space="preserve">1596.1</w:t>
             </w:r>
           </w:p>
         </w:tc>
       </w:tr>
       <w:tr>
+        <w:trPr>
+          <w:trHeight w:val="360" w:hRule="auto"/>
+        </w:trPr>
         <w:tc>
-          <w:tcPr/>
+          <w:tcPr>
+            <w:tcBorders>
+              <w:bottom w:val="single" w:sz="12" w:space="0" w:color="666666"/>
+              <w:top w:val="single" w:sz="6" w:space="0" w:color="666666"/>
+              <w:left w:val="none" w:sz="0" w:space="0" w:color="000000"/>
+              <w:right w:val="none" w:sz="0" w:space="0" w:color="000000"/>
+            </w:tcBorders>
+            <w:shd w:val="clear" w:color="auto" w:fill="FFFFFF"/>
+            <w:tcMar>
+              <w:top w:w="0" w:type="dxa"/>
+              <w:bottom w:w="0" w:type="dxa"/>
+              <w:left w:w="0" w:type="dxa"/>
+              <w:right w:w="0" w:type="dxa"/>
+            </w:tcMar>
+            <w:vAlign w:val="center"/>
+          </w:tcPr>
           <w:p>
             <w:pPr>
-              <w:pStyle w:val="Compact"/>
               <w:jc w:val="left"/>
+              <w:pBdr>
+                <w:bottom w:val="none" w:sz="0" w:space="0" w:color="000000"/>
+                <w:top w:val="none" w:sz="0" w:space="0" w:color="000000"/>
+                <w:left w:val="none" w:sz="0" w:space="0" w:color="000000"/>
+                <w:right w:val="none" w:sz="0" w:space="0" w:color="000000"/>
+              </w:pBdr>
+              <w:spacing w:after="120" w:before="120" w:line="240"/>
+              <w:ind w:left="120" w:right="120" w:firstLine="0" w:firstLineChars="0"/>
+              <w:rPr>
+                <w:rFonts w:ascii="Helvetica" w:hAnsi="Helvetica" w:eastAsia="Helvetica" w:cs="Helvetica"/>
+                <w:i w:val="false"/>
+                <w:b w:val="false"/>
+                <w:u w:val="none"/>
+                <w:strike w:val="false"/>
+                <w:sz w:val="20"/>
+                <w:szCs w:val="20"/>
+                <w:color w:val="000000"/>
+              </w:rPr>
             </w:pPr>
-            <w:r>
+            <w:r xmlns:w="http://schemas.openxmlformats.org/wordprocessingml/2006/main" xmlns:wp="http://schemas.openxmlformats.org/drawingml/2006/wordprocessingDrawing" xmlns:r="http://schemas.openxmlformats.org/officeDocument/2006/relationships" xmlns:w14="http://schemas.microsoft.com/office/word/2010/wordml">
+              <w:rPr>
+                <w:rFonts w:ascii="Helvetica" w:hAnsi="Helvetica" w:eastAsia="Helvetica" w:cs="Helvetica"/>
+                <w:i w:val="false"/>
+                <w:b w:val="false"/>
+                <w:u w:val="none"/>
+                <w:strike w:val="false"/>
+                <w:sz w:val="20"/>
+                <w:szCs w:val="20"/>
+                <w:color w:val="000000"/>
+              </w:rPr>
               <w:t xml:space="preserve">Gompertz</w:t>
             </w:r>
           </w:p>
         </w:tc>
         <w:tc>
-          <w:tcPr/>
+          <w:tcPr>
+            <w:tcBorders>
+              <w:bottom w:val="single" w:sz="12" w:space="0" w:color="666666"/>
+              <w:top w:val="single" w:sz="6" w:space="0" w:color="666666"/>
+              <w:left w:val="none" w:sz="0" w:space="0" w:color="000000"/>
+              <w:right w:val="none" w:sz="0" w:space="0" w:color="000000"/>
+            </w:tcBorders>
+            <w:shd w:val="clear" w:color="auto" w:fill="FFFFFF"/>
+            <w:tcMar>
+              <w:top w:w="0" w:type="dxa"/>
+              <w:bottom w:w="0" w:type="dxa"/>
+              <w:left w:w="0" w:type="dxa"/>
+              <w:right w:w="0" w:type="dxa"/>
+            </w:tcMar>
+            <w:vAlign w:val="center"/>
+          </w:tcPr>
           <w:p>
             <w:pPr>
-              <w:pStyle w:val="Compact"/>
               <w:jc w:val="left"/>
+              <w:pBdr>
+                <w:bottom w:val="none" w:sz="0" w:space="0" w:color="000000"/>
+                <w:top w:val="none" w:sz="0" w:space="0" w:color="000000"/>
+                <w:left w:val="none" w:sz="0" w:space="0" w:color="000000"/>
+                <w:right w:val="none" w:sz="0" w:space="0" w:color="000000"/>
+              </w:pBdr>
+              <w:spacing w:after="120" w:before="120" w:line="240"/>
+              <w:ind w:left="120" w:right="120" w:firstLine="0" w:firstLineChars="0"/>
+              <w:rPr>
+                <w:rFonts w:ascii="Helvetica" w:hAnsi="Helvetica" w:eastAsia="Helvetica" w:cs="Helvetica"/>
+                <w:i w:val="false"/>
+                <w:b w:val="false"/>
+                <w:u w:val="none"/>
+                <w:strike w:val="false"/>
+                <w:sz w:val="20"/>
+                <w:szCs w:val="20"/>
+                <w:color w:val="000000"/>
+              </w:rPr>
             </w:pPr>
-            <w:r>
+            <w:r xmlns:w="http://schemas.openxmlformats.org/wordprocessingml/2006/main" xmlns:wp="http://schemas.openxmlformats.org/drawingml/2006/wordprocessingDrawing" xmlns:r="http://schemas.openxmlformats.org/officeDocument/2006/relationships" xmlns:w14="http://schemas.microsoft.com/office/word/2010/wordml">
+              <w:rPr>
+                <w:rFonts w:ascii="Helvetica" w:hAnsi="Helvetica" w:eastAsia="Helvetica" w:cs="Helvetica"/>
+                <w:i w:val="false"/>
+                <w:b w:val="false"/>
+                <w:u w:val="none"/>
+                <w:strike w:val="false"/>
+                <w:sz w:val="20"/>
+                <w:szCs w:val="20"/>
+                <w:color w:val="000000"/>
+              </w:rPr>
               <w:t xml:space="preserve">1599.13</w:t>
             </w:r>
           </w:p>
@@ -1960,325 +2654,1120 @@
         <w:t xml:space="preserve">Table of event rates for each stratum</w:t>
       </w:r>
     </w:p>
-    <w:tbl>
+    <w:tbl xmlns:w="http://schemas.openxmlformats.org/wordprocessingml/2006/main" xmlns:r="http://schemas.openxmlformats.org/officeDocument/2006/relationships" xmlns:w14="http://schemas.microsoft.com/office/word/2010/wordml" xmlns:wp="http://schemas.openxmlformats.org/drawingml/2006/wordprocessingDrawing" xmlns:a="http://schemas.openxmlformats.org/drawingml/2006/main" xmlns:pic="http://schemas.openxmlformats.org/drawingml/2006/picture">
       <w:tblPr>
-        <w:tblStyle w:val="Table"/>
-        <w:tblW w:type="pct" w:w="5000"/>
         <w:tblLayout w:type="fixed"/>
-        <w:tblLook w:firstRow="1" w:lastRow="0" w:firstColumn="0" w:lastColumn="0" w:noHBand="0" w:noVBand="0" w:val="0020"/>
+        <w:jc w:val="center"/>
+        <w:tblLook w:firstRow="1" w:lastRow="0" w:firstColumn="0" w:lastColumn="0" w:noHBand="0" w:noVBand="1"/>
       </w:tblPr>
       <w:tblGrid>
-        <w:gridCol w:w="1584"/>
-        <w:gridCol w:w="823"/>
-        <w:gridCol w:w="887"/>
-        <w:gridCol w:w="1267"/>
-        <w:gridCol w:w="3358"/>
+        <w:gridCol w:w="1487"/>
+        <w:gridCol w:w="1520"/>
+        <w:gridCol w:w="2120"/>
+        <w:gridCol w:w="3877"/>
       </w:tblGrid>
       <w:tr>
         <w:trPr>
-          <w:tblHeader w:val="on"/>
+          <w:trHeight w:val="360" w:hRule="auto"/>
+          <w:tblHeader/>
         </w:trPr>
         <w:tc>
-          <w:tcPr/>
+          <w:tcPr>
+            <w:tcBorders>
+              <w:bottom w:val="single" w:sz="12" w:space="0" w:color="666666"/>
+              <w:top w:val="single" w:sz="12" w:space="0" w:color="666666"/>
+              <w:left w:val="none" w:sz="0" w:space="0" w:color="000000"/>
+              <w:right w:val="none" w:sz="0" w:space="0" w:color="000000"/>
+            </w:tcBorders>
+            <w:shd w:val="clear" w:color="auto" w:fill="FFFFFF"/>
+            <w:tcMar>
+              <w:top w:w="0" w:type="dxa"/>
+              <w:bottom w:w="0" w:type="dxa"/>
+              <w:left w:w="0" w:type="dxa"/>
+              <w:right w:w="0" w:type="dxa"/>
+            </w:tcMar>
+            <w:vAlign w:val="center"/>
+          </w:tcPr>
           <w:p>
             <w:pPr>
-              <w:pStyle w:val="Compact"/>
+              <w:jc w:val="right"/>
+              <w:pBdr>
+                <w:bottom w:val="none" w:sz="0" w:space="0" w:color="000000"/>
+                <w:top w:val="none" w:sz="0" w:space="0" w:color="000000"/>
+                <w:left w:val="none" w:sz="0" w:space="0" w:color="000000"/>
+                <w:right w:val="none" w:sz="0" w:space="0" w:color="000000"/>
+              </w:pBdr>
+              <w:spacing w:after="120" w:before="120" w:line="240"/>
+              <w:ind w:left="120" w:right="120" w:firstLine="0" w:firstLineChars="0"/>
+              <w:rPr>
+                <w:rFonts w:ascii="Helvetica" w:hAnsi="Helvetica" w:eastAsia="Helvetica" w:cs="Helvetica"/>
+                <w:i w:val="false"/>
+                <w:b w:val="true"/>
+                <w:u w:val="none"/>
+                <w:strike w:val="false"/>
+                <w:sz w:val="20"/>
+                <w:szCs w:val="20"/>
+                <w:color w:val="000000"/>
+              </w:rPr>
             </w:pPr>
-          </w:p>
-        </w:tc>
-        <w:tc>
-          <w:tcPr/>
-          <w:p>
-            <w:pPr>
-              <w:pStyle w:val="Compact"/>
-              <w:jc w:val="right"/>
-            </w:pPr>
-            <w:r>
+            <w:r xmlns:w="http://schemas.openxmlformats.org/wordprocessingml/2006/main" xmlns:wp="http://schemas.openxmlformats.org/drawingml/2006/wordprocessingDrawing" xmlns:r="http://schemas.openxmlformats.org/officeDocument/2006/relationships" xmlns:w14="http://schemas.microsoft.com/office/word/2010/wordml">
+              <w:rPr>
+                <w:rFonts w:ascii="Helvetica" w:hAnsi="Helvetica" w:eastAsia="Helvetica" w:cs="Helvetica"/>
+                <w:i w:val="false"/>
+                <w:b w:val="true"/>
+                <w:u w:val="none"/>
+                <w:strike w:val="false"/>
+                <w:sz w:val="20"/>
+                <w:szCs w:val="20"/>
+                <w:color w:val="000000"/>
+              </w:rPr>
               <w:t xml:space="preserve">N in stratum</w:t>
             </w:r>
           </w:p>
         </w:tc>
         <w:tc>
-          <w:tcPr/>
+          <w:tcPr>
+            <w:tcBorders>
+              <w:bottom w:val="single" w:sz="12" w:space="0" w:color="666666"/>
+              <w:top w:val="single" w:sz="12" w:space="0" w:color="666666"/>
+              <w:left w:val="none" w:sz="0" w:space="0" w:color="000000"/>
+              <w:right w:val="none" w:sz="0" w:space="0" w:color="000000"/>
+            </w:tcBorders>
+            <w:shd w:val="clear" w:color="auto" w:fill="FFFFFF"/>
+            <w:tcMar>
+              <w:top w:w="0" w:type="dxa"/>
+              <w:bottom w:w="0" w:type="dxa"/>
+              <w:left w:w="0" w:type="dxa"/>
+              <w:right w:w="0" w:type="dxa"/>
+            </w:tcMar>
+            <w:vAlign w:val="center"/>
+          </w:tcPr>
           <w:p>
             <w:pPr>
-              <w:pStyle w:val="Compact"/>
               <w:jc w:val="right"/>
+              <w:pBdr>
+                <w:bottom w:val="none" w:sz="0" w:space="0" w:color="000000"/>
+                <w:top w:val="none" w:sz="0" w:space="0" w:color="000000"/>
+                <w:left w:val="none" w:sz="0" w:space="0" w:color="000000"/>
+                <w:right w:val="none" w:sz="0" w:space="0" w:color="000000"/>
+              </w:pBdr>
+              <w:spacing w:after="120" w:before="120" w:line="240"/>
+              <w:ind w:left="120" w:right="120" w:firstLine="0" w:firstLineChars="0"/>
+              <w:rPr>
+                <w:rFonts w:ascii="Helvetica" w:hAnsi="Helvetica" w:eastAsia="Helvetica" w:cs="Helvetica"/>
+                <w:i w:val="false"/>
+                <w:b w:val="true"/>
+                <w:u w:val="none"/>
+                <w:strike w:val="false"/>
+                <w:sz w:val="20"/>
+                <w:szCs w:val="20"/>
+                <w:color w:val="000000"/>
+              </w:rPr>
             </w:pPr>
-            <w:r>
+            <w:r xmlns:w="http://schemas.openxmlformats.org/wordprocessingml/2006/main" xmlns:wp="http://schemas.openxmlformats.org/drawingml/2006/wordprocessingDrawing" xmlns:r="http://schemas.openxmlformats.org/officeDocument/2006/relationships" xmlns:w14="http://schemas.microsoft.com/office/word/2010/wordml">
+              <w:rPr>
+                <w:rFonts w:ascii="Helvetica" w:hAnsi="Helvetica" w:eastAsia="Helvetica" w:cs="Helvetica"/>
+                <w:i w:val="false"/>
+                <w:b w:val="true"/>
+                <w:u w:val="none"/>
+                <w:strike w:val="false"/>
+                <w:sz w:val="20"/>
+                <w:szCs w:val="20"/>
+                <w:color w:val="000000"/>
+              </w:rPr>
               <w:t xml:space="preserve">log(rate/day)</w:t>
             </w:r>
           </w:p>
         </w:tc>
         <w:tc>
-          <w:tcPr/>
+          <w:tcPr>
+            <w:tcBorders>
+              <w:bottom w:val="single" w:sz="12" w:space="0" w:color="666666"/>
+              <w:top w:val="single" w:sz="12" w:space="0" w:color="666666"/>
+              <w:left w:val="none" w:sz="0" w:space="0" w:color="000000"/>
+              <w:right w:val="none" w:sz="0" w:space="0" w:color="000000"/>
+            </w:tcBorders>
+            <w:shd w:val="clear" w:color="auto" w:fill="FFFFFF"/>
+            <w:tcMar>
+              <w:top w:w="0" w:type="dxa"/>
+              <w:bottom w:w="0" w:type="dxa"/>
+              <w:left w:w="0" w:type="dxa"/>
+              <w:right w:w="0" w:type="dxa"/>
+            </w:tcMar>
+            <w:vAlign w:val="center"/>
+          </w:tcPr>
           <w:p>
             <w:pPr>
-              <w:pStyle w:val="Compact"/>
               <w:jc w:val="right"/>
+              <w:pBdr>
+                <w:bottom w:val="none" w:sz="0" w:space="0" w:color="000000"/>
+                <w:top w:val="none" w:sz="0" w:space="0" w:color="000000"/>
+                <w:left w:val="none" w:sz="0" w:space="0" w:color="000000"/>
+                <w:right w:val="none" w:sz="0" w:space="0" w:color="000000"/>
+              </w:pBdr>
+              <w:spacing w:after="120" w:before="120" w:line="240"/>
+              <w:ind w:left="120" w:right="120" w:firstLine="0" w:firstLineChars="0"/>
+              <w:rPr>
+                <w:rFonts w:ascii="Helvetica" w:hAnsi="Helvetica" w:eastAsia="Helvetica" w:cs="Helvetica"/>
+                <w:i w:val="false"/>
+                <w:b w:val="true"/>
+                <w:u w:val="none"/>
+                <w:strike w:val="false"/>
+                <w:sz w:val="20"/>
+                <w:szCs w:val="20"/>
+                <w:color w:val="000000"/>
+              </w:rPr>
             </w:pPr>
-            <w:r>
+            <w:r xmlns:w="http://schemas.openxmlformats.org/wordprocessingml/2006/main" xmlns:wp="http://schemas.openxmlformats.org/drawingml/2006/wordprocessingDrawing" xmlns:r="http://schemas.openxmlformats.org/officeDocument/2006/relationships" xmlns:w14="http://schemas.microsoft.com/office/word/2010/wordml">
+              <w:rPr>
+                <w:rFonts w:ascii="Helvetica" w:hAnsi="Helvetica" w:eastAsia="Helvetica" w:cs="Helvetica"/>
+                <w:i w:val="false"/>
+                <w:b w:val="true"/>
+                <w:u w:val="none"/>
+                <w:strike w:val="false"/>
+                <w:sz w:val="20"/>
+                <w:szCs w:val="20"/>
+                <w:color w:val="000000"/>
+              </w:rPr>
               <w:t xml:space="preserve">log(standard error)</w:t>
             </w:r>
           </w:p>
         </w:tc>
         <w:tc>
-          <w:tcPr/>
+          <w:tcPr>
+            <w:tcBorders>
+              <w:bottom w:val="single" w:sz="12" w:space="0" w:color="666666"/>
+              <w:top w:val="single" w:sz="12" w:space="0" w:color="666666"/>
+              <w:left w:val="none" w:sz="0" w:space="0" w:color="000000"/>
+              <w:right w:val="none" w:sz="0" w:space="0" w:color="000000"/>
+            </w:tcBorders>
+            <w:shd w:val="clear" w:color="auto" w:fill="FFFFFF"/>
+            <w:tcMar>
+              <w:top w:w="0" w:type="dxa"/>
+              <w:bottom w:w="0" w:type="dxa"/>
+              <w:left w:w="0" w:type="dxa"/>
+              <w:right w:w="0" w:type="dxa"/>
+            </w:tcMar>
+            <w:vAlign w:val="center"/>
+          </w:tcPr>
           <w:p>
             <w:pPr>
-              <w:pStyle w:val="Compact"/>
               <w:jc w:val="left"/>
+              <w:pBdr>
+                <w:bottom w:val="none" w:sz="0" w:space="0" w:color="000000"/>
+                <w:top w:val="none" w:sz="0" w:space="0" w:color="000000"/>
+                <w:left w:val="none" w:sz="0" w:space="0" w:color="000000"/>
+                <w:right w:val="none" w:sz="0" w:space="0" w:color="000000"/>
+              </w:pBdr>
+              <w:spacing w:after="120" w:before="120" w:line="240"/>
+              <w:ind w:left="120" w:right="120" w:firstLine="0" w:firstLineChars="0"/>
+              <w:rPr>
+                <w:rFonts w:ascii="Helvetica" w:hAnsi="Helvetica" w:eastAsia="Helvetica" w:cs="Helvetica"/>
+                <w:i w:val="false"/>
+                <w:b w:val="true"/>
+                <w:u w:val="none"/>
+                <w:strike w:val="false"/>
+                <w:sz w:val="20"/>
+                <w:szCs w:val="20"/>
+                <w:color w:val="000000"/>
+              </w:rPr>
             </w:pPr>
-            <w:r>
-              <w:t xml:space="preserve">Events per 100 person years (95% confidence interval</w:t>
+            <w:r xmlns:w="http://schemas.openxmlformats.org/wordprocessingml/2006/main" xmlns:wp="http://schemas.openxmlformats.org/drawingml/2006/wordprocessingDrawing" xmlns:r="http://schemas.openxmlformats.org/officeDocument/2006/relationships" xmlns:w14="http://schemas.microsoft.com/office/word/2010/wordml">
+              <w:rPr>
+                <w:rFonts w:ascii="Helvetica" w:hAnsi="Helvetica" w:eastAsia="Helvetica" w:cs="Helvetica"/>
+                <w:i w:val="false"/>
+                <w:b w:val="true"/>
+                <w:u w:val="none"/>
+                <w:strike w:val="false"/>
+                <w:sz w:val="20"/>
+                <w:szCs w:val="20"/>
+                <w:color w:val="000000"/>
+              </w:rPr>
+              <w:t xml:space="preserve">Events per 100 person years (95% CI)</w:t>
             </w:r>
           </w:p>
         </w:tc>
       </w:tr>
       <w:tr>
+        <w:trPr>
+          <w:trHeight w:val="360" w:hRule="auto"/>
+        </w:trPr>
         <w:tc>
-          <w:tcPr/>
+          <w:tcPr>
+            <w:tcBorders>
+              <w:bottom w:val="single" w:sz="6" w:space="0" w:color="666666"/>
+              <w:top w:val="single" w:sz="12" w:space="0" w:color="666666"/>
+              <w:left w:val="none" w:sz="0" w:space="0" w:color="000000"/>
+              <w:right w:val="none" w:sz="0" w:space="0" w:color="000000"/>
+            </w:tcBorders>
+            <w:shd w:val="clear" w:color="auto" w:fill="FFFFFF"/>
+            <w:tcMar>
+              <w:top w:w="0" w:type="dxa"/>
+              <w:bottom w:w="0" w:type="dxa"/>
+              <w:left w:w="0" w:type="dxa"/>
+              <w:right w:w="0" w:type="dxa"/>
+            </w:tcMar>
+            <w:vAlign w:val="center"/>
+          </w:tcPr>
           <w:p>
             <w:pPr>
-              <w:pStyle w:val="Compact"/>
-              <w:jc w:val="left"/>
+              <w:jc w:val="right"/>
+              <w:pBdr>
+                <w:bottom w:val="none" w:sz="0" w:space="0" w:color="000000"/>
+                <w:top w:val="none" w:sz="0" w:space="0" w:color="000000"/>
+                <w:left w:val="none" w:sz="0" w:space="0" w:color="000000"/>
+                <w:right w:val="none" w:sz="0" w:space="0" w:color="000000"/>
+              </w:pBdr>
+              <w:spacing w:after="120" w:before="120" w:line="240"/>
+              <w:ind w:left="120" w:right="120" w:firstLine="0" w:firstLineChars="0"/>
+              <w:rPr>
+                <w:rFonts w:ascii="Helvetica" w:hAnsi="Helvetica" w:eastAsia="Helvetica" w:cs="Helvetica"/>
+                <w:i w:val="false"/>
+                <w:b w:val="false"/>
+                <w:u w:val="none"/>
+                <w:strike w:val="false"/>
+                <w:sz w:val="20"/>
+                <w:szCs w:val="20"/>
+                <w:color w:val="000000"/>
+              </w:rPr>
             </w:pPr>
-            <w:r>
-              <w:t xml:space="preserve">Male &lt;65 years</w:t>
-            </w:r>
-          </w:p>
-        </w:tc>
-        <w:tc>
-          <w:tcPr/>
-          <w:p>
-            <w:pPr>
-              <w:pStyle w:val="Compact"/>
-              <w:jc w:val="right"/>
-            </w:pPr>
-            <w:r>
+            <w:r xmlns:w="http://schemas.openxmlformats.org/wordprocessingml/2006/main" xmlns:wp="http://schemas.openxmlformats.org/drawingml/2006/wordprocessingDrawing" xmlns:r="http://schemas.openxmlformats.org/officeDocument/2006/relationships" xmlns:w14="http://schemas.microsoft.com/office/word/2010/wordml">
+              <w:rPr>
+                <w:rFonts w:ascii="Helvetica" w:hAnsi="Helvetica" w:eastAsia="Helvetica" w:cs="Helvetica"/>
+                <w:i w:val="false"/>
+                <w:b w:val="false"/>
+                <w:u w:val="none"/>
+                <w:strike w:val="false"/>
+                <w:sz w:val="20"/>
+                <w:szCs w:val="20"/>
+                <w:color w:val="000000"/>
+              </w:rPr>
               <w:t xml:space="preserve">94</w:t>
             </w:r>
           </w:p>
         </w:tc>
         <w:tc>
-          <w:tcPr/>
+          <w:tcPr>
+            <w:tcBorders>
+              <w:bottom w:val="single" w:sz="6" w:space="0" w:color="666666"/>
+              <w:top w:val="single" w:sz="12" w:space="0" w:color="666666"/>
+              <w:left w:val="none" w:sz="0" w:space="0" w:color="000000"/>
+              <w:right w:val="none" w:sz="0" w:space="0" w:color="000000"/>
+            </w:tcBorders>
+            <w:shd w:val="clear" w:color="auto" w:fill="FFFFFF"/>
+            <w:tcMar>
+              <w:top w:w="0" w:type="dxa"/>
+              <w:bottom w:w="0" w:type="dxa"/>
+              <w:left w:w="0" w:type="dxa"/>
+              <w:right w:w="0" w:type="dxa"/>
+            </w:tcMar>
+            <w:vAlign w:val="center"/>
+          </w:tcPr>
           <w:p>
             <w:pPr>
-              <w:pStyle w:val="Compact"/>
               <w:jc w:val="right"/>
+              <w:pBdr>
+                <w:bottom w:val="none" w:sz="0" w:space="0" w:color="000000"/>
+                <w:top w:val="none" w:sz="0" w:space="0" w:color="000000"/>
+                <w:left w:val="none" w:sz="0" w:space="0" w:color="000000"/>
+                <w:right w:val="none" w:sz="0" w:space="0" w:color="000000"/>
+              </w:pBdr>
+              <w:spacing w:after="120" w:before="120" w:line="240"/>
+              <w:ind w:left="120" w:right="120" w:firstLine="0" w:firstLineChars="0"/>
+              <w:rPr>
+                <w:rFonts w:ascii="Helvetica" w:hAnsi="Helvetica" w:eastAsia="Helvetica" w:cs="Helvetica"/>
+                <w:i w:val="false"/>
+                <w:b w:val="false"/>
+                <w:u w:val="none"/>
+                <w:strike w:val="false"/>
+                <w:sz w:val="20"/>
+                <w:szCs w:val="20"/>
+                <w:color w:val="000000"/>
+              </w:rPr>
             </w:pPr>
-            <w:r>
+            <w:r xmlns:w="http://schemas.openxmlformats.org/wordprocessingml/2006/main" xmlns:wp="http://schemas.openxmlformats.org/drawingml/2006/wordprocessingDrawing" xmlns:r="http://schemas.openxmlformats.org/officeDocument/2006/relationships" xmlns:w14="http://schemas.microsoft.com/office/word/2010/wordml">
+              <w:rPr>
+                <w:rFonts w:ascii="Helvetica" w:hAnsi="Helvetica" w:eastAsia="Helvetica" w:cs="Helvetica"/>
+                <w:i w:val="false"/>
+                <w:b w:val="false"/>
+                <w:u w:val="none"/>
+                <w:strike w:val="false"/>
+                <w:sz w:val="20"/>
+                <w:szCs w:val="20"/>
+                <w:color w:val="000000"/>
+              </w:rPr>
               <w:t xml:space="preserve">-9.23</w:t>
             </w:r>
           </w:p>
         </w:tc>
         <w:tc>
-          <w:tcPr/>
+          <w:tcPr>
+            <w:tcBorders>
+              <w:bottom w:val="single" w:sz="6" w:space="0" w:color="666666"/>
+              <w:top w:val="single" w:sz="12" w:space="0" w:color="666666"/>
+              <w:left w:val="none" w:sz="0" w:space="0" w:color="000000"/>
+              <w:right w:val="none" w:sz="0" w:space="0" w:color="000000"/>
+            </w:tcBorders>
+            <w:shd w:val="clear" w:color="auto" w:fill="FFFFFF"/>
+            <w:tcMar>
+              <w:top w:w="0" w:type="dxa"/>
+              <w:bottom w:w="0" w:type="dxa"/>
+              <w:left w:w="0" w:type="dxa"/>
+              <w:right w:w="0" w:type="dxa"/>
+            </w:tcMar>
+            <w:vAlign w:val="center"/>
+          </w:tcPr>
           <w:p>
             <w:pPr>
-              <w:pStyle w:val="Compact"/>
               <w:jc w:val="right"/>
+              <w:pBdr>
+                <w:bottom w:val="none" w:sz="0" w:space="0" w:color="000000"/>
+                <w:top w:val="none" w:sz="0" w:space="0" w:color="000000"/>
+                <w:left w:val="none" w:sz="0" w:space="0" w:color="000000"/>
+                <w:right w:val="none" w:sz="0" w:space="0" w:color="000000"/>
+              </w:pBdr>
+              <w:spacing w:after="120" w:before="120" w:line="240"/>
+              <w:ind w:left="120" w:right="120" w:firstLine="0" w:firstLineChars="0"/>
+              <w:rPr>
+                <w:rFonts w:ascii="Helvetica" w:hAnsi="Helvetica" w:eastAsia="Helvetica" w:cs="Helvetica"/>
+                <w:i w:val="false"/>
+                <w:b w:val="false"/>
+                <w:u w:val="none"/>
+                <w:strike w:val="false"/>
+                <w:sz w:val="20"/>
+                <w:szCs w:val="20"/>
+                <w:color w:val="000000"/>
+              </w:rPr>
             </w:pPr>
-            <w:r>
+            <w:r xmlns:w="http://schemas.openxmlformats.org/wordprocessingml/2006/main" xmlns:wp="http://schemas.openxmlformats.org/drawingml/2006/wordprocessingDrawing" xmlns:r="http://schemas.openxmlformats.org/officeDocument/2006/relationships" xmlns:w14="http://schemas.microsoft.com/office/word/2010/wordml">
+              <w:rPr>
+                <w:rFonts w:ascii="Helvetica" w:hAnsi="Helvetica" w:eastAsia="Helvetica" w:cs="Helvetica"/>
+                <w:i w:val="false"/>
+                <w:b w:val="false"/>
+                <w:u w:val="none"/>
+                <w:strike w:val="false"/>
+                <w:sz w:val="20"/>
+                <w:szCs w:val="20"/>
+                <w:color w:val="000000"/>
+              </w:rPr>
               <w:t xml:space="preserve">0.29</w:t>
             </w:r>
           </w:p>
         </w:tc>
         <w:tc>
-          <w:tcPr/>
+          <w:tcPr>
+            <w:tcBorders>
+              <w:bottom w:val="single" w:sz="6" w:space="0" w:color="666666"/>
+              <w:top w:val="single" w:sz="12" w:space="0" w:color="666666"/>
+              <w:left w:val="none" w:sz="0" w:space="0" w:color="000000"/>
+              <w:right w:val="none" w:sz="0" w:space="0" w:color="000000"/>
+            </w:tcBorders>
+            <w:shd w:val="clear" w:color="auto" w:fill="FFFFFF"/>
+            <w:tcMar>
+              <w:top w:w="0" w:type="dxa"/>
+              <w:bottom w:w="0" w:type="dxa"/>
+              <w:left w:w="0" w:type="dxa"/>
+              <w:right w:w="0" w:type="dxa"/>
+            </w:tcMar>
+            <w:vAlign w:val="center"/>
+          </w:tcPr>
           <w:p>
             <w:pPr>
-              <w:pStyle w:val="Compact"/>
               <w:jc w:val="left"/>
+              <w:pBdr>
+                <w:bottom w:val="none" w:sz="0" w:space="0" w:color="000000"/>
+                <w:top w:val="none" w:sz="0" w:space="0" w:color="000000"/>
+                <w:left w:val="none" w:sz="0" w:space="0" w:color="000000"/>
+                <w:right w:val="none" w:sz="0" w:space="0" w:color="000000"/>
+              </w:pBdr>
+              <w:spacing w:after="120" w:before="120" w:line="240"/>
+              <w:ind w:left="120" w:right="120" w:firstLine="0" w:firstLineChars="0"/>
+              <w:rPr>
+                <w:rFonts w:ascii="Helvetica" w:hAnsi="Helvetica" w:eastAsia="Helvetica" w:cs="Helvetica"/>
+                <w:i w:val="false"/>
+                <w:b w:val="false"/>
+                <w:u w:val="none"/>
+                <w:strike w:val="false"/>
+                <w:sz w:val="20"/>
+                <w:szCs w:val="20"/>
+                <w:color w:val="000000"/>
+              </w:rPr>
             </w:pPr>
-            <w:r>
-              <w:t xml:space="preserve">3.59 ( 2.04 - 6.33 )</w:t>
+            <w:r xmlns:w="http://schemas.openxmlformats.org/wordprocessingml/2006/main" xmlns:wp="http://schemas.openxmlformats.org/drawingml/2006/wordprocessingDrawing" xmlns:r="http://schemas.openxmlformats.org/officeDocument/2006/relationships" xmlns:w14="http://schemas.microsoft.com/office/word/2010/wordml">
+              <w:rPr>
+                <w:rFonts w:ascii="Helvetica" w:hAnsi="Helvetica" w:eastAsia="Helvetica" w:cs="Helvetica"/>
+                <w:i w:val="false"/>
+                <w:b w:val="false"/>
+                <w:u w:val="none"/>
+                <w:strike w:val="false"/>
+                <w:sz w:val="20"/>
+                <w:szCs w:val="20"/>
+                <w:color w:val="000000"/>
+              </w:rPr>
+              <w:t xml:space="preserve">3.59 (2.04-6.33)</w:t>
             </w:r>
           </w:p>
         </w:tc>
       </w:tr>
       <w:tr>
+        <w:trPr>
+          <w:trHeight w:val="360" w:hRule="auto"/>
+        </w:trPr>
         <w:tc>
-          <w:tcPr/>
+          <w:tcPr>
+            <w:tcBorders>
+              <w:bottom w:val="single" w:sz="6" w:space="0" w:color="666666"/>
+              <w:top w:val="single" w:sz="6" w:space="0" w:color="666666"/>
+              <w:left w:val="none" w:sz="0" w:space="0" w:color="000000"/>
+              <w:right w:val="none" w:sz="0" w:space="0" w:color="000000"/>
+            </w:tcBorders>
+            <w:shd w:val="clear" w:color="auto" w:fill="FFFFFF"/>
+            <w:tcMar>
+              <w:top w:w="0" w:type="dxa"/>
+              <w:bottom w:w="0" w:type="dxa"/>
+              <w:left w:w="0" w:type="dxa"/>
+              <w:right w:w="0" w:type="dxa"/>
+            </w:tcMar>
+            <w:vAlign w:val="center"/>
+          </w:tcPr>
           <w:p>
             <w:pPr>
-              <w:pStyle w:val="Compact"/>
-              <w:jc w:val="left"/>
+              <w:jc w:val="right"/>
+              <w:pBdr>
+                <w:bottom w:val="none" w:sz="0" w:space="0" w:color="000000"/>
+                <w:top w:val="none" w:sz="0" w:space="0" w:color="000000"/>
+                <w:left w:val="none" w:sz="0" w:space="0" w:color="000000"/>
+                <w:right w:val="none" w:sz="0" w:space="0" w:color="000000"/>
+              </w:pBdr>
+              <w:spacing w:after="120" w:before="120" w:line="240"/>
+              <w:ind w:left="120" w:right="120" w:firstLine="0" w:firstLineChars="0"/>
+              <w:rPr>
+                <w:rFonts w:ascii="Helvetica" w:hAnsi="Helvetica" w:eastAsia="Helvetica" w:cs="Helvetica"/>
+                <w:i w:val="false"/>
+                <w:b w:val="false"/>
+                <w:u w:val="none"/>
+                <w:strike w:val="false"/>
+                <w:sz w:val="20"/>
+                <w:szCs w:val="20"/>
+                <w:color w:val="000000"/>
+              </w:rPr>
             </w:pPr>
-            <w:r>
-              <w:t xml:space="preserve">Female &lt;65 years</w:t>
-            </w:r>
-          </w:p>
-        </w:tc>
-        <w:tc>
-          <w:tcPr/>
-          <w:p>
-            <w:pPr>
-              <w:pStyle w:val="Compact"/>
-              <w:jc w:val="right"/>
-            </w:pPr>
-            <w:r>
+            <w:r xmlns:w="http://schemas.openxmlformats.org/wordprocessingml/2006/main" xmlns:wp="http://schemas.openxmlformats.org/drawingml/2006/wordprocessingDrawing" xmlns:r="http://schemas.openxmlformats.org/officeDocument/2006/relationships" xmlns:w14="http://schemas.microsoft.com/office/word/2010/wordml">
+              <w:rPr>
+                <w:rFonts w:ascii="Helvetica" w:hAnsi="Helvetica" w:eastAsia="Helvetica" w:cs="Helvetica"/>
+                <w:i w:val="false"/>
+                <w:b w:val="false"/>
+                <w:u w:val="none"/>
+                <w:strike w:val="false"/>
+                <w:sz w:val="20"/>
+                <w:szCs w:val="20"/>
+                <w:color w:val="000000"/>
+              </w:rPr>
               <w:t xml:space="preserve">34</w:t>
             </w:r>
           </w:p>
         </w:tc>
         <w:tc>
-          <w:tcPr/>
+          <w:tcPr>
+            <w:tcBorders>
+              <w:bottom w:val="single" w:sz="6" w:space="0" w:color="666666"/>
+              <w:top w:val="single" w:sz="6" w:space="0" w:color="666666"/>
+              <w:left w:val="none" w:sz="0" w:space="0" w:color="000000"/>
+              <w:right w:val="none" w:sz="0" w:space="0" w:color="000000"/>
+            </w:tcBorders>
+            <w:shd w:val="clear" w:color="auto" w:fill="FFFFFF"/>
+            <w:tcMar>
+              <w:top w:w="0" w:type="dxa"/>
+              <w:bottom w:w="0" w:type="dxa"/>
+              <w:left w:w="0" w:type="dxa"/>
+              <w:right w:w="0" w:type="dxa"/>
+            </w:tcMar>
+            <w:vAlign w:val="center"/>
+          </w:tcPr>
           <w:p>
             <w:pPr>
-              <w:pStyle w:val="Compact"/>
               <w:jc w:val="right"/>
+              <w:pBdr>
+                <w:bottom w:val="none" w:sz="0" w:space="0" w:color="000000"/>
+                <w:top w:val="none" w:sz="0" w:space="0" w:color="000000"/>
+                <w:left w:val="none" w:sz="0" w:space="0" w:color="000000"/>
+                <w:right w:val="none" w:sz="0" w:space="0" w:color="000000"/>
+              </w:pBdr>
+              <w:spacing w:after="120" w:before="120" w:line="240"/>
+              <w:ind w:left="120" w:right="120" w:firstLine="0" w:firstLineChars="0"/>
+              <w:rPr>
+                <w:rFonts w:ascii="Helvetica" w:hAnsi="Helvetica" w:eastAsia="Helvetica" w:cs="Helvetica"/>
+                <w:i w:val="false"/>
+                <w:b w:val="false"/>
+                <w:u w:val="none"/>
+                <w:strike w:val="false"/>
+                <w:sz w:val="20"/>
+                <w:szCs w:val="20"/>
+                <w:color w:val="000000"/>
+              </w:rPr>
             </w:pPr>
-            <w:r>
+            <w:r xmlns:w="http://schemas.openxmlformats.org/wordprocessingml/2006/main" xmlns:wp="http://schemas.openxmlformats.org/drawingml/2006/wordprocessingDrawing" xmlns:r="http://schemas.openxmlformats.org/officeDocument/2006/relationships" xmlns:w14="http://schemas.microsoft.com/office/word/2010/wordml">
+              <w:rPr>
+                <w:rFonts w:ascii="Helvetica" w:hAnsi="Helvetica" w:eastAsia="Helvetica" w:cs="Helvetica"/>
+                <w:i w:val="false"/>
+                <w:b w:val="false"/>
+                <w:u w:val="none"/>
+                <w:strike w:val="false"/>
+                <w:sz w:val="20"/>
+                <w:szCs w:val="20"/>
+                <w:color w:val="000000"/>
+              </w:rPr>
               <w:t xml:space="preserve">-9.37</w:t>
             </w:r>
           </w:p>
         </w:tc>
         <w:tc>
-          <w:tcPr/>
+          <w:tcPr>
+            <w:tcBorders>
+              <w:bottom w:val="single" w:sz="6" w:space="0" w:color="666666"/>
+              <w:top w:val="single" w:sz="6" w:space="0" w:color="666666"/>
+              <w:left w:val="none" w:sz="0" w:space="0" w:color="000000"/>
+              <w:right w:val="none" w:sz="0" w:space="0" w:color="000000"/>
+            </w:tcBorders>
+            <w:shd w:val="clear" w:color="auto" w:fill="FFFFFF"/>
+            <w:tcMar>
+              <w:top w:w="0" w:type="dxa"/>
+              <w:bottom w:w="0" w:type="dxa"/>
+              <w:left w:w="0" w:type="dxa"/>
+              <w:right w:w="0" w:type="dxa"/>
+            </w:tcMar>
+            <w:vAlign w:val="center"/>
+          </w:tcPr>
           <w:p>
             <w:pPr>
-              <w:pStyle w:val="Compact"/>
               <w:jc w:val="right"/>
+              <w:pBdr>
+                <w:bottom w:val="none" w:sz="0" w:space="0" w:color="000000"/>
+                <w:top w:val="none" w:sz="0" w:space="0" w:color="000000"/>
+                <w:left w:val="none" w:sz="0" w:space="0" w:color="000000"/>
+                <w:right w:val="none" w:sz="0" w:space="0" w:color="000000"/>
+              </w:pBdr>
+              <w:spacing w:after="120" w:before="120" w:line="240"/>
+              <w:ind w:left="120" w:right="120" w:firstLine="0" w:firstLineChars="0"/>
+              <w:rPr>
+                <w:rFonts w:ascii="Helvetica" w:hAnsi="Helvetica" w:eastAsia="Helvetica" w:cs="Helvetica"/>
+                <w:i w:val="false"/>
+                <w:b w:val="false"/>
+                <w:u w:val="none"/>
+                <w:strike w:val="false"/>
+                <w:sz w:val="20"/>
+                <w:szCs w:val="20"/>
+                <w:color w:val="000000"/>
+              </w:rPr>
             </w:pPr>
-            <w:r>
+            <w:r xmlns:w="http://schemas.openxmlformats.org/wordprocessingml/2006/main" xmlns:wp="http://schemas.openxmlformats.org/drawingml/2006/wordprocessingDrawing" xmlns:r="http://schemas.openxmlformats.org/officeDocument/2006/relationships" xmlns:w14="http://schemas.microsoft.com/office/word/2010/wordml">
+              <w:rPr>
+                <w:rFonts w:ascii="Helvetica" w:hAnsi="Helvetica" w:eastAsia="Helvetica" w:cs="Helvetica"/>
+                <w:i w:val="false"/>
+                <w:b w:val="false"/>
+                <w:u w:val="none"/>
+                <w:strike w:val="false"/>
+                <w:sz w:val="20"/>
+                <w:szCs w:val="20"/>
+                <w:color w:val="000000"/>
+              </w:rPr>
               <w:t xml:space="preserve">0.50</w:t>
             </w:r>
           </w:p>
         </w:tc>
         <w:tc>
-          <w:tcPr/>
+          <w:tcPr>
+            <w:tcBorders>
+              <w:bottom w:val="single" w:sz="6" w:space="0" w:color="666666"/>
+              <w:top w:val="single" w:sz="6" w:space="0" w:color="666666"/>
+              <w:left w:val="none" w:sz="0" w:space="0" w:color="000000"/>
+              <w:right w:val="none" w:sz="0" w:space="0" w:color="000000"/>
+            </w:tcBorders>
+            <w:shd w:val="clear" w:color="auto" w:fill="FFFFFF"/>
+            <w:tcMar>
+              <w:top w:w="0" w:type="dxa"/>
+              <w:bottom w:w="0" w:type="dxa"/>
+              <w:left w:w="0" w:type="dxa"/>
+              <w:right w:w="0" w:type="dxa"/>
+            </w:tcMar>
+            <w:vAlign w:val="center"/>
+          </w:tcPr>
           <w:p>
             <w:pPr>
-              <w:pStyle w:val="Compact"/>
               <w:jc w:val="left"/>
+              <w:pBdr>
+                <w:bottom w:val="none" w:sz="0" w:space="0" w:color="000000"/>
+                <w:top w:val="none" w:sz="0" w:space="0" w:color="000000"/>
+                <w:left w:val="none" w:sz="0" w:space="0" w:color="000000"/>
+                <w:right w:val="none" w:sz="0" w:space="0" w:color="000000"/>
+              </w:pBdr>
+              <w:spacing w:after="120" w:before="120" w:line="240"/>
+              <w:ind w:left="120" w:right="120" w:firstLine="0" w:firstLineChars="0"/>
+              <w:rPr>
+                <w:rFonts w:ascii="Helvetica" w:hAnsi="Helvetica" w:eastAsia="Helvetica" w:cs="Helvetica"/>
+                <w:i w:val="false"/>
+                <w:b w:val="false"/>
+                <w:u w:val="none"/>
+                <w:strike w:val="false"/>
+                <w:sz w:val="20"/>
+                <w:szCs w:val="20"/>
+                <w:color w:val="000000"/>
+              </w:rPr>
             </w:pPr>
-            <w:r>
-              <w:t xml:space="preserve">3.11 ( 1.17 - 8.29 )</w:t>
+            <w:r xmlns:w="http://schemas.openxmlformats.org/wordprocessingml/2006/main" xmlns:wp="http://schemas.openxmlformats.org/drawingml/2006/wordprocessingDrawing" xmlns:r="http://schemas.openxmlformats.org/officeDocument/2006/relationships" xmlns:w14="http://schemas.microsoft.com/office/word/2010/wordml">
+              <w:rPr>
+                <w:rFonts w:ascii="Helvetica" w:hAnsi="Helvetica" w:eastAsia="Helvetica" w:cs="Helvetica"/>
+                <w:i w:val="false"/>
+                <w:b w:val="false"/>
+                <w:u w:val="none"/>
+                <w:strike w:val="false"/>
+                <w:sz w:val="20"/>
+                <w:szCs w:val="20"/>
+                <w:color w:val="000000"/>
+              </w:rPr>
+              <w:t xml:space="preserve">3.11 (1.17-8.29)</w:t>
             </w:r>
           </w:p>
         </w:tc>
       </w:tr>
       <w:tr>
+        <w:trPr>
+          <w:trHeight w:val="360" w:hRule="auto"/>
+        </w:trPr>
         <w:tc>
-          <w:tcPr/>
+          <w:tcPr>
+            <w:tcBorders>
+              <w:bottom w:val="single" w:sz="6" w:space="0" w:color="666666"/>
+              <w:top w:val="single" w:sz="6" w:space="0" w:color="666666"/>
+              <w:left w:val="none" w:sz="0" w:space="0" w:color="000000"/>
+              <w:right w:val="none" w:sz="0" w:space="0" w:color="000000"/>
+            </w:tcBorders>
+            <w:shd w:val="clear" w:color="auto" w:fill="FFFFFF"/>
+            <w:tcMar>
+              <w:top w:w="0" w:type="dxa"/>
+              <w:bottom w:w="0" w:type="dxa"/>
+              <w:left w:w="0" w:type="dxa"/>
+              <w:right w:w="0" w:type="dxa"/>
+            </w:tcMar>
+            <w:vAlign w:val="center"/>
+          </w:tcPr>
           <w:p>
             <w:pPr>
-              <w:pStyle w:val="Compact"/>
-              <w:jc w:val="left"/>
+              <w:jc w:val="right"/>
+              <w:pBdr>
+                <w:bottom w:val="none" w:sz="0" w:space="0" w:color="000000"/>
+                <w:top w:val="none" w:sz="0" w:space="0" w:color="000000"/>
+                <w:left w:val="none" w:sz="0" w:space="0" w:color="000000"/>
+                <w:right w:val="none" w:sz="0" w:space="0" w:color="000000"/>
+              </w:pBdr>
+              <w:spacing w:after="120" w:before="120" w:line="240"/>
+              <w:ind w:left="120" w:right="120" w:firstLine="0" w:firstLineChars="0"/>
+              <w:rPr>
+                <w:rFonts w:ascii="Helvetica" w:hAnsi="Helvetica" w:eastAsia="Helvetica" w:cs="Helvetica"/>
+                <w:i w:val="false"/>
+                <w:b w:val="false"/>
+                <w:u w:val="none"/>
+                <w:strike w:val="false"/>
+                <w:sz w:val="20"/>
+                <w:szCs w:val="20"/>
+                <w:color w:val="000000"/>
+              </w:rPr>
             </w:pPr>
-            <w:r>
-              <w:t xml:space="preserve">Male 65 years and over</w:t>
-            </w:r>
-          </w:p>
-        </w:tc>
-        <w:tc>
-          <w:tcPr/>
-          <w:p>
-            <w:pPr>
-              <w:pStyle w:val="Compact"/>
-              <w:jc w:val="right"/>
-            </w:pPr>
-            <w:r>
+            <w:r xmlns:w="http://schemas.openxmlformats.org/wordprocessingml/2006/main" xmlns:wp="http://schemas.openxmlformats.org/drawingml/2006/wordprocessingDrawing" xmlns:r="http://schemas.openxmlformats.org/officeDocument/2006/relationships" xmlns:w14="http://schemas.microsoft.com/office/word/2010/wordml">
+              <w:rPr>
+                <w:rFonts w:ascii="Helvetica" w:hAnsi="Helvetica" w:eastAsia="Helvetica" w:cs="Helvetica"/>
+                <w:i w:val="false"/>
+                <w:b w:val="false"/>
+                <w:u w:val="none"/>
+                <w:strike w:val="false"/>
+                <w:sz w:val="20"/>
+                <w:szCs w:val="20"/>
+                <w:color w:val="000000"/>
+              </w:rPr>
               <w:t xml:space="preserve">204</w:t>
             </w:r>
           </w:p>
         </w:tc>
         <w:tc>
-          <w:tcPr/>
+          <w:tcPr>
+            <w:tcBorders>
+              <w:bottom w:val="single" w:sz="6" w:space="0" w:color="666666"/>
+              <w:top w:val="single" w:sz="6" w:space="0" w:color="666666"/>
+              <w:left w:val="none" w:sz="0" w:space="0" w:color="000000"/>
+              <w:right w:val="none" w:sz="0" w:space="0" w:color="000000"/>
+            </w:tcBorders>
+            <w:shd w:val="clear" w:color="auto" w:fill="FFFFFF"/>
+            <w:tcMar>
+              <w:top w:w="0" w:type="dxa"/>
+              <w:bottom w:w="0" w:type="dxa"/>
+              <w:left w:w="0" w:type="dxa"/>
+              <w:right w:w="0" w:type="dxa"/>
+            </w:tcMar>
+            <w:vAlign w:val="center"/>
+          </w:tcPr>
           <w:p>
             <w:pPr>
-              <w:pStyle w:val="Compact"/>
               <w:jc w:val="right"/>
+              <w:pBdr>
+                <w:bottom w:val="none" w:sz="0" w:space="0" w:color="000000"/>
+                <w:top w:val="none" w:sz="0" w:space="0" w:color="000000"/>
+                <w:left w:val="none" w:sz="0" w:space="0" w:color="000000"/>
+                <w:right w:val="none" w:sz="0" w:space="0" w:color="000000"/>
+              </w:pBdr>
+              <w:spacing w:after="120" w:before="120" w:line="240"/>
+              <w:ind w:left="120" w:right="120" w:firstLine="0" w:firstLineChars="0"/>
+              <w:rPr>
+                <w:rFonts w:ascii="Helvetica" w:hAnsi="Helvetica" w:eastAsia="Helvetica" w:cs="Helvetica"/>
+                <w:i w:val="false"/>
+                <w:b w:val="false"/>
+                <w:u w:val="none"/>
+                <w:strike w:val="false"/>
+                <w:sz w:val="20"/>
+                <w:szCs w:val="20"/>
+                <w:color w:val="000000"/>
+              </w:rPr>
             </w:pPr>
-            <w:r>
+            <w:r xmlns:w="http://schemas.openxmlformats.org/wordprocessingml/2006/main" xmlns:wp="http://schemas.openxmlformats.org/drawingml/2006/wordprocessingDrawing" xmlns:r="http://schemas.openxmlformats.org/officeDocument/2006/relationships" xmlns:w14="http://schemas.microsoft.com/office/word/2010/wordml">
+              <w:rPr>
+                <w:rFonts w:ascii="Helvetica" w:hAnsi="Helvetica" w:eastAsia="Helvetica" w:cs="Helvetica"/>
+                <w:i w:val="false"/>
+                <w:b w:val="false"/>
+                <w:u w:val="none"/>
+                <w:strike w:val="false"/>
+                <w:sz w:val="20"/>
+                <w:szCs w:val="20"/>
+                <w:color w:val="000000"/>
+              </w:rPr>
               <w:t xml:space="preserve">-8.43</w:t>
             </w:r>
           </w:p>
         </w:tc>
         <w:tc>
-          <w:tcPr/>
+          <w:tcPr>
+            <w:tcBorders>
+              <w:bottom w:val="single" w:sz="6" w:space="0" w:color="666666"/>
+              <w:top w:val="single" w:sz="6" w:space="0" w:color="666666"/>
+              <w:left w:val="none" w:sz="0" w:space="0" w:color="000000"/>
+              <w:right w:val="none" w:sz="0" w:space="0" w:color="000000"/>
+            </w:tcBorders>
+            <w:shd w:val="clear" w:color="auto" w:fill="FFFFFF"/>
+            <w:tcMar>
+              <w:top w:w="0" w:type="dxa"/>
+              <w:bottom w:w="0" w:type="dxa"/>
+              <w:left w:w="0" w:type="dxa"/>
+              <w:right w:w="0" w:type="dxa"/>
+            </w:tcMar>
+            <w:vAlign w:val="center"/>
+          </w:tcPr>
           <w:p>
             <w:pPr>
-              <w:pStyle w:val="Compact"/>
               <w:jc w:val="right"/>
+              <w:pBdr>
+                <w:bottom w:val="none" w:sz="0" w:space="0" w:color="000000"/>
+                <w:top w:val="none" w:sz="0" w:space="0" w:color="000000"/>
+                <w:left w:val="none" w:sz="0" w:space="0" w:color="000000"/>
+                <w:right w:val="none" w:sz="0" w:space="0" w:color="000000"/>
+              </w:pBdr>
+              <w:spacing w:after="120" w:before="120" w:line="240"/>
+              <w:ind w:left="120" w:right="120" w:firstLine="0" w:firstLineChars="0"/>
+              <w:rPr>
+                <w:rFonts w:ascii="Helvetica" w:hAnsi="Helvetica" w:eastAsia="Helvetica" w:cs="Helvetica"/>
+                <w:i w:val="false"/>
+                <w:b w:val="false"/>
+                <w:u w:val="none"/>
+                <w:strike w:val="false"/>
+                <w:sz w:val="20"/>
+                <w:szCs w:val="20"/>
+                <w:color w:val="000000"/>
+              </w:rPr>
             </w:pPr>
-            <w:r>
+            <w:r xmlns:w="http://schemas.openxmlformats.org/wordprocessingml/2006/main" xmlns:wp="http://schemas.openxmlformats.org/drawingml/2006/wordprocessingDrawing" xmlns:r="http://schemas.openxmlformats.org/officeDocument/2006/relationships" xmlns:w14="http://schemas.microsoft.com/office/word/2010/wordml">
+              <w:rPr>
+                <w:rFonts w:ascii="Helvetica" w:hAnsi="Helvetica" w:eastAsia="Helvetica" w:cs="Helvetica"/>
+                <w:i w:val="false"/>
+                <w:b w:val="false"/>
+                <w:u w:val="none"/>
+                <w:strike w:val="false"/>
+                <w:sz w:val="20"/>
+                <w:szCs w:val="20"/>
+                <w:color w:val="000000"/>
+              </w:rPr>
               <w:t xml:space="preserve">0.19</w:t>
             </w:r>
           </w:p>
         </w:tc>
         <w:tc>
-          <w:tcPr/>
+          <w:tcPr>
+            <w:tcBorders>
+              <w:bottom w:val="single" w:sz="6" w:space="0" w:color="666666"/>
+              <w:top w:val="single" w:sz="6" w:space="0" w:color="666666"/>
+              <w:left w:val="none" w:sz="0" w:space="0" w:color="000000"/>
+              <w:right w:val="none" w:sz="0" w:space="0" w:color="000000"/>
+            </w:tcBorders>
+            <w:shd w:val="clear" w:color="auto" w:fill="FFFFFF"/>
+            <w:tcMar>
+              <w:top w:w="0" w:type="dxa"/>
+              <w:bottom w:w="0" w:type="dxa"/>
+              <w:left w:w="0" w:type="dxa"/>
+              <w:right w:w="0" w:type="dxa"/>
+            </w:tcMar>
+            <w:vAlign w:val="center"/>
+          </w:tcPr>
           <w:p>
             <w:pPr>
-              <w:pStyle w:val="Compact"/>
               <w:jc w:val="left"/>
+              <w:pBdr>
+                <w:bottom w:val="none" w:sz="0" w:space="0" w:color="000000"/>
+                <w:top w:val="none" w:sz="0" w:space="0" w:color="000000"/>
+                <w:left w:val="none" w:sz="0" w:space="0" w:color="000000"/>
+                <w:right w:val="none" w:sz="0" w:space="0" w:color="000000"/>
+              </w:pBdr>
+              <w:spacing w:after="120" w:before="120" w:line="240"/>
+              <w:ind w:left="120" w:right="120" w:firstLine="0" w:firstLineChars="0"/>
+              <w:rPr>
+                <w:rFonts w:ascii="Helvetica" w:hAnsi="Helvetica" w:eastAsia="Helvetica" w:cs="Helvetica"/>
+                <w:i w:val="false"/>
+                <w:b w:val="false"/>
+                <w:u w:val="none"/>
+                <w:strike w:val="false"/>
+                <w:sz w:val="20"/>
+                <w:szCs w:val="20"/>
+                <w:color w:val="000000"/>
+              </w:rPr>
             </w:pPr>
-            <w:r>
-              <w:t xml:space="preserve">7.99 ( 5.55 - 11.49 )</w:t>
+            <w:r xmlns:w="http://schemas.openxmlformats.org/wordprocessingml/2006/main" xmlns:wp="http://schemas.openxmlformats.org/drawingml/2006/wordprocessingDrawing" xmlns:r="http://schemas.openxmlformats.org/officeDocument/2006/relationships" xmlns:w14="http://schemas.microsoft.com/office/word/2010/wordml">
+              <w:rPr>
+                <w:rFonts w:ascii="Helvetica" w:hAnsi="Helvetica" w:eastAsia="Helvetica" w:cs="Helvetica"/>
+                <w:i w:val="false"/>
+                <w:b w:val="false"/>
+                <w:u w:val="none"/>
+                <w:strike w:val="false"/>
+                <w:sz w:val="20"/>
+                <w:szCs w:val="20"/>
+                <w:color w:val="000000"/>
+              </w:rPr>
+              <w:t xml:space="preserve">7.99 (5.55-11.49)</w:t>
             </w:r>
           </w:p>
         </w:tc>
       </w:tr>
       <w:tr>
+        <w:trPr>
+          <w:trHeight w:val="360" w:hRule="auto"/>
+        </w:trPr>
         <w:tc>
-          <w:tcPr/>
+          <w:tcPr>
+            <w:tcBorders>
+              <w:bottom w:val="single" w:sz="12" w:space="0" w:color="666666"/>
+              <w:top w:val="single" w:sz="6" w:space="0" w:color="666666"/>
+              <w:left w:val="none" w:sz="0" w:space="0" w:color="000000"/>
+              <w:right w:val="none" w:sz="0" w:space="0" w:color="000000"/>
+            </w:tcBorders>
+            <w:shd w:val="clear" w:color="auto" w:fill="FFFFFF"/>
+            <w:tcMar>
+              <w:top w:w="0" w:type="dxa"/>
+              <w:bottom w:w="0" w:type="dxa"/>
+              <w:left w:w="0" w:type="dxa"/>
+              <w:right w:w="0" w:type="dxa"/>
+            </w:tcMar>
+            <w:vAlign w:val="center"/>
+          </w:tcPr>
           <w:p>
             <w:pPr>
-              <w:pStyle w:val="Compact"/>
-              <w:jc w:val="left"/>
+              <w:jc w:val="right"/>
+              <w:pBdr>
+                <w:bottom w:val="none" w:sz="0" w:space="0" w:color="000000"/>
+                <w:top w:val="none" w:sz="0" w:space="0" w:color="000000"/>
+                <w:left w:val="none" w:sz="0" w:space="0" w:color="000000"/>
+                <w:right w:val="none" w:sz="0" w:space="0" w:color="000000"/>
+              </w:pBdr>
+              <w:spacing w:after="120" w:before="120" w:line="240"/>
+              <w:ind w:left="120" w:right="120" w:firstLine="0" w:firstLineChars="0"/>
+              <w:rPr>
+                <w:rFonts w:ascii="Helvetica" w:hAnsi="Helvetica" w:eastAsia="Helvetica" w:cs="Helvetica"/>
+                <w:i w:val="false"/>
+                <w:b w:val="false"/>
+                <w:u w:val="none"/>
+                <w:strike w:val="false"/>
+                <w:sz w:val="20"/>
+                <w:szCs w:val="20"/>
+                <w:color w:val="000000"/>
+              </w:rPr>
             </w:pPr>
-            <w:r>
-              <w:t xml:space="preserve">Female 65 years and over</w:t>
-            </w:r>
-          </w:p>
-        </w:tc>
-        <w:tc>
-          <w:tcPr/>
-          <w:p>
-            <w:pPr>
-              <w:pStyle w:val="Compact"/>
-              <w:jc w:val="right"/>
-            </w:pPr>
-            <w:r>
+            <w:r xmlns:w="http://schemas.openxmlformats.org/wordprocessingml/2006/main" xmlns:wp="http://schemas.openxmlformats.org/drawingml/2006/wordprocessingDrawing" xmlns:r="http://schemas.openxmlformats.org/officeDocument/2006/relationships" xmlns:w14="http://schemas.microsoft.com/office/word/2010/wordml">
+              <w:rPr>
+                <w:rFonts w:ascii="Helvetica" w:hAnsi="Helvetica" w:eastAsia="Helvetica" w:cs="Helvetica"/>
+                <w:i w:val="false"/>
+                <w:b w:val="false"/>
+                <w:u w:val="none"/>
+                <w:strike w:val="false"/>
+                <w:sz w:val="20"/>
+                <w:szCs w:val="20"/>
+                <w:color w:val="000000"/>
+              </w:rPr>
               <w:t xml:space="preserve">270</w:t>
             </w:r>
           </w:p>
         </w:tc>
         <w:tc>
-          <w:tcPr/>
+          <w:tcPr>
+            <w:tcBorders>
+              <w:bottom w:val="single" w:sz="12" w:space="0" w:color="666666"/>
+              <w:top w:val="single" w:sz="6" w:space="0" w:color="666666"/>
+              <w:left w:val="none" w:sz="0" w:space="0" w:color="000000"/>
+              <w:right w:val="none" w:sz="0" w:space="0" w:color="000000"/>
+            </w:tcBorders>
+            <w:shd w:val="clear" w:color="auto" w:fill="FFFFFF"/>
+            <w:tcMar>
+              <w:top w:w="0" w:type="dxa"/>
+              <w:bottom w:w="0" w:type="dxa"/>
+              <w:left w:w="0" w:type="dxa"/>
+              <w:right w:w="0" w:type="dxa"/>
+            </w:tcMar>
+            <w:vAlign w:val="center"/>
+          </w:tcPr>
           <w:p>
             <w:pPr>
-              <w:pStyle w:val="Compact"/>
               <w:jc w:val="right"/>
+              <w:pBdr>
+                <w:bottom w:val="none" w:sz="0" w:space="0" w:color="000000"/>
+                <w:top w:val="none" w:sz="0" w:space="0" w:color="000000"/>
+                <w:left w:val="none" w:sz="0" w:space="0" w:color="000000"/>
+                <w:right w:val="none" w:sz="0" w:space="0" w:color="000000"/>
+              </w:pBdr>
+              <w:spacing w:after="120" w:before="120" w:line="240"/>
+              <w:ind w:left="120" w:right="120" w:firstLine="0" w:firstLineChars="0"/>
+              <w:rPr>
+                <w:rFonts w:ascii="Helvetica" w:hAnsi="Helvetica" w:eastAsia="Helvetica" w:cs="Helvetica"/>
+                <w:i w:val="false"/>
+                <w:b w:val="false"/>
+                <w:u w:val="none"/>
+                <w:strike w:val="false"/>
+                <w:sz w:val="20"/>
+                <w:szCs w:val="20"/>
+                <w:color w:val="000000"/>
+              </w:rPr>
             </w:pPr>
-            <w:r>
+            <w:r xmlns:w="http://schemas.openxmlformats.org/wordprocessingml/2006/main" xmlns:wp="http://schemas.openxmlformats.org/drawingml/2006/wordprocessingDrawing" xmlns:r="http://schemas.openxmlformats.org/officeDocument/2006/relationships" xmlns:w14="http://schemas.microsoft.com/office/word/2010/wordml">
+              <w:rPr>
+                <w:rFonts w:ascii="Helvetica" w:hAnsi="Helvetica" w:eastAsia="Helvetica" w:cs="Helvetica"/>
+                <w:i w:val="false"/>
+                <w:b w:val="false"/>
+                <w:u w:val="none"/>
+                <w:strike w:val="false"/>
+                <w:sz w:val="20"/>
+                <w:szCs w:val="20"/>
+                <w:color w:val="000000"/>
+              </w:rPr>
               <w:t xml:space="preserve">-8.70</w:t>
             </w:r>
           </w:p>
         </w:tc>
         <w:tc>
-          <w:tcPr/>
+          <w:tcPr>
+            <w:tcBorders>
+              <w:bottom w:val="single" w:sz="12" w:space="0" w:color="666666"/>
+              <w:top w:val="single" w:sz="6" w:space="0" w:color="666666"/>
+              <w:left w:val="none" w:sz="0" w:space="0" w:color="000000"/>
+              <w:right w:val="none" w:sz="0" w:space="0" w:color="000000"/>
+            </w:tcBorders>
+            <w:shd w:val="clear" w:color="auto" w:fill="FFFFFF"/>
+            <w:tcMar>
+              <w:top w:w="0" w:type="dxa"/>
+              <w:bottom w:w="0" w:type="dxa"/>
+              <w:left w:w="0" w:type="dxa"/>
+              <w:right w:w="0" w:type="dxa"/>
+            </w:tcMar>
+            <w:vAlign w:val="center"/>
+          </w:tcPr>
           <w:p>
             <w:pPr>
-              <w:pStyle w:val="Compact"/>
               <w:jc w:val="right"/>
+              <w:pBdr>
+                <w:bottom w:val="none" w:sz="0" w:space="0" w:color="000000"/>
+                <w:top w:val="none" w:sz="0" w:space="0" w:color="000000"/>
+                <w:left w:val="none" w:sz="0" w:space="0" w:color="000000"/>
+                <w:right w:val="none" w:sz="0" w:space="0" w:color="000000"/>
+              </w:pBdr>
+              <w:spacing w:after="120" w:before="120" w:line="240"/>
+              <w:ind w:left="120" w:right="120" w:firstLine="0" w:firstLineChars="0"/>
+              <w:rPr>
+                <w:rFonts w:ascii="Helvetica" w:hAnsi="Helvetica" w:eastAsia="Helvetica" w:cs="Helvetica"/>
+                <w:i w:val="false"/>
+                <w:b w:val="false"/>
+                <w:u w:val="none"/>
+                <w:strike w:val="false"/>
+                <w:sz w:val="20"/>
+                <w:szCs w:val="20"/>
+                <w:color w:val="000000"/>
+              </w:rPr>
             </w:pPr>
-            <w:r>
+            <w:r xmlns:w="http://schemas.openxmlformats.org/wordprocessingml/2006/main" xmlns:wp="http://schemas.openxmlformats.org/drawingml/2006/wordprocessingDrawing" xmlns:r="http://schemas.openxmlformats.org/officeDocument/2006/relationships" xmlns:w14="http://schemas.microsoft.com/office/word/2010/wordml">
+              <w:rPr>
+                <w:rFonts w:ascii="Helvetica" w:hAnsi="Helvetica" w:eastAsia="Helvetica" w:cs="Helvetica"/>
+                <w:i w:val="false"/>
+                <w:b w:val="false"/>
+                <w:u w:val="none"/>
+                <w:strike w:val="false"/>
+                <w:sz w:val="20"/>
+                <w:szCs w:val="20"/>
+                <w:color w:val="000000"/>
+              </w:rPr>
               <w:t xml:space="preserve">0.16</w:t>
             </w:r>
           </w:p>
         </w:tc>
         <w:tc>
-          <w:tcPr/>
+          <w:tcPr>
+            <w:tcBorders>
+              <w:bottom w:val="single" w:sz="12" w:space="0" w:color="666666"/>
+              <w:top w:val="single" w:sz="6" w:space="0" w:color="666666"/>
+              <w:left w:val="none" w:sz="0" w:space="0" w:color="000000"/>
+              <w:right w:val="none" w:sz="0" w:space="0" w:color="000000"/>
+            </w:tcBorders>
+            <w:shd w:val="clear" w:color="auto" w:fill="FFFFFF"/>
+            <w:tcMar>
+              <w:top w:w="0" w:type="dxa"/>
+              <w:bottom w:w="0" w:type="dxa"/>
+              <w:left w:w="0" w:type="dxa"/>
+              <w:right w:w="0" w:type="dxa"/>
+            </w:tcMar>
+            <w:vAlign w:val="center"/>
+          </w:tcPr>
           <w:p>
             <w:pPr>
-              <w:pStyle w:val="Compact"/>
               <w:jc w:val="left"/>
+              <w:pBdr>
+                <w:bottom w:val="none" w:sz="0" w:space="0" w:color="000000"/>
+                <w:top w:val="none" w:sz="0" w:space="0" w:color="000000"/>
+                <w:left w:val="none" w:sz="0" w:space="0" w:color="000000"/>
+                <w:right w:val="none" w:sz="0" w:space="0" w:color="000000"/>
+              </w:pBdr>
+              <w:spacing w:after="120" w:before="120" w:line="240"/>
+              <w:ind w:left="120" w:right="120" w:firstLine="0" w:firstLineChars="0"/>
+              <w:rPr>
+                <w:rFonts w:ascii="Helvetica" w:hAnsi="Helvetica" w:eastAsia="Helvetica" w:cs="Helvetica"/>
+                <w:i w:val="false"/>
+                <w:b w:val="false"/>
+                <w:u w:val="none"/>
+                <w:strike w:val="false"/>
+                <w:sz w:val="20"/>
+                <w:szCs w:val="20"/>
+                <w:color w:val="000000"/>
+              </w:rPr>
             </w:pPr>
-            <w:r>
-              <w:t xml:space="preserve">6.07 ( 4.4 - 8.38 )</w:t>
+            <w:r xmlns:w="http://schemas.openxmlformats.org/wordprocessingml/2006/main" xmlns:wp="http://schemas.openxmlformats.org/drawingml/2006/wordprocessingDrawing" xmlns:r="http://schemas.openxmlformats.org/officeDocument/2006/relationships" xmlns:w14="http://schemas.microsoft.com/office/word/2010/wordml">
+              <w:rPr>
+                <w:rFonts w:ascii="Helvetica" w:hAnsi="Helvetica" w:eastAsia="Helvetica" w:cs="Helvetica"/>
+                <w:i w:val="false"/>
+                <w:b w:val="false"/>
+                <w:u w:val="none"/>
+                <w:strike w:val="false"/>
+                <w:sz w:val="20"/>
+                <w:szCs w:val="20"/>
+                <w:color w:val="000000"/>
+              </w:rPr>
+              <w:t xml:space="preserve">6.07 (4.4-8.38)</w:t>
             </w:r>
           </w:p>
         </w:tc>
@@ -2413,262 +3902,848 @@
         </m:sSub>
       </m:oMath>
     </w:p>
-    <w:tbl>
+    <w:tbl xmlns:w="http://schemas.openxmlformats.org/wordprocessingml/2006/main" xmlns:r="http://schemas.openxmlformats.org/officeDocument/2006/relationships" xmlns:w14="http://schemas.microsoft.com/office/word/2010/wordml" xmlns:wp="http://schemas.openxmlformats.org/drawingml/2006/wordprocessingDrawing" xmlns:a="http://schemas.openxmlformats.org/drawingml/2006/main" xmlns:pic="http://schemas.openxmlformats.org/drawingml/2006/picture">
       <w:tblPr>
-        <w:tblStyle w:val="Table"/>
-        <w:tblW w:type="auto" w:w="0"/>
-        <w:tblLook w:firstRow="1" w:lastRow="0" w:firstColumn="0" w:lastColumn="0" w:noHBand="0" w:noVBand="0" w:val="0020"/>
+        <w:tblLayout w:type="fixed"/>
+        <w:jc w:val="center"/>
+        <w:tblLook w:firstRow="1" w:lastRow="0" w:firstColumn="0" w:lastColumn="0" w:noHBand="0" w:noVBand="1"/>
       </w:tblPr>
       <w:tblGrid>
-        <w:gridCol w:w="1980"/>
-        <w:gridCol w:w="1980"/>
-        <w:gridCol w:w="1980"/>
-        <w:gridCol w:w="1980"/>
+        <w:gridCol w:w="1476"/>
+        <w:gridCol w:w="1165"/>
+        <w:gridCol w:w="1153"/>
       </w:tblGrid>
       <w:tr>
         <w:trPr>
-          <w:tblHeader w:val="on"/>
+          <w:trHeight w:val="360" w:hRule="auto"/>
+          <w:tblHeader/>
         </w:trPr>
         <w:tc>
-          <w:tcPr/>
+          <w:tcPr>
+            <w:tcBorders>
+              <w:bottom w:val="single" w:sz="12" w:space="0" w:color="666666"/>
+              <w:top w:val="single" w:sz="12" w:space="0" w:color="666666"/>
+              <w:left w:val="none" w:sz="0" w:space="0" w:color="000000"/>
+              <w:right w:val="none" w:sz="0" w:space="0" w:color="000000"/>
+            </w:tcBorders>
+            <w:shd w:val="clear" w:color="auto" w:fill="FFFFFF"/>
+            <w:tcMar>
+              <w:top w:w="0" w:type="dxa"/>
+              <w:bottom w:w="0" w:type="dxa"/>
+              <w:left w:w="0" w:type="dxa"/>
+              <w:right w:w="0" w:type="dxa"/>
+            </w:tcMar>
+            <w:vAlign w:val="center"/>
+          </w:tcPr>
           <w:p>
             <w:pPr>
-              <w:pStyle w:val="Compact"/>
+              <w:jc w:val="right"/>
+              <w:pBdr>
+                <w:bottom w:val="none" w:sz="0" w:space="0" w:color="000000"/>
+                <w:top w:val="none" w:sz="0" w:space="0" w:color="000000"/>
+                <w:left w:val="none" w:sz="0" w:space="0" w:color="000000"/>
+                <w:right w:val="none" w:sz="0" w:space="0" w:color="000000"/>
+              </w:pBdr>
+              <w:spacing w:after="120" w:before="120" w:line="240"/>
+              <w:ind w:left="120" w:right="120" w:firstLine="0" w:firstLineChars="0"/>
+              <w:rPr>
+                <w:rFonts w:ascii="Helvetica" w:hAnsi="Helvetica" w:eastAsia="Helvetica" w:cs="Helvetica"/>
+                <w:i w:val="false"/>
+                <w:b w:val="true"/>
+                <w:u w:val="none"/>
+                <w:strike w:val="false"/>
+                <w:sz w:val="20"/>
+                <w:szCs w:val="20"/>
+                <w:color w:val="000000"/>
+              </w:rPr>
             </w:pPr>
-          </w:p>
-        </w:tc>
-        <w:tc>
-          <w:tcPr/>
-          <w:p>
-            <w:pPr>
-              <w:pStyle w:val="Compact"/>
-              <w:jc w:val="right"/>
-            </w:pPr>
-            <w:r>
+            <w:r xmlns:w="http://schemas.openxmlformats.org/wordprocessingml/2006/main" xmlns:wp="http://schemas.openxmlformats.org/drawingml/2006/wordprocessingDrawing" xmlns:r="http://schemas.openxmlformats.org/officeDocument/2006/relationships" xmlns:w14="http://schemas.microsoft.com/office/word/2010/wordml">
+              <w:rPr>
+                <w:rFonts w:ascii="Helvetica" w:hAnsi="Helvetica" w:eastAsia="Helvetica" w:cs="Helvetica"/>
+                <w:i w:val="false"/>
+                <w:b w:val="true"/>
+                <w:u w:val="none"/>
+                <w:strike w:val="false"/>
+                <w:sz w:val="20"/>
+                <w:szCs w:val="20"/>
+                <w:color w:val="000000"/>
+              </w:rPr>
               <w:t xml:space="preserve">Hazard ratio</w:t>
             </w:r>
           </w:p>
         </w:tc>
         <w:tc>
-          <w:tcPr/>
+          <w:tcPr>
+            <w:tcBorders>
+              <w:bottom w:val="single" w:sz="12" w:space="0" w:color="666666"/>
+              <w:top w:val="single" w:sz="12" w:space="0" w:color="666666"/>
+              <w:left w:val="none" w:sz="0" w:space="0" w:color="000000"/>
+              <w:right w:val="none" w:sz="0" w:space="0" w:color="000000"/>
+            </w:tcBorders>
+            <w:shd w:val="clear" w:color="auto" w:fill="FFFFFF"/>
+            <w:tcMar>
+              <w:top w:w="0" w:type="dxa"/>
+              <w:bottom w:w="0" w:type="dxa"/>
+              <w:left w:w="0" w:type="dxa"/>
+              <w:right w:w="0" w:type="dxa"/>
+            </w:tcMar>
+            <w:vAlign w:val="center"/>
+          </w:tcPr>
           <w:p>
             <w:pPr>
-              <w:pStyle w:val="Compact"/>
               <w:jc w:val="right"/>
+              <w:pBdr>
+                <w:bottom w:val="none" w:sz="0" w:space="0" w:color="000000"/>
+                <w:top w:val="none" w:sz="0" w:space="0" w:color="000000"/>
+                <w:left w:val="none" w:sz="0" w:space="0" w:color="000000"/>
+                <w:right w:val="none" w:sz="0" w:space="0" w:color="000000"/>
+              </w:pBdr>
+              <w:spacing w:after="120" w:before="120" w:line="240"/>
+              <w:ind w:left="120" w:right="120" w:firstLine="0" w:firstLineChars="0"/>
+              <w:rPr>
+                <w:rFonts w:ascii="Helvetica" w:hAnsi="Helvetica" w:eastAsia="Helvetica" w:cs="Helvetica"/>
+                <w:i w:val="false"/>
+                <w:b w:val="true"/>
+                <w:u w:val="none"/>
+                <w:strike w:val="false"/>
+                <w:sz w:val="20"/>
+                <w:szCs w:val="20"/>
+                <w:color w:val="000000"/>
+              </w:rPr>
             </w:pPr>
-            <w:r>
+            <w:r xmlns:w="http://schemas.openxmlformats.org/wordprocessingml/2006/main" xmlns:wp="http://schemas.openxmlformats.org/drawingml/2006/wordprocessingDrawing" xmlns:r="http://schemas.openxmlformats.org/officeDocument/2006/relationships" xmlns:w14="http://schemas.microsoft.com/office/word/2010/wordml">
+              <w:rPr>
+                <w:rFonts w:ascii="Helvetica" w:hAnsi="Helvetica" w:eastAsia="Helvetica" w:cs="Helvetica"/>
+                <w:i w:val="false"/>
+                <w:b w:val="true"/>
+                <w:u w:val="none"/>
+                <w:strike w:val="false"/>
+                <w:sz w:val="20"/>
+                <w:szCs w:val="20"/>
+                <w:color w:val="000000"/>
+              </w:rPr>
               <w:t xml:space="preserve">Lower CI</w:t>
             </w:r>
           </w:p>
         </w:tc>
         <w:tc>
-          <w:tcPr/>
+          <w:tcPr>
+            <w:tcBorders>
+              <w:bottom w:val="single" w:sz="12" w:space="0" w:color="666666"/>
+              <w:top w:val="single" w:sz="12" w:space="0" w:color="666666"/>
+              <w:left w:val="none" w:sz="0" w:space="0" w:color="000000"/>
+              <w:right w:val="none" w:sz="0" w:space="0" w:color="000000"/>
+            </w:tcBorders>
+            <w:shd w:val="clear" w:color="auto" w:fill="FFFFFF"/>
+            <w:tcMar>
+              <w:top w:w="0" w:type="dxa"/>
+              <w:bottom w:w="0" w:type="dxa"/>
+              <w:left w:w="0" w:type="dxa"/>
+              <w:right w:w="0" w:type="dxa"/>
+            </w:tcMar>
+            <w:vAlign w:val="center"/>
+          </w:tcPr>
           <w:p>
             <w:pPr>
-              <w:pStyle w:val="Compact"/>
               <w:jc w:val="right"/>
+              <w:pBdr>
+                <w:bottom w:val="none" w:sz="0" w:space="0" w:color="000000"/>
+                <w:top w:val="none" w:sz="0" w:space="0" w:color="000000"/>
+                <w:left w:val="none" w:sz="0" w:space="0" w:color="000000"/>
+                <w:right w:val="none" w:sz="0" w:space="0" w:color="000000"/>
+              </w:pBdr>
+              <w:spacing w:after="120" w:before="120" w:line="240"/>
+              <w:ind w:left="120" w:right="120" w:firstLine="0" w:firstLineChars="0"/>
+              <w:rPr>
+                <w:rFonts w:ascii="Helvetica" w:hAnsi="Helvetica" w:eastAsia="Helvetica" w:cs="Helvetica"/>
+                <w:i w:val="false"/>
+                <w:b w:val="true"/>
+                <w:u w:val="none"/>
+                <w:strike w:val="false"/>
+                <w:sz w:val="20"/>
+                <w:szCs w:val="20"/>
+                <w:color w:val="000000"/>
+              </w:rPr>
             </w:pPr>
-            <w:r>
+            <w:r xmlns:w="http://schemas.openxmlformats.org/wordprocessingml/2006/main" xmlns:wp="http://schemas.openxmlformats.org/drawingml/2006/wordprocessingDrawing" xmlns:r="http://schemas.openxmlformats.org/officeDocument/2006/relationships" xmlns:w14="http://schemas.microsoft.com/office/word/2010/wordml">
+              <w:rPr>
+                <w:rFonts w:ascii="Helvetica" w:hAnsi="Helvetica" w:eastAsia="Helvetica" w:cs="Helvetica"/>
+                <w:i w:val="false"/>
+                <w:b w:val="true"/>
+                <w:u w:val="none"/>
+                <w:strike w:val="false"/>
+                <w:sz w:val="20"/>
+                <w:szCs w:val="20"/>
+                <w:color w:val="000000"/>
+              </w:rPr>
               <w:t xml:space="preserve">Upper CI</w:t>
             </w:r>
           </w:p>
         </w:tc>
       </w:tr>
       <w:tr>
+        <w:trPr>
+          <w:trHeight w:val="360" w:hRule="auto"/>
+        </w:trPr>
         <w:tc>
-          <w:tcPr/>
+          <w:tcPr>
+            <w:tcBorders>
+              <w:bottom w:val="single" w:sz="6" w:space="0" w:color="666666"/>
+              <w:top w:val="single" w:sz="12" w:space="0" w:color="666666"/>
+              <w:left w:val="none" w:sz="0" w:space="0" w:color="000000"/>
+              <w:right w:val="none" w:sz="0" w:space="0" w:color="000000"/>
+            </w:tcBorders>
+            <w:shd w:val="clear" w:color="auto" w:fill="FFFFFF"/>
+            <w:tcMar>
+              <w:top w:w="0" w:type="dxa"/>
+              <w:bottom w:w="0" w:type="dxa"/>
+              <w:left w:w="0" w:type="dxa"/>
+              <w:right w:w="0" w:type="dxa"/>
+            </w:tcMar>
+            <w:vAlign w:val="center"/>
+          </w:tcPr>
           <w:p>
             <w:pPr>
-              <w:pStyle w:val="Compact"/>
-              <w:jc w:val="left"/>
+              <w:jc w:val="right"/>
+              <w:pBdr>
+                <w:bottom w:val="none" w:sz="0" w:space="0" w:color="000000"/>
+                <w:top w:val="none" w:sz="0" w:space="0" w:color="000000"/>
+                <w:left w:val="none" w:sz="0" w:space="0" w:color="000000"/>
+                <w:right w:val="none" w:sz="0" w:space="0" w:color="000000"/>
+              </w:pBdr>
+              <w:spacing w:after="120" w:before="120" w:line="240"/>
+              <w:ind w:left="120" w:right="120" w:firstLine="0" w:firstLineChars="0"/>
+              <w:rPr>
+                <w:rFonts w:ascii="Helvetica" w:hAnsi="Helvetica" w:eastAsia="Helvetica" w:cs="Helvetica"/>
+                <w:i w:val="false"/>
+                <w:b w:val="false"/>
+                <w:u w:val="none"/>
+                <w:strike w:val="false"/>
+                <w:sz w:val="20"/>
+                <w:szCs w:val="20"/>
+                <w:color w:val="000000"/>
+              </w:rPr>
             </w:pPr>
-            <w:r>
-              <w:t xml:space="preserve">Male &lt;65 years</w:t>
-            </w:r>
-          </w:p>
-        </w:tc>
-        <w:tc>
-          <w:tcPr/>
-          <w:p>
-            <w:pPr>
-              <w:pStyle w:val="Compact"/>
-              <w:jc w:val="right"/>
-            </w:pPr>
-            <w:r>
+            <w:r xmlns:w="http://schemas.openxmlformats.org/wordprocessingml/2006/main" xmlns:wp="http://schemas.openxmlformats.org/drawingml/2006/wordprocessingDrawing" xmlns:r="http://schemas.openxmlformats.org/officeDocument/2006/relationships" xmlns:w14="http://schemas.microsoft.com/office/word/2010/wordml">
+              <w:rPr>
+                <w:rFonts w:ascii="Helvetica" w:hAnsi="Helvetica" w:eastAsia="Helvetica" w:cs="Helvetica"/>
+                <w:i w:val="false"/>
+                <w:b w:val="false"/>
+                <w:u w:val="none"/>
+                <w:strike w:val="false"/>
+                <w:sz w:val="20"/>
+                <w:szCs w:val="20"/>
+                <w:color w:val="000000"/>
+              </w:rPr>
               <w:t xml:space="preserve">0.82</w:t>
             </w:r>
           </w:p>
         </w:tc>
         <w:tc>
-          <w:tcPr/>
+          <w:tcPr>
+            <w:tcBorders>
+              <w:bottom w:val="single" w:sz="6" w:space="0" w:color="666666"/>
+              <w:top w:val="single" w:sz="12" w:space="0" w:color="666666"/>
+              <w:left w:val="none" w:sz="0" w:space="0" w:color="000000"/>
+              <w:right w:val="none" w:sz="0" w:space="0" w:color="000000"/>
+            </w:tcBorders>
+            <w:shd w:val="clear" w:color="auto" w:fill="FFFFFF"/>
+            <w:tcMar>
+              <w:top w:w="0" w:type="dxa"/>
+              <w:bottom w:w="0" w:type="dxa"/>
+              <w:left w:w="0" w:type="dxa"/>
+              <w:right w:w="0" w:type="dxa"/>
+            </w:tcMar>
+            <w:vAlign w:val="center"/>
+          </w:tcPr>
           <w:p>
             <w:pPr>
-              <w:pStyle w:val="Compact"/>
               <w:jc w:val="right"/>
+              <w:pBdr>
+                <w:bottom w:val="none" w:sz="0" w:space="0" w:color="000000"/>
+                <w:top w:val="none" w:sz="0" w:space="0" w:color="000000"/>
+                <w:left w:val="none" w:sz="0" w:space="0" w:color="000000"/>
+                <w:right w:val="none" w:sz="0" w:space="0" w:color="000000"/>
+              </w:pBdr>
+              <w:spacing w:after="120" w:before="120" w:line="240"/>
+              <w:ind w:left="120" w:right="120" w:firstLine="0" w:firstLineChars="0"/>
+              <w:rPr>
+                <w:rFonts w:ascii="Helvetica" w:hAnsi="Helvetica" w:eastAsia="Helvetica" w:cs="Helvetica"/>
+                <w:i w:val="false"/>
+                <w:b w:val="false"/>
+                <w:u w:val="none"/>
+                <w:strike w:val="false"/>
+                <w:sz w:val="20"/>
+                <w:szCs w:val="20"/>
+                <w:color w:val="000000"/>
+              </w:rPr>
             </w:pPr>
-            <w:r>
+            <w:r xmlns:w="http://schemas.openxmlformats.org/wordprocessingml/2006/main" xmlns:wp="http://schemas.openxmlformats.org/drawingml/2006/wordprocessingDrawing" xmlns:r="http://schemas.openxmlformats.org/officeDocument/2006/relationships" xmlns:w14="http://schemas.microsoft.com/office/word/2010/wordml">
+              <w:rPr>
+                <w:rFonts w:ascii="Helvetica" w:hAnsi="Helvetica" w:eastAsia="Helvetica" w:cs="Helvetica"/>
+                <w:i w:val="false"/>
+                <w:b w:val="false"/>
+                <w:u w:val="none"/>
+                <w:strike w:val="false"/>
+                <w:sz w:val="20"/>
+                <w:szCs w:val="20"/>
+                <w:color w:val="000000"/>
+              </w:rPr>
               <w:t xml:space="preserve">0.68</w:t>
             </w:r>
           </w:p>
         </w:tc>
         <w:tc>
-          <w:tcPr/>
+          <w:tcPr>
+            <w:tcBorders>
+              <w:bottom w:val="single" w:sz="6" w:space="0" w:color="666666"/>
+              <w:top w:val="single" w:sz="12" w:space="0" w:color="666666"/>
+              <w:left w:val="none" w:sz="0" w:space="0" w:color="000000"/>
+              <w:right w:val="none" w:sz="0" w:space="0" w:color="000000"/>
+            </w:tcBorders>
+            <w:shd w:val="clear" w:color="auto" w:fill="FFFFFF"/>
+            <w:tcMar>
+              <w:top w:w="0" w:type="dxa"/>
+              <w:bottom w:w="0" w:type="dxa"/>
+              <w:left w:w="0" w:type="dxa"/>
+              <w:right w:w="0" w:type="dxa"/>
+            </w:tcMar>
+            <w:vAlign w:val="center"/>
+          </w:tcPr>
           <w:p>
             <w:pPr>
-              <w:pStyle w:val="Compact"/>
               <w:jc w:val="right"/>
+              <w:pBdr>
+                <w:bottom w:val="none" w:sz="0" w:space="0" w:color="000000"/>
+                <w:top w:val="none" w:sz="0" w:space="0" w:color="000000"/>
+                <w:left w:val="none" w:sz="0" w:space="0" w:color="000000"/>
+                <w:right w:val="none" w:sz="0" w:space="0" w:color="000000"/>
+              </w:pBdr>
+              <w:spacing w:after="120" w:before="120" w:line="240"/>
+              <w:ind w:left="120" w:right="120" w:firstLine="0" w:firstLineChars="0"/>
+              <w:rPr>
+                <w:rFonts w:ascii="Helvetica" w:hAnsi="Helvetica" w:eastAsia="Helvetica" w:cs="Helvetica"/>
+                <w:i w:val="false"/>
+                <w:b w:val="false"/>
+                <w:u w:val="none"/>
+                <w:strike w:val="false"/>
+                <w:sz w:val="20"/>
+                <w:szCs w:val="20"/>
+                <w:color w:val="000000"/>
+              </w:rPr>
             </w:pPr>
-            <w:r>
+            <w:r xmlns:w="http://schemas.openxmlformats.org/wordprocessingml/2006/main" xmlns:wp="http://schemas.openxmlformats.org/drawingml/2006/wordprocessingDrawing" xmlns:r="http://schemas.openxmlformats.org/officeDocument/2006/relationships" xmlns:w14="http://schemas.microsoft.com/office/word/2010/wordml">
+              <w:rPr>
+                <w:rFonts w:ascii="Helvetica" w:hAnsi="Helvetica" w:eastAsia="Helvetica" w:cs="Helvetica"/>
+                <w:i w:val="false"/>
+                <w:b w:val="false"/>
+                <w:u w:val="none"/>
+                <w:strike w:val="false"/>
+                <w:sz w:val="20"/>
+                <w:szCs w:val="20"/>
+                <w:color w:val="000000"/>
+              </w:rPr>
               <w:t xml:space="preserve">1.22</w:t>
             </w:r>
           </w:p>
         </w:tc>
       </w:tr>
       <w:tr>
+        <w:trPr>
+          <w:trHeight w:val="360" w:hRule="auto"/>
+        </w:trPr>
         <w:tc>
-          <w:tcPr/>
+          <w:tcPr>
+            <w:tcBorders>
+              <w:bottom w:val="single" w:sz="6" w:space="0" w:color="666666"/>
+              <w:top w:val="single" w:sz="6" w:space="0" w:color="666666"/>
+              <w:left w:val="none" w:sz="0" w:space="0" w:color="000000"/>
+              <w:right w:val="none" w:sz="0" w:space="0" w:color="000000"/>
+            </w:tcBorders>
+            <w:shd w:val="clear" w:color="auto" w:fill="FFFFFF"/>
+            <w:tcMar>
+              <w:top w:w="0" w:type="dxa"/>
+              <w:bottom w:w="0" w:type="dxa"/>
+              <w:left w:w="0" w:type="dxa"/>
+              <w:right w:w="0" w:type="dxa"/>
+            </w:tcMar>
+            <w:vAlign w:val="center"/>
+          </w:tcPr>
           <w:p>
             <w:pPr>
-              <w:pStyle w:val="Compact"/>
-              <w:jc w:val="left"/>
+              <w:jc w:val="right"/>
+              <w:pBdr>
+                <w:bottom w:val="none" w:sz="0" w:space="0" w:color="000000"/>
+                <w:top w:val="none" w:sz="0" w:space="0" w:color="000000"/>
+                <w:left w:val="none" w:sz="0" w:space="0" w:color="000000"/>
+                <w:right w:val="none" w:sz="0" w:space="0" w:color="000000"/>
+              </w:pBdr>
+              <w:spacing w:after="120" w:before="120" w:line="240"/>
+              <w:ind w:left="120" w:right="120" w:firstLine="0" w:firstLineChars="0"/>
+              <w:rPr>
+                <w:rFonts w:ascii="Helvetica" w:hAnsi="Helvetica" w:eastAsia="Helvetica" w:cs="Helvetica"/>
+                <w:i w:val="false"/>
+                <w:b w:val="false"/>
+                <w:u w:val="none"/>
+                <w:strike w:val="false"/>
+                <w:sz w:val="20"/>
+                <w:szCs w:val="20"/>
+                <w:color w:val="000000"/>
+              </w:rPr>
             </w:pPr>
-            <w:r>
-              <w:t xml:space="preserve">Female &lt;65 years</w:t>
-            </w:r>
-          </w:p>
-        </w:tc>
-        <w:tc>
-          <w:tcPr/>
-          <w:p>
-            <w:pPr>
-              <w:pStyle w:val="Compact"/>
-              <w:jc w:val="right"/>
-            </w:pPr>
-            <w:r>
+            <w:r xmlns:w="http://schemas.openxmlformats.org/wordprocessingml/2006/main" xmlns:wp="http://schemas.openxmlformats.org/drawingml/2006/wordprocessingDrawing" xmlns:r="http://schemas.openxmlformats.org/officeDocument/2006/relationships" xmlns:w14="http://schemas.microsoft.com/office/word/2010/wordml">
+              <w:rPr>
+                <w:rFonts w:ascii="Helvetica" w:hAnsi="Helvetica" w:eastAsia="Helvetica" w:cs="Helvetica"/>
+                <w:i w:val="false"/>
+                <w:b w:val="false"/>
+                <w:u w:val="none"/>
+                <w:strike w:val="false"/>
+                <w:sz w:val="20"/>
+                <w:szCs w:val="20"/>
+                <w:color w:val="000000"/>
+              </w:rPr>
               <w:t xml:space="preserve">0.87</w:t>
             </w:r>
           </w:p>
         </w:tc>
         <w:tc>
-          <w:tcPr/>
+          <w:tcPr>
+            <w:tcBorders>
+              <w:bottom w:val="single" w:sz="6" w:space="0" w:color="666666"/>
+              <w:top w:val="single" w:sz="6" w:space="0" w:color="666666"/>
+              <w:left w:val="none" w:sz="0" w:space="0" w:color="000000"/>
+              <w:right w:val="none" w:sz="0" w:space="0" w:color="000000"/>
+            </w:tcBorders>
+            <w:shd w:val="clear" w:color="auto" w:fill="FFFFFF"/>
+            <w:tcMar>
+              <w:top w:w="0" w:type="dxa"/>
+              <w:bottom w:w="0" w:type="dxa"/>
+              <w:left w:w="0" w:type="dxa"/>
+              <w:right w:w="0" w:type="dxa"/>
+            </w:tcMar>
+            <w:vAlign w:val="center"/>
+          </w:tcPr>
           <w:p>
             <w:pPr>
-              <w:pStyle w:val="Compact"/>
               <w:jc w:val="right"/>
+              <w:pBdr>
+                <w:bottom w:val="none" w:sz="0" w:space="0" w:color="000000"/>
+                <w:top w:val="none" w:sz="0" w:space="0" w:color="000000"/>
+                <w:left w:val="none" w:sz="0" w:space="0" w:color="000000"/>
+                <w:right w:val="none" w:sz="0" w:space="0" w:color="000000"/>
+              </w:pBdr>
+              <w:spacing w:after="120" w:before="120" w:line="240"/>
+              <w:ind w:left="120" w:right="120" w:firstLine="0" w:firstLineChars="0"/>
+              <w:rPr>
+                <w:rFonts w:ascii="Helvetica" w:hAnsi="Helvetica" w:eastAsia="Helvetica" w:cs="Helvetica"/>
+                <w:i w:val="false"/>
+                <w:b w:val="false"/>
+                <w:u w:val="none"/>
+                <w:strike w:val="false"/>
+                <w:sz w:val="20"/>
+                <w:szCs w:val="20"/>
+                <w:color w:val="000000"/>
+              </w:rPr>
             </w:pPr>
-            <w:r>
+            <w:r xmlns:w="http://schemas.openxmlformats.org/wordprocessingml/2006/main" xmlns:wp="http://schemas.openxmlformats.org/drawingml/2006/wordprocessingDrawing" xmlns:r="http://schemas.openxmlformats.org/officeDocument/2006/relationships" xmlns:w14="http://schemas.microsoft.com/office/word/2010/wordml">
+              <w:rPr>
+                <w:rFonts w:ascii="Helvetica" w:hAnsi="Helvetica" w:eastAsia="Helvetica" w:cs="Helvetica"/>
+                <w:i w:val="false"/>
+                <w:b w:val="false"/>
+                <w:u w:val="none"/>
+                <w:strike w:val="false"/>
+                <w:sz w:val="20"/>
+                <w:szCs w:val="20"/>
+                <w:color w:val="000000"/>
+              </w:rPr>
               <w:t xml:space="preserve">0.75</w:t>
             </w:r>
           </w:p>
         </w:tc>
         <w:tc>
-          <w:tcPr/>
+          <w:tcPr>
+            <w:tcBorders>
+              <w:bottom w:val="single" w:sz="6" w:space="0" w:color="666666"/>
+              <w:top w:val="single" w:sz="6" w:space="0" w:color="666666"/>
+              <w:left w:val="none" w:sz="0" w:space="0" w:color="000000"/>
+              <w:right w:val="none" w:sz="0" w:space="0" w:color="000000"/>
+            </w:tcBorders>
+            <w:shd w:val="clear" w:color="auto" w:fill="FFFFFF"/>
+            <w:tcMar>
+              <w:top w:w="0" w:type="dxa"/>
+              <w:bottom w:w="0" w:type="dxa"/>
+              <w:left w:w="0" w:type="dxa"/>
+              <w:right w:w="0" w:type="dxa"/>
+            </w:tcMar>
+            <w:vAlign w:val="center"/>
+          </w:tcPr>
           <w:p>
             <w:pPr>
-              <w:pStyle w:val="Compact"/>
               <w:jc w:val="right"/>
+              <w:pBdr>
+                <w:bottom w:val="none" w:sz="0" w:space="0" w:color="000000"/>
+                <w:top w:val="none" w:sz="0" w:space="0" w:color="000000"/>
+                <w:left w:val="none" w:sz="0" w:space="0" w:color="000000"/>
+                <w:right w:val="none" w:sz="0" w:space="0" w:color="000000"/>
+              </w:pBdr>
+              <w:spacing w:after="120" w:before="120" w:line="240"/>
+              <w:ind w:left="120" w:right="120" w:firstLine="0" w:firstLineChars="0"/>
+              <w:rPr>
+                <w:rFonts w:ascii="Helvetica" w:hAnsi="Helvetica" w:eastAsia="Helvetica" w:cs="Helvetica"/>
+                <w:i w:val="false"/>
+                <w:b w:val="false"/>
+                <w:u w:val="none"/>
+                <w:strike w:val="false"/>
+                <w:sz w:val="20"/>
+                <w:szCs w:val="20"/>
+                <w:color w:val="000000"/>
+              </w:rPr>
             </w:pPr>
-            <w:r>
+            <w:r xmlns:w="http://schemas.openxmlformats.org/wordprocessingml/2006/main" xmlns:wp="http://schemas.openxmlformats.org/drawingml/2006/wordprocessingDrawing" xmlns:r="http://schemas.openxmlformats.org/officeDocument/2006/relationships" xmlns:w14="http://schemas.microsoft.com/office/word/2010/wordml">
+              <w:rPr>
+                <w:rFonts w:ascii="Helvetica" w:hAnsi="Helvetica" w:eastAsia="Helvetica" w:cs="Helvetica"/>
+                <w:i w:val="false"/>
+                <w:b w:val="false"/>
+                <w:u w:val="none"/>
+                <w:strike w:val="false"/>
+                <w:sz w:val="20"/>
+                <w:szCs w:val="20"/>
+                <w:color w:val="000000"/>
+              </w:rPr>
               <w:t xml:space="preserve">1.27</w:t>
             </w:r>
           </w:p>
         </w:tc>
       </w:tr>
       <w:tr>
+        <w:trPr>
+          <w:trHeight w:val="360" w:hRule="auto"/>
+        </w:trPr>
         <w:tc>
-          <w:tcPr/>
+          <w:tcPr>
+            <w:tcBorders>
+              <w:bottom w:val="single" w:sz="6" w:space="0" w:color="666666"/>
+              <w:top w:val="single" w:sz="6" w:space="0" w:color="666666"/>
+              <w:left w:val="none" w:sz="0" w:space="0" w:color="000000"/>
+              <w:right w:val="none" w:sz="0" w:space="0" w:color="000000"/>
+            </w:tcBorders>
+            <w:shd w:val="clear" w:color="auto" w:fill="FFFFFF"/>
+            <w:tcMar>
+              <w:top w:w="0" w:type="dxa"/>
+              <w:bottom w:w="0" w:type="dxa"/>
+              <w:left w:w="0" w:type="dxa"/>
+              <w:right w:w="0" w:type="dxa"/>
+            </w:tcMar>
+            <w:vAlign w:val="center"/>
+          </w:tcPr>
           <w:p>
             <w:pPr>
-              <w:pStyle w:val="Compact"/>
-              <w:jc w:val="left"/>
+              <w:jc w:val="right"/>
+              <w:pBdr>
+                <w:bottom w:val="none" w:sz="0" w:space="0" w:color="000000"/>
+                <w:top w:val="none" w:sz="0" w:space="0" w:color="000000"/>
+                <w:left w:val="none" w:sz="0" w:space="0" w:color="000000"/>
+                <w:right w:val="none" w:sz="0" w:space="0" w:color="000000"/>
+              </w:pBdr>
+              <w:spacing w:after="120" w:before="120" w:line="240"/>
+              <w:ind w:left="120" w:right="120" w:firstLine="0" w:firstLineChars="0"/>
+              <w:rPr>
+                <w:rFonts w:ascii="Helvetica" w:hAnsi="Helvetica" w:eastAsia="Helvetica" w:cs="Helvetica"/>
+                <w:i w:val="false"/>
+                <w:b w:val="false"/>
+                <w:u w:val="none"/>
+                <w:strike w:val="false"/>
+                <w:sz w:val="20"/>
+                <w:szCs w:val="20"/>
+                <w:color w:val="000000"/>
+              </w:rPr>
             </w:pPr>
-            <w:r>
-              <w:t xml:space="preserve">Male 65 years and over</w:t>
-            </w:r>
-          </w:p>
-        </w:tc>
-        <w:tc>
-          <w:tcPr/>
-          <w:p>
-            <w:pPr>
-              <w:pStyle w:val="Compact"/>
-              <w:jc w:val="right"/>
-            </w:pPr>
-            <w:r>
+            <w:r xmlns:w="http://schemas.openxmlformats.org/wordprocessingml/2006/main" xmlns:wp="http://schemas.openxmlformats.org/drawingml/2006/wordprocessingDrawing" xmlns:r="http://schemas.openxmlformats.org/officeDocument/2006/relationships" xmlns:w14="http://schemas.microsoft.com/office/word/2010/wordml">
+              <w:rPr>
+                <w:rFonts w:ascii="Helvetica" w:hAnsi="Helvetica" w:eastAsia="Helvetica" w:cs="Helvetica"/>
+                <w:i w:val="false"/>
+                <w:b w:val="false"/>
+                <w:u w:val="none"/>
+                <w:strike w:val="false"/>
+                <w:sz w:val="20"/>
+                <w:szCs w:val="20"/>
+                <w:color w:val="000000"/>
+              </w:rPr>
               <w:t xml:space="preserve">0.90</w:t>
             </w:r>
           </w:p>
         </w:tc>
         <w:tc>
-          <w:tcPr/>
+          <w:tcPr>
+            <w:tcBorders>
+              <w:bottom w:val="single" w:sz="6" w:space="0" w:color="666666"/>
+              <w:top w:val="single" w:sz="6" w:space="0" w:color="666666"/>
+              <w:left w:val="none" w:sz="0" w:space="0" w:color="000000"/>
+              <w:right w:val="none" w:sz="0" w:space="0" w:color="000000"/>
+            </w:tcBorders>
+            <w:shd w:val="clear" w:color="auto" w:fill="FFFFFF"/>
+            <w:tcMar>
+              <w:top w:w="0" w:type="dxa"/>
+              <w:bottom w:w="0" w:type="dxa"/>
+              <w:left w:w="0" w:type="dxa"/>
+              <w:right w:w="0" w:type="dxa"/>
+            </w:tcMar>
+            <w:vAlign w:val="center"/>
+          </w:tcPr>
           <w:p>
             <w:pPr>
-              <w:pStyle w:val="Compact"/>
               <w:jc w:val="right"/>
+              <w:pBdr>
+                <w:bottom w:val="none" w:sz="0" w:space="0" w:color="000000"/>
+                <w:top w:val="none" w:sz="0" w:space="0" w:color="000000"/>
+                <w:left w:val="none" w:sz="0" w:space="0" w:color="000000"/>
+                <w:right w:val="none" w:sz="0" w:space="0" w:color="000000"/>
+              </w:pBdr>
+              <w:spacing w:after="120" w:before="120" w:line="240"/>
+              <w:ind w:left="120" w:right="120" w:firstLine="0" w:firstLineChars="0"/>
+              <w:rPr>
+                <w:rFonts w:ascii="Helvetica" w:hAnsi="Helvetica" w:eastAsia="Helvetica" w:cs="Helvetica"/>
+                <w:i w:val="false"/>
+                <w:b w:val="false"/>
+                <w:u w:val="none"/>
+                <w:strike w:val="false"/>
+                <w:sz w:val="20"/>
+                <w:szCs w:val="20"/>
+                <w:color w:val="000000"/>
+              </w:rPr>
             </w:pPr>
-            <w:r>
+            <w:r xmlns:w="http://schemas.openxmlformats.org/wordprocessingml/2006/main" xmlns:wp="http://schemas.openxmlformats.org/drawingml/2006/wordprocessingDrawing" xmlns:r="http://schemas.openxmlformats.org/officeDocument/2006/relationships" xmlns:w14="http://schemas.microsoft.com/office/word/2010/wordml">
+              <w:rPr>
+                <w:rFonts w:ascii="Helvetica" w:hAnsi="Helvetica" w:eastAsia="Helvetica" w:cs="Helvetica"/>
+                <w:i w:val="false"/>
+                <w:b w:val="false"/>
+                <w:u w:val="none"/>
+                <w:strike w:val="false"/>
+                <w:sz w:val="20"/>
+                <w:szCs w:val="20"/>
+                <w:color w:val="000000"/>
+              </w:rPr>
               <w:t xml:space="preserve">0.82</w:t>
             </w:r>
           </w:p>
         </w:tc>
         <w:tc>
-          <w:tcPr/>
+          <w:tcPr>
+            <w:tcBorders>
+              <w:bottom w:val="single" w:sz="6" w:space="0" w:color="666666"/>
+              <w:top w:val="single" w:sz="6" w:space="0" w:color="666666"/>
+              <w:left w:val="none" w:sz="0" w:space="0" w:color="000000"/>
+              <w:right w:val="none" w:sz="0" w:space="0" w:color="000000"/>
+            </w:tcBorders>
+            <w:shd w:val="clear" w:color="auto" w:fill="FFFFFF"/>
+            <w:tcMar>
+              <w:top w:w="0" w:type="dxa"/>
+              <w:bottom w:w="0" w:type="dxa"/>
+              <w:left w:w="0" w:type="dxa"/>
+              <w:right w:w="0" w:type="dxa"/>
+            </w:tcMar>
+            <w:vAlign w:val="center"/>
+          </w:tcPr>
           <w:p>
             <w:pPr>
-              <w:pStyle w:val="Compact"/>
               <w:jc w:val="right"/>
+              <w:pBdr>
+                <w:bottom w:val="none" w:sz="0" w:space="0" w:color="000000"/>
+                <w:top w:val="none" w:sz="0" w:space="0" w:color="000000"/>
+                <w:left w:val="none" w:sz="0" w:space="0" w:color="000000"/>
+                <w:right w:val="none" w:sz="0" w:space="0" w:color="000000"/>
+              </w:pBdr>
+              <w:spacing w:after="120" w:before="120" w:line="240"/>
+              <w:ind w:left="120" w:right="120" w:firstLine="0" w:firstLineChars="0"/>
+              <w:rPr>
+                <w:rFonts w:ascii="Helvetica" w:hAnsi="Helvetica" w:eastAsia="Helvetica" w:cs="Helvetica"/>
+                <w:i w:val="false"/>
+                <w:b w:val="false"/>
+                <w:u w:val="none"/>
+                <w:strike w:val="false"/>
+                <w:sz w:val="20"/>
+                <w:szCs w:val="20"/>
+                <w:color w:val="000000"/>
+              </w:rPr>
             </w:pPr>
-            <w:r>
+            <w:r xmlns:w="http://schemas.openxmlformats.org/wordprocessingml/2006/main" xmlns:wp="http://schemas.openxmlformats.org/drawingml/2006/wordprocessingDrawing" xmlns:r="http://schemas.openxmlformats.org/officeDocument/2006/relationships" xmlns:w14="http://schemas.microsoft.com/office/word/2010/wordml">
+              <w:rPr>
+                <w:rFonts w:ascii="Helvetica" w:hAnsi="Helvetica" w:eastAsia="Helvetica" w:cs="Helvetica"/>
+                <w:i w:val="false"/>
+                <w:b w:val="false"/>
+                <w:u w:val="none"/>
+                <w:strike w:val="false"/>
+                <w:sz w:val="20"/>
+                <w:szCs w:val="20"/>
+                <w:color w:val="000000"/>
+              </w:rPr>
               <w:t xml:space="preserve">1.13</w:t>
             </w:r>
           </w:p>
         </w:tc>
       </w:tr>
       <w:tr>
+        <w:trPr>
+          <w:trHeight w:val="360" w:hRule="auto"/>
+        </w:trPr>
         <w:tc>
-          <w:tcPr/>
+          <w:tcPr>
+            <w:tcBorders>
+              <w:bottom w:val="single" w:sz="12" w:space="0" w:color="666666"/>
+              <w:top w:val="single" w:sz="6" w:space="0" w:color="666666"/>
+              <w:left w:val="none" w:sz="0" w:space="0" w:color="000000"/>
+              <w:right w:val="none" w:sz="0" w:space="0" w:color="000000"/>
+            </w:tcBorders>
+            <w:shd w:val="clear" w:color="auto" w:fill="FFFFFF"/>
+            <w:tcMar>
+              <w:top w:w="0" w:type="dxa"/>
+              <w:bottom w:w="0" w:type="dxa"/>
+              <w:left w:w="0" w:type="dxa"/>
+              <w:right w:w="0" w:type="dxa"/>
+            </w:tcMar>
+            <w:vAlign w:val="center"/>
+          </w:tcPr>
           <w:p>
             <w:pPr>
-              <w:pStyle w:val="Compact"/>
-              <w:jc w:val="left"/>
+              <w:jc w:val="right"/>
+              <w:pBdr>
+                <w:bottom w:val="none" w:sz="0" w:space="0" w:color="000000"/>
+                <w:top w:val="none" w:sz="0" w:space="0" w:color="000000"/>
+                <w:left w:val="none" w:sz="0" w:space="0" w:color="000000"/>
+                <w:right w:val="none" w:sz="0" w:space="0" w:color="000000"/>
+              </w:pBdr>
+              <w:spacing w:after="120" w:before="120" w:line="240"/>
+              <w:ind w:left="120" w:right="120" w:firstLine="0" w:firstLineChars="0"/>
+              <w:rPr>
+                <w:rFonts w:ascii="Helvetica" w:hAnsi="Helvetica" w:eastAsia="Helvetica" w:cs="Helvetica"/>
+                <w:i w:val="false"/>
+                <w:b w:val="false"/>
+                <w:u w:val="none"/>
+                <w:strike w:val="false"/>
+                <w:sz w:val="20"/>
+                <w:szCs w:val="20"/>
+                <w:color w:val="000000"/>
+              </w:rPr>
             </w:pPr>
-            <w:r>
-              <w:t xml:space="preserve">Female 65 years and over</w:t>
-            </w:r>
-          </w:p>
-        </w:tc>
-        <w:tc>
-          <w:tcPr/>
-          <w:p>
-            <w:pPr>
-              <w:pStyle w:val="Compact"/>
-              <w:jc w:val="right"/>
-            </w:pPr>
-            <w:r>
+            <w:r xmlns:w="http://schemas.openxmlformats.org/wordprocessingml/2006/main" xmlns:wp="http://schemas.openxmlformats.org/drawingml/2006/wordprocessingDrawing" xmlns:r="http://schemas.openxmlformats.org/officeDocument/2006/relationships" xmlns:w14="http://schemas.microsoft.com/office/word/2010/wordml">
+              <w:rPr>
+                <w:rFonts w:ascii="Helvetica" w:hAnsi="Helvetica" w:eastAsia="Helvetica" w:cs="Helvetica"/>
+                <w:i w:val="false"/>
+                <w:b w:val="false"/>
+                <w:u w:val="none"/>
+                <w:strike w:val="false"/>
+                <w:sz w:val="20"/>
+                <w:szCs w:val="20"/>
+                <w:color w:val="000000"/>
+              </w:rPr>
               <w:t xml:space="preserve">0.92</w:t>
             </w:r>
           </w:p>
         </w:tc>
         <w:tc>
-          <w:tcPr/>
+          <w:tcPr>
+            <w:tcBorders>
+              <w:bottom w:val="single" w:sz="12" w:space="0" w:color="666666"/>
+              <w:top w:val="single" w:sz="6" w:space="0" w:color="666666"/>
+              <w:left w:val="none" w:sz="0" w:space="0" w:color="000000"/>
+              <w:right w:val="none" w:sz="0" w:space="0" w:color="000000"/>
+            </w:tcBorders>
+            <w:shd w:val="clear" w:color="auto" w:fill="FFFFFF"/>
+            <w:tcMar>
+              <w:top w:w="0" w:type="dxa"/>
+              <w:bottom w:w="0" w:type="dxa"/>
+              <w:left w:w="0" w:type="dxa"/>
+              <w:right w:w="0" w:type="dxa"/>
+            </w:tcMar>
+            <w:vAlign w:val="center"/>
+          </w:tcPr>
           <w:p>
             <w:pPr>
-              <w:pStyle w:val="Compact"/>
               <w:jc w:val="right"/>
+              <w:pBdr>
+                <w:bottom w:val="none" w:sz="0" w:space="0" w:color="000000"/>
+                <w:top w:val="none" w:sz="0" w:space="0" w:color="000000"/>
+                <w:left w:val="none" w:sz="0" w:space="0" w:color="000000"/>
+                <w:right w:val="none" w:sz="0" w:space="0" w:color="000000"/>
+              </w:pBdr>
+              <w:spacing w:after="120" w:before="120" w:line="240"/>
+              <w:ind w:left="120" w:right="120" w:firstLine="0" w:firstLineChars="0"/>
+              <w:rPr>
+                <w:rFonts w:ascii="Helvetica" w:hAnsi="Helvetica" w:eastAsia="Helvetica" w:cs="Helvetica"/>
+                <w:i w:val="false"/>
+                <w:b w:val="false"/>
+                <w:u w:val="none"/>
+                <w:strike w:val="false"/>
+                <w:sz w:val="20"/>
+                <w:szCs w:val="20"/>
+                <w:color w:val="000000"/>
+              </w:rPr>
             </w:pPr>
-            <w:r>
+            <w:r xmlns:w="http://schemas.openxmlformats.org/wordprocessingml/2006/main" xmlns:wp="http://schemas.openxmlformats.org/drawingml/2006/wordprocessingDrawing" xmlns:r="http://schemas.openxmlformats.org/officeDocument/2006/relationships" xmlns:w14="http://schemas.microsoft.com/office/word/2010/wordml">
+              <w:rPr>
+                <w:rFonts w:ascii="Helvetica" w:hAnsi="Helvetica" w:eastAsia="Helvetica" w:cs="Helvetica"/>
+                <w:i w:val="false"/>
+                <w:b w:val="false"/>
+                <w:u w:val="none"/>
+                <w:strike w:val="false"/>
+                <w:sz w:val="20"/>
+                <w:szCs w:val="20"/>
+                <w:color w:val="000000"/>
+              </w:rPr>
               <w:t xml:space="preserve">0.84</w:t>
             </w:r>
           </w:p>
         </w:tc>
         <w:tc>
-          <w:tcPr/>
+          <w:tcPr>
+            <w:tcBorders>
+              <w:bottom w:val="single" w:sz="12" w:space="0" w:color="666666"/>
+              <w:top w:val="single" w:sz="6" w:space="0" w:color="666666"/>
+              <w:left w:val="none" w:sz="0" w:space="0" w:color="000000"/>
+              <w:right w:val="none" w:sz="0" w:space="0" w:color="000000"/>
+            </w:tcBorders>
+            <w:shd w:val="clear" w:color="auto" w:fill="FFFFFF"/>
+            <w:tcMar>
+              <w:top w:w="0" w:type="dxa"/>
+              <w:bottom w:w="0" w:type="dxa"/>
+              <w:left w:w="0" w:type="dxa"/>
+              <w:right w:w="0" w:type="dxa"/>
+            </w:tcMar>
+            <w:vAlign w:val="center"/>
+          </w:tcPr>
           <w:p>
             <w:pPr>
-              <w:pStyle w:val="Compact"/>
               <w:jc w:val="right"/>
+              <w:pBdr>
+                <w:bottom w:val="none" w:sz="0" w:space="0" w:color="000000"/>
+                <w:top w:val="none" w:sz="0" w:space="0" w:color="000000"/>
+                <w:left w:val="none" w:sz="0" w:space="0" w:color="000000"/>
+                <w:right w:val="none" w:sz="0" w:space="0" w:color="000000"/>
+              </w:pBdr>
+              <w:spacing w:after="120" w:before="120" w:line="240"/>
+              <w:ind w:left="120" w:right="120" w:firstLine="0" w:firstLineChars="0"/>
+              <w:rPr>
+                <w:rFonts w:ascii="Helvetica" w:hAnsi="Helvetica" w:eastAsia="Helvetica" w:cs="Helvetica"/>
+                <w:i w:val="false"/>
+                <w:b w:val="false"/>
+                <w:u w:val="none"/>
+                <w:strike w:val="false"/>
+                <w:sz w:val="20"/>
+                <w:szCs w:val="20"/>
+                <w:color w:val="000000"/>
+              </w:rPr>
             </w:pPr>
-            <w:r>
+            <w:r xmlns:w="http://schemas.openxmlformats.org/wordprocessingml/2006/main" xmlns:wp="http://schemas.openxmlformats.org/drawingml/2006/wordprocessingDrawing" xmlns:r="http://schemas.openxmlformats.org/officeDocument/2006/relationships" xmlns:w14="http://schemas.microsoft.com/office/word/2010/wordml">
+              <w:rPr>
+                <w:rFonts w:ascii="Helvetica" w:hAnsi="Helvetica" w:eastAsia="Helvetica" w:cs="Helvetica"/>
+                <w:i w:val="false"/>
+                <w:b w:val="false"/>
+                <w:u w:val="none"/>
+                <w:strike w:val="false"/>
+                <w:sz w:val="20"/>
+                <w:szCs w:val="20"/>
+                <w:color w:val="000000"/>
+              </w:rPr>
               <w:t xml:space="preserve">1.17</w:t>
             </w:r>
           </w:p>
@@ -2711,262 +4786,848 @@
         </m:sSub>
       </m:oMath>
     </w:p>
-    <w:tbl>
+    <w:tbl xmlns:w="http://schemas.openxmlformats.org/wordprocessingml/2006/main" xmlns:r="http://schemas.openxmlformats.org/officeDocument/2006/relationships" xmlns:w14="http://schemas.microsoft.com/office/word/2010/wordml" xmlns:wp="http://schemas.openxmlformats.org/drawingml/2006/wordprocessingDrawing" xmlns:a="http://schemas.openxmlformats.org/drawingml/2006/main" xmlns:pic="http://schemas.openxmlformats.org/drawingml/2006/picture">
       <w:tblPr>
-        <w:tblStyle w:val="Table"/>
-        <w:tblW w:type="auto" w:w="0"/>
-        <w:tblLook w:firstRow="1" w:lastRow="0" w:firstColumn="0" w:lastColumn="0" w:noHBand="0" w:noVBand="0" w:val="0020"/>
+        <w:tblLayout w:type="fixed"/>
+        <w:jc w:val="center"/>
+        <w:tblLook w:firstRow="1" w:lastRow="0" w:firstColumn="0" w:lastColumn="0" w:noHBand="0" w:noVBand="1"/>
       </w:tblPr>
       <w:tblGrid>
-        <w:gridCol w:w="1980"/>
-        <w:gridCol w:w="1980"/>
-        <w:gridCol w:w="1980"/>
-        <w:gridCol w:w="1980"/>
+        <w:gridCol w:w="1476"/>
+        <w:gridCol w:w="1165"/>
+        <w:gridCol w:w="1153"/>
       </w:tblGrid>
       <w:tr>
         <w:trPr>
-          <w:tblHeader w:val="on"/>
+          <w:trHeight w:val="360" w:hRule="auto"/>
+          <w:tblHeader/>
         </w:trPr>
         <w:tc>
-          <w:tcPr/>
+          <w:tcPr>
+            <w:tcBorders>
+              <w:bottom w:val="single" w:sz="12" w:space="0" w:color="666666"/>
+              <w:top w:val="single" w:sz="12" w:space="0" w:color="666666"/>
+              <w:left w:val="none" w:sz="0" w:space="0" w:color="000000"/>
+              <w:right w:val="none" w:sz="0" w:space="0" w:color="000000"/>
+            </w:tcBorders>
+            <w:shd w:val="clear" w:color="auto" w:fill="FFFFFF"/>
+            <w:tcMar>
+              <w:top w:w="0" w:type="dxa"/>
+              <w:bottom w:w="0" w:type="dxa"/>
+              <w:left w:w="0" w:type="dxa"/>
+              <w:right w:w="0" w:type="dxa"/>
+            </w:tcMar>
+            <w:vAlign w:val="center"/>
+          </w:tcPr>
           <w:p>
             <w:pPr>
-              <w:pStyle w:val="Compact"/>
+              <w:jc w:val="right"/>
+              <w:pBdr>
+                <w:bottom w:val="none" w:sz="0" w:space="0" w:color="000000"/>
+                <w:top w:val="none" w:sz="0" w:space="0" w:color="000000"/>
+                <w:left w:val="none" w:sz="0" w:space="0" w:color="000000"/>
+                <w:right w:val="none" w:sz="0" w:space="0" w:color="000000"/>
+              </w:pBdr>
+              <w:spacing w:after="120" w:before="120" w:line="240"/>
+              <w:ind w:left="120" w:right="120" w:firstLine="0" w:firstLineChars="0"/>
+              <w:rPr>
+                <w:rFonts w:ascii="Helvetica" w:hAnsi="Helvetica" w:eastAsia="Helvetica" w:cs="Helvetica"/>
+                <w:i w:val="false"/>
+                <w:b w:val="true"/>
+                <w:u w:val="none"/>
+                <w:strike w:val="false"/>
+                <w:sz w:val="20"/>
+                <w:szCs w:val="20"/>
+                <w:color w:val="000000"/>
+              </w:rPr>
             </w:pPr>
-          </w:p>
-        </w:tc>
-        <w:tc>
-          <w:tcPr/>
-          <w:p>
-            <w:pPr>
-              <w:pStyle w:val="Compact"/>
-              <w:jc w:val="right"/>
-            </w:pPr>
-            <w:r>
+            <w:r xmlns:w="http://schemas.openxmlformats.org/wordprocessingml/2006/main" xmlns:wp="http://schemas.openxmlformats.org/drawingml/2006/wordprocessingDrawing" xmlns:r="http://schemas.openxmlformats.org/officeDocument/2006/relationships" xmlns:w14="http://schemas.microsoft.com/office/word/2010/wordml">
+              <w:rPr>
+                <w:rFonts w:ascii="Helvetica" w:hAnsi="Helvetica" w:eastAsia="Helvetica" w:cs="Helvetica"/>
+                <w:i w:val="false"/>
+                <w:b w:val="true"/>
+                <w:u w:val="none"/>
+                <w:strike w:val="false"/>
+                <w:sz w:val="20"/>
+                <w:szCs w:val="20"/>
+                <w:color w:val="000000"/>
+              </w:rPr>
               <w:t xml:space="preserve">Hazard ratio</w:t>
             </w:r>
           </w:p>
         </w:tc>
         <w:tc>
-          <w:tcPr/>
+          <w:tcPr>
+            <w:tcBorders>
+              <w:bottom w:val="single" w:sz="12" w:space="0" w:color="666666"/>
+              <w:top w:val="single" w:sz="12" w:space="0" w:color="666666"/>
+              <w:left w:val="none" w:sz="0" w:space="0" w:color="000000"/>
+              <w:right w:val="none" w:sz="0" w:space="0" w:color="000000"/>
+            </w:tcBorders>
+            <w:shd w:val="clear" w:color="auto" w:fill="FFFFFF"/>
+            <w:tcMar>
+              <w:top w:w="0" w:type="dxa"/>
+              <w:bottom w:w="0" w:type="dxa"/>
+              <w:left w:w="0" w:type="dxa"/>
+              <w:right w:w="0" w:type="dxa"/>
+            </w:tcMar>
+            <w:vAlign w:val="center"/>
+          </w:tcPr>
           <w:p>
             <w:pPr>
-              <w:pStyle w:val="Compact"/>
               <w:jc w:val="right"/>
+              <w:pBdr>
+                <w:bottom w:val="none" w:sz="0" w:space="0" w:color="000000"/>
+                <w:top w:val="none" w:sz="0" w:space="0" w:color="000000"/>
+                <w:left w:val="none" w:sz="0" w:space="0" w:color="000000"/>
+                <w:right w:val="none" w:sz="0" w:space="0" w:color="000000"/>
+              </w:pBdr>
+              <w:spacing w:after="120" w:before="120" w:line="240"/>
+              <w:ind w:left="120" w:right="120" w:firstLine="0" w:firstLineChars="0"/>
+              <w:rPr>
+                <w:rFonts w:ascii="Helvetica" w:hAnsi="Helvetica" w:eastAsia="Helvetica" w:cs="Helvetica"/>
+                <w:i w:val="false"/>
+                <w:b w:val="true"/>
+                <w:u w:val="none"/>
+                <w:strike w:val="false"/>
+                <w:sz w:val="20"/>
+                <w:szCs w:val="20"/>
+                <w:color w:val="000000"/>
+              </w:rPr>
             </w:pPr>
-            <w:r>
+            <w:r xmlns:w="http://schemas.openxmlformats.org/wordprocessingml/2006/main" xmlns:wp="http://schemas.openxmlformats.org/drawingml/2006/wordprocessingDrawing" xmlns:r="http://schemas.openxmlformats.org/officeDocument/2006/relationships" xmlns:w14="http://schemas.microsoft.com/office/word/2010/wordml">
+              <w:rPr>
+                <w:rFonts w:ascii="Helvetica" w:hAnsi="Helvetica" w:eastAsia="Helvetica" w:cs="Helvetica"/>
+                <w:i w:val="false"/>
+                <w:b w:val="true"/>
+                <w:u w:val="none"/>
+                <w:strike w:val="false"/>
+                <w:sz w:val="20"/>
+                <w:szCs w:val="20"/>
+                <w:color w:val="000000"/>
+              </w:rPr>
               <w:t xml:space="preserve">Lower CI</w:t>
             </w:r>
           </w:p>
         </w:tc>
         <w:tc>
-          <w:tcPr/>
+          <w:tcPr>
+            <w:tcBorders>
+              <w:bottom w:val="single" w:sz="12" w:space="0" w:color="666666"/>
+              <w:top w:val="single" w:sz="12" w:space="0" w:color="666666"/>
+              <w:left w:val="none" w:sz="0" w:space="0" w:color="000000"/>
+              <w:right w:val="none" w:sz="0" w:space="0" w:color="000000"/>
+            </w:tcBorders>
+            <w:shd w:val="clear" w:color="auto" w:fill="FFFFFF"/>
+            <w:tcMar>
+              <w:top w:w="0" w:type="dxa"/>
+              <w:bottom w:w="0" w:type="dxa"/>
+              <w:left w:w="0" w:type="dxa"/>
+              <w:right w:w="0" w:type="dxa"/>
+            </w:tcMar>
+            <w:vAlign w:val="center"/>
+          </w:tcPr>
           <w:p>
             <w:pPr>
-              <w:pStyle w:val="Compact"/>
               <w:jc w:val="right"/>
+              <w:pBdr>
+                <w:bottom w:val="none" w:sz="0" w:space="0" w:color="000000"/>
+                <w:top w:val="none" w:sz="0" w:space="0" w:color="000000"/>
+                <w:left w:val="none" w:sz="0" w:space="0" w:color="000000"/>
+                <w:right w:val="none" w:sz="0" w:space="0" w:color="000000"/>
+              </w:pBdr>
+              <w:spacing w:after="120" w:before="120" w:line="240"/>
+              <w:ind w:left="120" w:right="120" w:firstLine="0" w:firstLineChars="0"/>
+              <w:rPr>
+                <w:rFonts w:ascii="Helvetica" w:hAnsi="Helvetica" w:eastAsia="Helvetica" w:cs="Helvetica"/>
+                <w:i w:val="false"/>
+                <w:b w:val="true"/>
+                <w:u w:val="none"/>
+                <w:strike w:val="false"/>
+                <w:sz w:val="20"/>
+                <w:szCs w:val="20"/>
+                <w:color w:val="000000"/>
+              </w:rPr>
             </w:pPr>
-            <w:r>
+            <w:r xmlns:w="http://schemas.openxmlformats.org/wordprocessingml/2006/main" xmlns:wp="http://schemas.openxmlformats.org/drawingml/2006/wordprocessingDrawing" xmlns:r="http://schemas.openxmlformats.org/officeDocument/2006/relationships" xmlns:w14="http://schemas.microsoft.com/office/word/2010/wordml">
+              <w:rPr>
+                <w:rFonts w:ascii="Helvetica" w:hAnsi="Helvetica" w:eastAsia="Helvetica" w:cs="Helvetica"/>
+                <w:i w:val="false"/>
+                <w:b w:val="true"/>
+                <w:u w:val="none"/>
+                <w:strike w:val="false"/>
+                <w:sz w:val="20"/>
+                <w:szCs w:val="20"/>
+                <w:color w:val="000000"/>
+              </w:rPr>
               <w:t xml:space="preserve">Upper CI</w:t>
             </w:r>
           </w:p>
         </w:tc>
       </w:tr>
       <w:tr>
+        <w:trPr>
+          <w:trHeight w:val="360" w:hRule="auto"/>
+        </w:trPr>
         <w:tc>
-          <w:tcPr/>
+          <w:tcPr>
+            <w:tcBorders>
+              <w:bottom w:val="single" w:sz="6" w:space="0" w:color="666666"/>
+              <w:top w:val="single" w:sz="12" w:space="0" w:color="666666"/>
+              <w:left w:val="none" w:sz="0" w:space="0" w:color="000000"/>
+              <w:right w:val="none" w:sz="0" w:space="0" w:color="000000"/>
+            </w:tcBorders>
+            <w:shd w:val="clear" w:color="auto" w:fill="FFFFFF"/>
+            <w:tcMar>
+              <w:top w:w="0" w:type="dxa"/>
+              <w:bottom w:w="0" w:type="dxa"/>
+              <w:left w:w="0" w:type="dxa"/>
+              <w:right w:w="0" w:type="dxa"/>
+            </w:tcMar>
+            <w:vAlign w:val="center"/>
+          </w:tcPr>
           <w:p>
             <w:pPr>
-              <w:pStyle w:val="Compact"/>
-              <w:jc w:val="left"/>
+              <w:jc w:val="right"/>
+              <w:pBdr>
+                <w:bottom w:val="none" w:sz="0" w:space="0" w:color="000000"/>
+                <w:top w:val="none" w:sz="0" w:space="0" w:color="000000"/>
+                <w:left w:val="none" w:sz="0" w:space="0" w:color="000000"/>
+                <w:right w:val="none" w:sz="0" w:space="0" w:color="000000"/>
+              </w:pBdr>
+              <w:spacing w:after="120" w:before="120" w:line="240"/>
+              <w:ind w:left="120" w:right="120" w:firstLine="0" w:firstLineChars="0"/>
+              <w:rPr>
+                <w:rFonts w:ascii="Helvetica" w:hAnsi="Helvetica" w:eastAsia="Helvetica" w:cs="Helvetica"/>
+                <w:i w:val="false"/>
+                <w:b w:val="false"/>
+                <w:u w:val="none"/>
+                <w:strike w:val="false"/>
+                <w:sz w:val="20"/>
+                <w:szCs w:val="20"/>
+                <w:color w:val="000000"/>
+              </w:rPr>
             </w:pPr>
-            <w:r>
-              <w:t xml:space="preserve">Male &lt;65 years</w:t>
-            </w:r>
-          </w:p>
-        </w:tc>
-        <w:tc>
-          <w:tcPr/>
-          <w:p>
-            <w:pPr>
-              <w:pStyle w:val="Compact"/>
-              <w:jc w:val="right"/>
-            </w:pPr>
-            <w:r>
+            <w:r xmlns:w="http://schemas.openxmlformats.org/wordprocessingml/2006/main" xmlns:wp="http://schemas.openxmlformats.org/drawingml/2006/wordprocessingDrawing" xmlns:r="http://schemas.openxmlformats.org/officeDocument/2006/relationships" xmlns:w14="http://schemas.microsoft.com/office/word/2010/wordml">
+              <w:rPr>
+                <w:rFonts w:ascii="Helvetica" w:hAnsi="Helvetica" w:eastAsia="Helvetica" w:cs="Helvetica"/>
+                <w:i w:val="false"/>
+                <w:b w:val="false"/>
+                <w:u w:val="none"/>
+                <w:strike w:val="false"/>
+                <w:sz w:val="20"/>
+                <w:szCs w:val="20"/>
+                <w:color w:val="000000"/>
+              </w:rPr>
               <w:t xml:space="preserve">0.40</w:t>
             </w:r>
           </w:p>
         </w:tc>
         <w:tc>
-          <w:tcPr/>
+          <w:tcPr>
+            <w:tcBorders>
+              <w:bottom w:val="single" w:sz="6" w:space="0" w:color="666666"/>
+              <w:top w:val="single" w:sz="12" w:space="0" w:color="666666"/>
+              <w:left w:val="none" w:sz="0" w:space="0" w:color="000000"/>
+              <w:right w:val="none" w:sz="0" w:space="0" w:color="000000"/>
+            </w:tcBorders>
+            <w:shd w:val="clear" w:color="auto" w:fill="FFFFFF"/>
+            <w:tcMar>
+              <w:top w:w="0" w:type="dxa"/>
+              <w:bottom w:w="0" w:type="dxa"/>
+              <w:left w:w="0" w:type="dxa"/>
+              <w:right w:w="0" w:type="dxa"/>
+            </w:tcMar>
+            <w:vAlign w:val="center"/>
+          </w:tcPr>
           <w:p>
             <w:pPr>
-              <w:pStyle w:val="Compact"/>
               <w:jc w:val="right"/>
+              <w:pBdr>
+                <w:bottom w:val="none" w:sz="0" w:space="0" w:color="000000"/>
+                <w:top w:val="none" w:sz="0" w:space="0" w:color="000000"/>
+                <w:left w:val="none" w:sz="0" w:space="0" w:color="000000"/>
+                <w:right w:val="none" w:sz="0" w:space="0" w:color="000000"/>
+              </w:pBdr>
+              <w:spacing w:after="120" w:before="120" w:line="240"/>
+              <w:ind w:left="120" w:right="120" w:firstLine="0" w:firstLineChars="0"/>
+              <w:rPr>
+                <w:rFonts w:ascii="Helvetica" w:hAnsi="Helvetica" w:eastAsia="Helvetica" w:cs="Helvetica"/>
+                <w:i w:val="false"/>
+                <w:b w:val="false"/>
+                <w:u w:val="none"/>
+                <w:strike w:val="false"/>
+                <w:sz w:val="20"/>
+                <w:szCs w:val="20"/>
+                <w:color w:val="000000"/>
+              </w:rPr>
             </w:pPr>
-            <w:r>
+            <w:r xmlns:w="http://schemas.openxmlformats.org/wordprocessingml/2006/main" xmlns:wp="http://schemas.openxmlformats.org/drawingml/2006/wordprocessingDrawing" xmlns:r="http://schemas.openxmlformats.org/officeDocument/2006/relationships" xmlns:w14="http://schemas.microsoft.com/office/word/2010/wordml">
+              <w:rPr>
+                <w:rFonts w:ascii="Helvetica" w:hAnsi="Helvetica" w:eastAsia="Helvetica" w:cs="Helvetica"/>
+                <w:i w:val="false"/>
+                <w:b w:val="false"/>
+                <w:u w:val="none"/>
+                <w:strike w:val="false"/>
+                <w:sz w:val="20"/>
+                <w:szCs w:val="20"/>
+                <w:color w:val="000000"/>
+              </w:rPr>
               <w:t xml:space="preserve">0.26</w:t>
             </w:r>
           </w:p>
         </w:tc>
         <w:tc>
-          <w:tcPr/>
+          <w:tcPr>
+            <w:tcBorders>
+              <w:bottom w:val="single" w:sz="6" w:space="0" w:color="666666"/>
+              <w:top w:val="single" w:sz="12" w:space="0" w:color="666666"/>
+              <w:left w:val="none" w:sz="0" w:space="0" w:color="000000"/>
+              <w:right w:val="none" w:sz="0" w:space="0" w:color="000000"/>
+            </w:tcBorders>
+            <w:shd w:val="clear" w:color="auto" w:fill="FFFFFF"/>
+            <w:tcMar>
+              <w:top w:w="0" w:type="dxa"/>
+              <w:bottom w:w="0" w:type="dxa"/>
+              <w:left w:w="0" w:type="dxa"/>
+              <w:right w:w="0" w:type="dxa"/>
+            </w:tcMar>
+            <w:vAlign w:val="center"/>
+          </w:tcPr>
           <w:p>
             <w:pPr>
-              <w:pStyle w:val="Compact"/>
               <w:jc w:val="right"/>
+              <w:pBdr>
+                <w:bottom w:val="none" w:sz="0" w:space="0" w:color="000000"/>
+                <w:top w:val="none" w:sz="0" w:space="0" w:color="000000"/>
+                <w:left w:val="none" w:sz="0" w:space="0" w:color="000000"/>
+                <w:right w:val="none" w:sz="0" w:space="0" w:color="000000"/>
+              </w:pBdr>
+              <w:spacing w:after="120" w:before="120" w:line="240"/>
+              <w:ind w:left="120" w:right="120" w:firstLine="0" w:firstLineChars="0"/>
+              <w:rPr>
+                <w:rFonts w:ascii="Helvetica" w:hAnsi="Helvetica" w:eastAsia="Helvetica" w:cs="Helvetica"/>
+                <w:i w:val="false"/>
+                <w:b w:val="false"/>
+                <w:u w:val="none"/>
+                <w:strike w:val="false"/>
+                <w:sz w:val="20"/>
+                <w:szCs w:val="20"/>
+                <w:color w:val="000000"/>
+              </w:rPr>
             </w:pPr>
-            <w:r>
+            <w:r xmlns:w="http://schemas.openxmlformats.org/wordprocessingml/2006/main" xmlns:wp="http://schemas.openxmlformats.org/drawingml/2006/wordprocessingDrawing" xmlns:r="http://schemas.openxmlformats.org/officeDocument/2006/relationships" xmlns:w14="http://schemas.microsoft.com/office/word/2010/wordml">
+              <w:rPr>
+                <w:rFonts w:ascii="Helvetica" w:hAnsi="Helvetica" w:eastAsia="Helvetica" w:cs="Helvetica"/>
+                <w:i w:val="false"/>
+                <w:b w:val="false"/>
+                <w:u w:val="none"/>
+                <w:strike w:val="false"/>
+                <w:sz w:val="20"/>
+                <w:szCs w:val="20"/>
+                <w:color w:val="000000"/>
+              </w:rPr>
               <w:t xml:space="preserve">0.80</w:t>
             </w:r>
           </w:p>
         </w:tc>
       </w:tr>
       <w:tr>
+        <w:trPr>
+          <w:trHeight w:val="360" w:hRule="auto"/>
+        </w:trPr>
         <w:tc>
-          <w:tcPr/>
+          <w:tcPr>
+            <w:tcBorders>
+              <w:bottom w:val="single" w:sz="6" w:space="0" w:color="666666"/>
+              <w:top w:val="single" w:sz="6" w:space="0" w:color="666666"/>
+              <w:left w:val="none" w:sz="0" w:space="0" w:color="000000"/>
+              <w:right w:val="none" w:sz="0" w:space="0" w:color="000000"/>
+            </w:tcBorders>
+            <w:shd w:val="clear" w:color="auto" w:fill="FFFFFF"/>
+            <w:tcMar>
+              <w:top w:w="0" w:type="dxa"/>
+              <w:bottom w:w="0" w:type="dxa"/>
+              <w:left w:w="0" w:type="dxa"/>
+              <w:right w:w="0" w:type="dxa"/>
+            </w:tcMar>
+            <w:vAlign w:val="center"/>
+          </w:tcPr>
           <w:p>
             <w:pPr>
-              <w:pStyle w:val="Compact"/>
-              <w:jc w:val="left"/>
+              <w:jc w:val="right"/>
+              <w:pBdr>
+                <w:bottom w:val="none" w:sz="0" w:space="0" w:color="000000"/>
+                <w:top w:val="none" w:sz="0" w:space="0" w:color="000000"/>
+                <w:left w:val="none" w:sz="0" w:space="0" w:color="000000"/>
+                <w:right w:val="none" w:sz="0" w:space="0" w:color="000000"/>
+              </w:pBdr>
+              <w:spacing w:after="120" w:before="120" w:line="240"/>
+              <w:ind w:left="120" w:right="120" w:firstLine="0" w:firstLineChars="0"/>
+              <w:rPr>
+                <w:rFonts w:ascii="Helvetica" w:hAnsi="Helvetica" w:eastAsia="Helvetica" w:cs="Helvetica"/>
+                <w:i w:val="false"/>
+                <w:b w:val="false"/>
+                <w:u w:val="none"/>
+                <w:strike w:val="false"/>
+                <w:sz w:val="20"/>
+                <w:szCs w:val="20"/>
+                <w:color w:val="000000"/>
+              </w:rPr>
             </w:pPr>
-            <w:r>
-              <w:t xml:space="preserve">Female &lt;65 years</w:t>
-            </w:r>
-          </w:p>
-        </w:tc>
-        <w:tc>
-          <w:tcPr/>
-          <w:p>
-            <w:pPr>
-              <w:pStyle w:val="Compact"/>
-              <w:jc w:val="right"/>
-            </w:pPr>
-            <w:r>
+            <w:r xmlns:w="http://schemas.openxmlformats.org/wordprocessingml/2006/main" xmlns:wp="http://schemas.openxmlformats.org/drawingml/2006/wordprocessingDrawing" xmlns:r="http://schemas.openxmlformats.org/officeDocument/2006/relationships" xmlns:w14="http://schemas.microsoft.com/office/word/2010/wordml">
+              <w:rPr>
+                <w:rFonts w:ascii="Helvetica" w:hAnsi="Helvetica" w:eastAsia="Helvetica" w:cs="Helvetica"/>
+                <w:i w:val="false"/>
+                <w:b w:val="false"/>
+                <w:u w:val="none"/>
+                <w:strike w:val="false"/>
+                <w:sz w:val="20"/>
+                <w:szCs w:val="20"/>
+                <w:color w:val="000000"/>
+              </w:rPr>
               <w:t xml:space="preserve">0.25</w:t>
             </w:r>
           </w:p>
         </w:tc>
         <w:tc>
-          <w:tcPr/>
+          <w:tcPr>
+            <w:tcBorders>
+              <w:bottom w:val="single" w:sz="6" w:space="0" w:color="666666"/>
+              <w:top w:val="single" w:sz="6" w:space="0" w:color="666666"/>
+              <w:left w:val="none" w:sz="0" w:space="0" w:color="000000"/>
+              <w:right w:val="none" w:sz="0" w:space="0" w:color="000000"/>
+            </w:tcBorders>
+            <w:shd w:val="clear" w:color="auto" w:fill="FFFFFF"/>
+            <w:tcMar>
+              <w:top w:w="0" w:type="dxa"/>
+              <w:bottom w:w="0" w:type="dxa"/>
+              <w:left w:w="0" w:type="dxa"/>
+              <w:right w:w="0" w:type="dxa"/>
+            </w:tcMar>
+            <w:vAlign w:val="center"/>
+          </w:tcPr>
           <w:p>
             <w:pPr>
-              <w:pStyle w:val="Compact"/>
               <w:jc w:val="right"/>
+              <w:pBdr>
+                <w:bottom w:val="none" w:sz="0" w:space="0" w:color="000000"/>
+                <w:top w:val="none" w:sz="0" w:space="0" w:color="000000"/>
+                <w:left w:val="none" w:sz="0" w:space="0" w:color="000000"/>
+                <w:right w:val="none" w:sz="0" w:space="0" w:color="000000"/>
+              </w:pBdr>
+              <w:spacing w:after="120" w:before="120" w:line="240"/>
+              <w:ind w:left="120" w:right="120" w:firstLine="0" w:firstLineChars="0"/>
+              <w:rPr>
+                <w:rFonts w:ascii="Helvetica" w:hAnsi="Helvetica" w:eastAsia="Helvetica" w:cs="Helvetica"/>
+                <w:i w:val="false"/>
+                <w:b w:val="false"/>
+                <w:u w:val="none"/>
+                <w:strike w:val="false"/>
+                <w:sz w:val="20"/>
+                <w:szCs w:val="20"/>
+                <w:color w:val="000000"/>
+              </w:rPr>
             </w:pPr>
-            <w:r>
+            <w:r xmlns:w="http://schemas.openxmlformats.org/wordprocessingml/2006/main" xmlns:wp="http://schemas.openxmlformats.org/drawingml/2006/wordprocessingDrawing" xmlns:r="http://schemas.openxmlformats.org/officeDocument/2006/relationships" xmlns:w14="http://schemas.microsoft.com/office/word/2010/wordml">
+              <w:rPr>
+                <w:rFonts w:ascii="Helvetica" w:hAnsi="Helvetica" w:eastAsia="Helvetica" w:cs="Helvetica"/>
+                <w:i w:val="false"/>
+                <w:b w:val="false"/>
+                <w:u w:val="none"/>
+                <w:strike w:val="false"/>
+                <w:sz w:val="20"/>
+                <w:szCs w:val="20"/>
+                <w:color w:val="000000"/>
+              </w:rPr>
               <w:t xml:space="preserve">0.13</w:t>
             </w:r>
           </w:p>
         </w:tc>
         <w:tc>
-          <w:tcPr/>
+          <w:tcPr>
+            <w:tcBorders>
+              <w:bottom w:val="single" w:sz="6" w:space="0" w:color="666666"/>
+              <w:top w:val="single" w:sz="6" w:space="0" w:color="666666"/>
+              <w:left w:val="none" w:sz="0" w:space="0" w:color="000000"/>
+              <w:right w:val="none" w:sz="0" w:space="0" w:color="000000"/>
+            </w:tcBorders>
+            <w:shd w:val="clear" w:color="auto" w:fill="FFFFFF"/>
+            <w:tcMar>
+              <w:top w:w="0" w:type="dxa"/>
+              <w:bottom w:w="0" w:type="dxa"/>
+              <w:left w:w="0" w:type="dxa"/>
+              <w:right w:w="0" w:type="dxa"/>
+            </w:tcMar>
+            <w:vAlign w:val="center"/>
+          </w:tcPr>
           <w:p>
             <w:pPr>
-              <w:pStyle w:val="Compact"/>
               <w:jc w:val="right"/>
+              <w:pBdr>
+                <w:bottom w:val="none" w:sz="0" w:space="0" w:color="000000"/>
+                <w:top w:val="none" w:sz="0" w:space="0" w:color="000000"/>
+                <w:left w:val="none" w:sz="0" w:space="0" w:color="000000"/>
+                <w:right w:val="none" w:sz="0" w:space="0" w:color="000000"/>
+              </w:pBdr>
+              <w:spacing w:after="120" w:before="120" w:line="240"/>
+              <w:ind w:left="120" w:right="120" w:firstLine="0" w:firstLineChars="0"/>
+              <w:rPr>
+                <w:rFonts w:ascii="Helvetica" w:hAnsi="Helvetica" w:eastAsia="Helvetica" w:cs="Helvetica"/>
+                <w:i w:val="false"/>
+                <w:b w:val="false"/>
+                <w:u w:val="none"/>
+                <w:strike w:val="false"/>
+                <w:sz w:val="20"/>
+                <w:szCs w:val="20"/>
+                <w:color w:val="000000"/>
+              </w:rPr>
             </w:pPr>
-            <w:r>
+            <w:r xmlns:w="http://schemas.openxmlformats.org/wordprocessingml/2006/main" xmlns:wp="http://schemas.openxmlformats.org/drawingml/2006/wordprocessingDrawing" xmlns:r="http://schemas.openxmlformats.org/officeDocument/2006/relationships" xmlns:w14="http://schemas.microsoft.com/office/word/2010/wordml">
+              <w:rPr>
+                <w:rFonts w:ascii="Helvetica" w:hAnsi="Helvetica" w:eastAsia="Helvetica" w:cs="Helvetica"/>
+                <w:i w:val="false"/>
+                <w:b w:val="false"/>
+                <w:u w:val="none"/>
+                <w:strike w:val="false"/>
+                <w:sz w:val="20"/>
+                <w:szCs w:val="20"/>
+                <w:color w:val="000000"/>
+              </w:rPr>
               <w:t xml:space="preserve">0.65</w:t>
             </w:r>
           </w:p>
         </w:tc>
       </w:tr>
       <w:tr>
+        <w:trPr>
+          <w:trHeight w:val="360" w:hRule="auto"/>
+        </w:trPr>
         <w:tc>
-          <w:tcPr/>
+          <w:tcPr>
+            <w:tcBorders>
+              <w:bottom w:val="single" w:sz="6" w:space="0" w:color="666666"/>
+              <w:top w:val="single" w:sz="6" w:space="0" w:color="666666"/>
+              <w:left w:val="none" w:sz="0" w:space="0" w:color="000000"/>
+              <w:right w:val="none" w:sz="0" w:space="0" w:color="000000"/>
+            </w:tcBorders>
+            <w:shd w:val="clear" w:color="auto" w:fill="FFFFFF"/>
+            <w:tcMar>
+              <w:top w:w="0" w:type="dxa"/>
+              <w:bottom w:w="0" w:type="dxa"/>
+              <w:left w:w="0" w:type="dxa"/>
+              <w:right w:w="0" w:type="dxa"/>
+            </w:tcMar>
+            <w:vAlign w:val="center"/>
+          </w:tcPr>
           <w:p>
             <w:pPr>
-              <w:pStyle w:val="Compact"/>
-              <w:jc w:val="left"/>
+              <w:jc w:val="right"/>
+              <w:pBdr>
+                <w:bottom w:val="none" w:sz="0" w:space="0" w:color="000000"/>
+                <w:top w:val="none" w:sz="0" w:space="0" w:color="000000"/>
+                <w:left w:val="none" w:sz="0" w:space="0" w:color="000000"/>
+                <w:right w:val="none" w:sz="0" w:space="0" w:color="000000"/>
+              </w:pBdr>
+              <w:spacing w:after="120" w:before="120" w:line="240"/>
+              <w:ind w:left="120" w:right="120" w:firstLine="0" w:firstLineChars="0"/>
+              <w:rPr>
+                <w:rFonts w:ascii="Helvetica" w:hAnsi="Helvetica" w:eastAsia="Helvetica" w:cs="Helvetica"/>
+                <w:i w:val="false"/>
+                <w:b w:val="false"/>
+                <w:u w:val="none"/>
+                <w:strike w:val="false"/>
+                <w:sz w:val="20"/>
+                <w:szCs w:val="20"/>
+                <w:color w:val="000000"/>
+              </w:rPr>
             </w:pPr>
-            <w:r>
-              <w:t xml:space="preserve">Male 65 years and over</w:t>
-            </w:r>
-          </w:p>
-        </w:tc>
-        <w:tc>
-          <w:tcPr/>
-          <w:p>
-            <w:pPr>
-              <w:pStyle w:val="Compact"/>
-              <w:jc w:val="right"/>
-            </w:pPr>
-            <w:r>
+            <w:r xmlns:w="http://schemas.openxmlformats.org/wordprocessingml/2006/main" xmlns:wp="http://schemas.openxmlformats.org/drawingml/2006/wordprocessingDrawing" xmlns:r="http://schemas.openxmlformats.org/officeDocument/2006/relationships" xmlns:w14="http://schemas.microsoft.com/office/word/2010/wordml">
+              <w:rPr>
+                <w:rFonts w:ascii="Helvetica" w:hAnsi="Helvetica" w:eastAsia="Helvetica" w:cs="Helvetica"/>
+                <w:i w:val="false"/>
+                <w:b w:val="false"/>
+                <w:u w:val="none"/>
+                <w:strike w:val="false"/>
+                <w:sz w:val="20"/>
+                <w:szCs w:val="20"/>
+                <w:color w:val="000000"/>
+              </w:rPr>
               <w:t xml:space="preserve">0.32</w:t>
             </w:r>
           </w:p>
         </w:tc>
         <w:tc>
-          <w:tcPr/>
+          <w:tcPr>
+            <w:tcBorders>
+              <w:bottom w:val="single" w:sz="6" w:space="0" w:color="666666"/>
+              <w:top w:val="single" w:sz="6" w:space="0" w:color="666666"/>
+              <w:left w:val="none" w:sz="0" w:space="0" w:color="000000"/>
+              <w:right w:val="none" w:sz="0" w:space="0" w:color="000000"/>
+            </w:tcBorders>
+            <w:shd w:val="clear" w:color="auto" w:fill="FFFFFF"/>
+            <w:tcMar>
+              <w:top w:w="0" w:type="dxa"/>
+              <w:bottom w:w="0" w:type="dxa"/>
+              <w:left w:w="0" w:type="dxa"/>
+              <w:right w:w="0" w:type="dxa"/>
+            </w:tcMar>
+            <w:vAlign w:val="center"/>
+          </w:tcPr>
           <w:p>
             <w:pPr>
-              <w:pStyle w:val="Compact"/>
               <w:jc w:val="right"/>
+              <w:pBdr>
+                <w:bottom w:val="none" w:sz="0" w:space="0" w:color="000000"/>
+                <w:top w:val="none" w:sz="0" w:space="0" w:color="000000"/>
+                <w:left w:val="none" w:sz="0" w:space="0" w:color="000000"/>
+                <w:right w:val="none" w:sz="0" w:space="0" w:color="000000"/>
+              </w:pBdr>
+              <w:spacing w:after="120" w:before="120" w:line="240"/>
+              <w:ind w:left="120" w:right="120" w:firstLine="0" w:firstLineChars="0"/>
+              <w:rPr>
+                <w:rFonts w:ascii="Helvetica" w:hAnsi="Helvetica" w:eastAsia="Helvetica" w:cs="Helvetica"/>
+                <w:i w:val="false"/>
+                <w:b w:val="false"/>
+                <w:u w:val="none"/>
+                <w:strike w:val="false"/>
+                <w:sz w:val="20"/>
+                <w:szCs w:val="20"/>
+                <w:color w:val="000000"/>
+              </w:rPr>
             </w:pPr>
-            <w:r>
+            <w:r xmlns:w="http://schemas.openxmlformats.org/wordprocessingml/2006/main" xmlns:wp="http://schemas.openxmlformats.org/drawingml/2006/wordprocessingDrawing" xmlns:r="http://schemas.openxmlformats.org/officeDocument/2006/relationships" xmlns:w14="http://schemas.microsoft.com/office/word/2010/wordml">
+              <w:rPr>
+                <w:rFonts w:ascii="Helvetica" w:hAnsi="Helvetica" w:eastAsia="Helvetica" w:cs="Helvetica"/>
+                <w:i w:val="false"/>
+                <w:b w:val="false"/>
+                <w:u w:val="none"/>
+                <w:strike w:val="false"/>
+                <w:sz w:val="20"/>
+                <w:szCs w:val="20"/>
+                <w:color w:val="000000"/>
+              </w:rPr>
               <w:t xml:space="preserve">0.24</w:t>
             </w:r>
           </w:p>
         </w:tc>
         <w:tc>
-          <w:tcPr/>
+          <w:tcPr>
+            <w:tcBorders>
+              <w:bottom w:val="single" w:sz="6" w:space="0" w:color="666666"/>
+              <w:top w:val="single" w:sz="6" w:space="0" w:color="666666"/>
+              <w:left w:val="none" w:sz="0" w:space="0" w:color="000000"/>
+              <w:right w:val="none" w:sz="0" w:space="0" w:color="000000"/>
+            </w:tcBorders>
+            <w:shd w:val="clear" w:color="auto" w:fill="FFFFFF"/>
+            <w:tcMar>
+              <w:top w:w="0" w:type="dxa"/>
+              <w:bottom w:w="0" w:type="dxa"/>
+              <w:left w:w="0" w:type="dxa"/>
+              <w:right w:w="0" w:type="dxa"/>
+            </w:tcMar>
+            <w:vAlign w:val="center"/>
+          </w:tcPr>
           <w:p>
             <w:pPr>
-              <w:pStyle w:val="Compact"/>
               <w:jc w:val="right"/>
+              <w:pBdr>
+                <w:bottom w:val="none" w:sz="0" w:space="0" w:color="000000"/>
+                <w:top w:val="none" w:sz="0" w:space="0" w:color="000000"/>
+                <w:left w:val="none" w:sz="0" w:space="0" w:color="000000"/>
+                <w:right w:val="none" w:sz="0" w:space="0" w:color="000000"/>
+              </w:pBdr>
+              <w:spacing w:after="120" w:before="120" w:line="240"/>
+              <w:ind w:left="120" w:right="120" w:firstLine="0" w:firstLineChars="0"/>
+              <w:rPr>
+                <w:rFonts w:ascii="Helvetica" w:hAnsi="Helvetica" w:eastAsia="Helvetica" w:cs="Helvetica"/>
+                <w:i w:val="false"/>
+                <w:b w:val="false"/>
+                <w:u w:val="none"/>
+                <w:strike w:val="false"/>
+                <w:sz w:val="20"/>
+                <w:szCs w:val="20"/>
+                <w:color w:val="000000"/>
+              </w:rPr>
             </w:pPr>
-            <w:r>
+            <w:r xmlns:w="http://schemas.openxmlformats.org/wordprocessingml/2006/main" xmlns:wp="http://schemas.openxmlformats.org/drawingml/2006/wordprocessingDrawing" xmlns:r="http://schemas.openxmlformats.org/officeDocument/2006/relationships" xmlns:w14="http://schemas.microsoft.com/office/word/2010/wordml">
+              <w:rPr>
+                <w:rFonts w:ascii="Helvetica" w:hAnsi="Helvetica" w:eastAsia="Helvetica" w:cs="Helvetica"/>
+                <w:i w:val="false"/>
+                <w:b w:val="false"/>
+                <w:u w:val="none"/>
+                <w:strike w:val="false"/>
+                <w:sz w:val="20"/>
+                <w:szCs w:val="20"/>
+                <w:color w:val="000000"/>
+              </w:rPr>
               <w:t xml:space="preserve">0.55</w:t>
             </w:r>
           </w:p>
         </w:tc>
       </w:tr>
       <w:tr>
+        <w:trPr>
+          <w:trHeight w:val="360" w:hRule="auto"/>
+        </w:trPr>
         <w:tc>
-          <w:tcPr/>
+          <w:tcPr>
+            <w:tcBorders>
+              <w:bottom w:val="single" w:sz="12" w:space="0" w:color="666666"/>
+              <w:top w:val="single" w:sz="6" w:space="0" w:color="666666"/>
+              <w:left w:val="none" w:sz="0" w:space="0" w:color="000000"/>
+              <w:right w:val="none" w:sz="0" w:space="0" w:color="000000"/>
+            </w:tcBorders>
+            <w:shd w:val="clear" w:color="auto" w:fill="FFFFFF"/>
+            <w:tcMar>
+              <w:top w:w="0" w:type="dxa"/>
+              <w:bottom w:w="0" w:type="dxa"/>
+              <w:left w:w="0" w:type="dxa"/>
+              <w:right w:w="0" w:type="dxa"/>
+            </w:tcMar>
+            <w:vAlign w:val="center"/>
+          </w:tcPr>
           <w:p>
             <w:pPr>
-              <w:pStyle w:val="Compact"/>
-              <w:jc w:val="left"/>
+              <w:jc w:val="right"/>
+              <w:pBdr>
+                <w:bottom w:val="none" w:sz="0" w:space="0" w:color="000000"/>
+                <w:top w:val="none" w:sz="0" w:space="0" w:color="000000"/>
+                <w:left w:val="none" w:sz="0" w:space="0" w:color="000000"/>
+                <w:right w:val="none" w:sz="0" w:space="0" w:color="000000"/>
+              </w:pBdr>
+              <w:spacing w:after="120" w:before="120" w:line="240"/>
+              <w:ind w:left="120" w:right="120" w:firstLine="0" w:firstLineChars="0"/>
+              <w:rPr>
+                <w:rFonts w:ascii="Helvetica" w:hAnsi="Helvetica" w:eastAsia="Helvetica" w:cs="Helvetica"/>
+                <w:i w:val="false"/>
+                <w:b w:val="false"/>
+                <w:u w:val="none"/>
+                <w:strike w:val="false"/>
+                <w:sz w:val="20"/>
+                <w:szCs w:val="20"/>
+                <w:color w:val="000000"/>
+              </w:rPr>
             </w:pPr>
-            <w:r>
-              <w:t xml:space="preserve">Female 65 years and over</w:t>
-            </w:r>
-          </w:p>
-        </w:tc>
-        <w:tc>
-          <w:tcPr/>
-          <w:p>
-            <w:pPr>
-              <w:pStyle w:val="Compact"/>
-              <w:jc w:val="right"/>
-            </w:pPr>
-            <w:r>
+            <w:r xmlns:w="http://schemas.openxmlformats.org/wordprocessingml/2006/main" xmlns:wp="http://schemas.openxmlformats.org/drawingml/2006/wordprocessingDrawing" xmlns:r="http://schemas.openxmlformats.org/officeDocument/2006/relationships" xmlns:w14="http://schemas.microsoft.com/office/word/2010/wordml">
+              <w:rPr>
+                <w:rFonts w:ascii="Helvetica" w:hAnsi="Helvetica" w:eastAsia="Helvetica" w:cs="Helvetica"/>
+                <w:i w:val="false"/>
+                <w:b w:val="false"/>
+                <w:u w:val="none"/>
+                <w:strike w:val="false"/>
+                <w:sz w:val="20"/>
+                <w:szCs w:val="20"/>
+                <w:color w:val="000000"/>
+              </w:rPr>
               <w:t xml:space="preserve">0.20</w:t>
             </w:r>
           </w:p>
         </w:tc>
         <w:tc>
-          <w:tcPr/>
+          <w:tcPr>
+            <w:tcBorders>
+              <w:bottom w:val="single" w:sz="12" w:space="0" w:color="666666"/>
+              <w:top w:val="single" w:sz="6" w:space="0" w:color="666666"/>
+              <w:left w:val="none" w:sz="0" w:space="0" w:color="000000"/>
+              <w:right w:val="none" w:sz="0" w:space="0" w:color="000000"/>
+            </w:tcBorders>
+            <w:shd w:val="clear" w:color="auto" w:fill="FFFFFF"/>
+            <w:tcMar>
+              <w:top w:w="0" w:type="dxa"/>
+              <w:bottom w:w="0" w:type="dxa"/>
+              <w:left w:w="0" w:type="dxa"/>
+              <w:right w:w="0" w:type="dxa"/>
+            </w:tcMar>
+            <w:vAlign w:val="center"/>
+          </w:tcPr>
           <w:p>
             <w:pPr>
-              <w:pStyle w:val="Compact"/>
               <w:jc w:val="right"/>
+              <w:pBdr>
+                <w:bottom w:val="none" w:sz="0" w:space="0" w:color="000000"/>
+                <w:top w:val="none" w:sz="0" w:space="0" w:color="000000"/>
+                <w:left w:val="none" w:sz="0" w:space="0" w:color="000000"/>
+                <w:right w:val="none" w:sz="0" w:space="0" w:color="000000"/>
+              </w:pBdr>
+              <w:spacing w:after="120" w:before="120" w:line="240"/>
+              <w:ind w:left="120" w:right="120" w:firstLine="0" w:firstLineChars="0"/>
+              <w:rPr>
+                <w:rFonts w:ascii="Helvetica" w:hAnsi="Helvetica" w:eastAsia="Helvetica" w:cs="Helvetica"/>
+                <w:i w:val="false"/>
+                <w:b w:val="false"/>
+                <w:u w:val="none"/>
+                <w:strike w:val="false"/>
+                <w:sz w:val="20"/>
+                <w:szCs w:val="20"/>
+                <w:color w:val="000000"/>
+              </w:rPr>
             </w:pPr>
-            <w:r>
+            <w:r xmlns:w="http://schemas.openxmlformats.org/wordprocessingml/2006/main" xmlns:wp="http://schemas.openxmlformats.org/drawingml/2006/wordprocessingDrawing" xmlns:r="http://schemas.openxmlformats.org/officeDocument/2006/relationships" xmlns:w14="http://schemas.microsoft.com/office/word/2010/wordml">
+              <w:rPr>
+                <w:rFonts w:ascii="Helvetica" w:hAnsi="Helvetica" w:eastAsia="Helvetica" w:cs="Helvetica"/>
+                <w:i w:val="false"/>
+                <w:b w:val="false"/>
+                <w:u w:val="none"/>
+                <w:strike w:val="false"/>
+                <w:sz w:val="20"/>
+                <w:szCs w:val="20"/>
+                <w:color w:val="000000"/>
+              </w:rPr>
               <w:t xml:space="preserve">0.12</w:t>
             </w:r>
           </w:p>
         </w:tc>
         <w:tc>
-          <w:tcPr/>
+          <w:tcPr>
+            <w:tcBorders>
+              <w:bottom w:val="single" w:sz="12" w:space="0" w:color="666666"/>
+              <w:top w:val="single" w:sz="6" w:space="0" w:color="666666"/>
+              <w:left w:val="none" w:sz="0" w:space="0" w:color="000000"/>
+              <w:right w:val="none" w:sz="0" w:space="0" w:color="000000"/>
+            </w:tcBorders>
+            <w:shd w:val="clear" w:color="auto" w:fill="FFFFFF"/>
+            <w:tcMar>
+              <w:top w:w="0" w:type="dxa"/>
+              <w:bottom w:w="0" w:type="dxa"/>
+              <w:left w:w="0" w:type="dxa"/>
+              <w:right w:w="0" w:type="dxa"/>
+            </w:tcMar>
+            <w:vAlign w:val="center"/>
+          </w:tcPr>
           <w:p>
             <w:pPr>
-              <w:pStyle w:val="Compact"/>
               <w:jc w:val="right"/>
+              <w:pBdr>
+                <w:bottom w:val="none" w:sz="0" w:space="0" w:color="000000"/>
+                <w:top w:val="none" w:sz="0" w:space="0" w:color="000000"/>
+                <w:left w:val="none" w:sz="0" w:space="0" w:color="000000"/>
+                <w:right w:val="none" w:sz="0" w:space="0" w:color="000000"/>
+              </w:pBdr>
+              <w:spacing w:after="120" w:before="120" w:line="240"/>
+              <w:ind w:left="120" w:right="120" w:firstLine="0" w:firstLineChars="0"/>
+              <w:rPr>
+                <w:rFonts w:ascii="Helvetica" w:hAnsi="Helvetica" w:eastAsia="Helvetica" w:cs="Helvetica"/>
+                <w:i w:val="false"/>
+                <w:b w:val="false"/>
+                <w:u w:val="none"/>
+                <w:strike w:val="false"/>
+                <w:sz w:val="20"/>
+                <w:szCs w:val="20"/>
+                <w:color w:val="000000"/>
+              </w:rPr>
             </w:pPr>
-            <w:r>
+            <w:r xmlns:w="http://schemas.openxmlformats.org/wordprocessingml/2006/main" xmlns:wp="http://schemas.openxmlformats.org/drawingml/2006/wordprocessingDrawing" xmlns:r="http://schemas.openxmlformats.org/officeDocument/2006/relationships" xmlns:w14="http://schemas.microsoft.com/office/word/2010/wordml">
+              <w:rPr>
+                <w:rFonts w:ascii="Helvetica" w:hAnsi="Helvetica" w:eastAsia="Helvetica" w:cs="Helvetica"/>
+                <w:i w:val="false"/>
+                <w:b w:val="false"/>
+                <w:u w:val="none"/>
+                <w:strike w:val="false"/>
+                <w:sz w:val="20"/>
+                <w:szCs w:val="20"/>
+                <w:color w:val="000000"/>
+              </w:rPr>
               <w:t xml:space="preserve">0.45</w:t>
             </w:r>
           </w:p>

</xml_diff>

<commit_message>
Updated target population and adverse events with extra clarifications. No changes to criteria. Assumptions changed to include some of assumptions made in defining population (merged with overlap), and assumptions that HRs are meaningful. Updated flowchart to make more beautiful.
</commit_message>
<xml_diff>
--- a/treatment-calibration-trident-protocol.docx
+++ b/treatment-calibration-trident-protocol.docx
@@ -15,7 +15,7 @@
         <w:pStyle w:val="Author"/>
       </w:pPr>
       <w:r>
-        <w:t xml:space="preserve">Dr Alice Hosking, Prof David McAllister, ….</w:t>
+        <w:t xml:space="preserve">Dr Alice Hosking, Prof Rustam Al-Shahi Salman, Prof William Whiteley, Prof David McAllister</w:t>
       </w:r>
     </w:p>
     <w:p>
@@ -23,7 +23,7 @@
         <w:pStyle w:val="Date"/>
       </w:pPr>
       <w:r>
-        <w:t xml:space="preserve">2026-04-20</w:t>
+        <w:t xml:space="preserve">2026-04-22</w:t>
       </w:r>
     </w:p>
     <w:sdt>
@@ -266,7 +266,7 @@
     </w:p>
     <w:bookmarkEnd w:id="22"/>
     <w:bookmarkEnd w:id="23"/>
-    <w:bookmarkStart w:id="34" w:name="study-design-population-and-outcomes"/>
+    <w:bookmarkStart w:id="33" w:name="study-design-population-and-outcomes"/>
     <w:p>
       <w:pPr>
         <w:pStyle w:val="Heading2"/>
@@ -514,7 +514,7 @@
       <w:r>
         <w:drawing>
           <wp:inline>
-            <wp:extent cx="5334000" cy="2796670"/>
+            <wp:extent cx="4800600" cy="2275565"/>
             <wp:effectExtent b="0" l="0" r="0" t="0"/>
             <wp:docPr descr="Figure 1: Flowchart schematic of trial calibration method using two strata." title="" id="25" name="Picture"/>
             <a:graphic>
@@ -535,7 +535,7 @@
                   <pic:spPr bwMode="auto">
                     <a:xfrm>
                       <a:off x="0" y="0"/>
-                      <a:ext cx="5334000" cy="2796670"/>
+                      <a:ext cx="4800600" cy="2275565"/>
                     </a:xfrm>
                     <a:prstGeom prst="rect">
                       <a:avLst/>
@@ -564,7 +564,7 @@
     </w:p>
     <w:bookmarkEnd w:id="27"/>
     <w:bookmarkEnd w:id="28"/>
-    <w:bookmarkStart w:id="33" w:name="populations"/>
+    <w:bookmarkStart w:id="32" w:name="populations"/>
     <w:p>
       <w:pPr>
         <w:pStyle w:val="Heading3"/>
@@ -756,7 +756,15 @@
         <w:pStyle w:val="FirstParagraph"/>
       </w:pPr>
       <w:r>
-        <w:t xml:space="preserve">The Lothian Audit of Intracerebral Haemorrhage (LATCH) ran between 1st June 2010 and 31st May 2013, and 1st November 2018 and 31st October 2021. Approval for LATCH was granted by the Caldicott guardian of NHS Lothian. The LATCH audit has been described previously.</w:t>
+        <w:t xml:space="preserve">We aim to calibrate to a target population that reflects who might be prescribed the TRIDENT single pill, if it were recommended in clinical treatment guidelines.</w:t>
+      </w:r>
+    </w:p>
+    <w:p>
+      <w:pPr>
+        <w:pStyle w:val="BodyText"/>
+      </w:pPr>
+      <w:r>
+        <w:t xml:space="preserve">The Lothian Audit of Intracerebral Haemorrhage (LATCH) was a population-based cohort study that ran between 1st June 2010 and 31st May 2013, and 1st November 2018 and 31st October 2021, with the aim of near-complete ascertainment of ICH in the Lothian Health board region of Scotland in residents aged ≥16 years. Approval for LATCH was granted by the Caldicott guardian of NHS Lothian. The LATCH audit has been described previously.</w:t>
       </w:r>
       <w:r>
         <w:rPr>
@@ -768,7 +776,7 @@
         <w:t xml:space="preserve"> </w:t>
       </w:r>
       <w:r>
-        <w:t xml:space="preserve">In brief, LATCH ascertained cases of first-ever or recurrent ICH from the Lothian Health board region of Scotland in residents aged ≥16 years. Prospective sources included a trust-wide network of physicians, neurologists, neurosurgeons, radiologists, pathologists, specialist nurses and audit personnel; and daily neuroradiology meetings and review of all computed tomographic (CT) head scans. We conducted retrospective searches of electronic patient notes, International Classification of Diseases 10th Revision (ICD-10) coded hospital discharge records, the Scottish Stroke Care Audit,</w:t>
+        <w:t xml:space="preserve">Prospective sources included a trust-wide network of physicians, neurologists, neurosurgeons, radiologists, pathologists, specialist nurses and audit personnel; and daily neuroradiology meetings and review of all computed tomographic (CT) head scans. Retrospective sources were electronic patient notes, International Classification of Diseases 10th Revision (ICD-10) coded hospital discharge records, the Scottish Stroke Care Audit,</w:t>
       </w:r>
       <w:r>
         <w:rPr>
@@ -788,7 +796,7 @@
         <w:pStyle w:val="BodyText"/>
       </w:pPr>
       <w:r>
-        <w:t xml:space="preserve">The LATCH cohort includes 1077 people with ICH of any cause; 917 had ICH presumed due to microvascular cause. The LATCH study does not include information on clinical stability so we make assumptions to mirror the TRIDENT inclusion criteria. We aim to identify those in LATCH who might be prescribed the TRIDENT single pill, if it were recommended in clinical treatment guidelines.</w:t>
+        <w:t xml:space="preserve">The LATCH cohort includes 1077 people with ICH of any cause; 917 had ICH presumed due to microvascular cause. We aim to identify those in LATCH who might be prescribed the TRIDENT single pill, if it were recommended in clinical treatment guidelines, based on the TRIDENT inclusion criteria and prescribing practice:</w:t>
       </w:r>
     </w:p>
     <w:p>
@@ -800,7 +808,7 @@
         </w:numPr>
       </w:pPr>
       <w:r>
-        <w:t xml:space="preserve">In the LATCH cohort, a third of people die within 7 days of ICH; beyond 7 days, the death rate reduces, and we pragmatically assume those alive at 7 days after ICH are clinically stable; there are 602 people alive at 7 days.</w:t>
+        <w:t xml:space="preserve">In clinical practice, antihypertensive treatment for secondary prevention is often started once a person is clinically stable. In the LATCH cohort, a third of people die within 7 days of ICH; beyond 7 days, the death rate reduces, and we pragmatically assume those alive at 7 days after ICH are clinically stable; there are 602 people alive at 7 days.</w:t>
       </w:r>
     </w:p>
     <w:p>
@@ -827,20 +835,8 @@
         <w:t xml:space="preserve">The TRIDENT pill would only be used on those able to get out of bed; therefore, we will limit inclusion to those with pre-morbid modified Rankin Scale (mRS) of 4 or less. All 602 who survived 7 days had a pre-morbid mRS of 4 or less.</w:t>
       </w:r>
     </w:p>
-    <w:p>
-      <w:pPr>
-        <w:pStyle w:val="Compact"/>
-        <w:numPr>
-          <w:ilvl w:val="0"/>
-          <w:numId w:val="1005"/>
-        </w:numPr>
-      </w:pPr>
-      <w:r>
-        <w:t xml:space="preserve">The TRIDENT pill would be used instead of single agent blood-pressure medications, which those in LATCH might be on at discharge.</w:t>
-      </w:r>
-    </w:p>
     <w:bookmarkEnd w:id="30"/>
-    <w:bookmarkStart w:id="31" w:name="Xa63bd342872f1ecb34df361806ec39a563b6899"/>
+    <w:bookmarkStart w:id="31" w:name="assumptions-and-limitations"/>
     <w:p>
       <w:pPr>
         <w:pStyle w:val="Heading4"/>
@@ -855,48 +851,49 @@
         <w:tab/>
       </w:r>
       <w:r>
-        <w:t xml:space="preserve">Overlap between trial and target populations.</w:t>
-      </w:r>
-    </w:p>
-    <w:p>
-      <w:pPr>
-        <w:pStyle w:val="FirstParagraph"/>
-      </w:pPr>
-      <w:r>
-        <w:t xml:space="preserve">The trial and target populations are partially overlapping, as the Royal Infirmary of Edinburgh recruited 17 people with ICH for TRIDENT. This does not affect the process of calibration, as we make no assumptions about independence of the target and trial populations.</w:t>
+        <w:t xml:space="preserve">Assumptions and limitations</w:t>
+      </w:r>
+    </w:p>
+    <w:p>
+      <w:pPr>
+        <w:pStyle w:val="Compact"/>
+        <w:numPr>
+          <w:ilvl w:val="0"/>
+          <w:numId w:val="1006"/>
+        </w:numPr>
+      </w:pPr>
+      <w:r>
+        <w:t xml:space="preserve">We assume that the hazard ratios for each stratum reflect real variation in hazard by age and sex, rather than random variation around the mean.</w:t>
+      </w:r>
+    </w:p>
+    <w:p>
+      <w:pPr>
+        <w:pStyle w:val="Compact"/>
+        <w:numPr>
+          <w:ilvl w:val="0"/>
+          <w:numId w:val="1006"/>
+        </w:numPr>
+      </w:pPr>
+      <w:r>
+        <w:t xml:space="preserve">The trial and target populations are partially overlapping, as the Royal Infirmary of Edinburgh recruited 17 people with ICH for TRIDENT. Therefore approximately 9 people in the target population (1.5%) are on treatment. We cannot identify those treated, but assume this will make a negligible difference to the untreated rate.</w:t>
+      </w:r>
+    </w:p>
+    <w:p>
+      <w:pPr>
+        <w:pStyle w:val="Compact"/>
+        <w:numPr>
+          <w:ilvl w:val="0"/>
+          <w:numId w:val="1006"/>
+        </w:numPr>
+      </w:pPr>
+      <w:r>
+        <w:t xml:space="preserve">There were limitations to the maximum doses of additional blood pressure treatment for those in both treatment and placebo arms of TRIDENT. People in LATCH may have been prescribed doses in excess of this, but we do not have data on discharge medications for the whole LATCH population, so cannot exclude these people.</w:t>
       </w:r>
     </w:p>
     <w:bookmarkEnd w:id="31"/>
-    <w:bookmarkStart w:id="32" w:name="assumptions"/>
-    <w:p>
-      <w:pPr>
-        <w:pStyle w:val="Heading4"/>
-      </w:pPr>
-      <w:r>
-        <w:rPr>
-          <w:rStyle w:val="SectionNumber"/>
-        </w:rPr>
-        <w:t xml:space="preserve">2.2.4</w:t>
-      </w:r>
-      <w:r>
-        <w:tab/>
-      </w:r>
-      <w:r>
-        <w:t xml:space="preserve">Assumptions</w:t>
-      </w:r>
-    </w:p>
-    <w:p>
-      <w:pPr>
-        <w:pStyle w:val="FirstParagraph"/>
-      </w:pPr>
-      <w:r>
-        <w:t xml:space="preserve">We assume that we correctly measure and model the determinants that reflect heterogeneity in the treatment effect. In practice, we cannot ever measure all effects that might lead to heterogeneity, and we are limited by effects measured both in the trial and target population. We also did not account for post-randomisation variables.</w:t>
-      </w:r>
-    </w:p>
     <w:bookmarkEnd w:id="32"/>
     <w:bookmarkEnd w:id="33"/>
-    <w:bookmarkEnd w:id="34"/>
-    <w:bookmarkStart w:id="91" w:name="analysis-example"/>
+    <w:bookmarkStart w:id="90" w:name="analysis-example"/>
     <w:p>
       <w:pPr>
         <w:pStyle w:val="Heading2"/>
@@ -919,10 +916,10 @@
         <w:pStyle w:val="FirstParagraph"/>
       </w:pPr>
       <w:r>
-        <w:t xml:space="preserve">We now show the method for calibration through a worked example using real LATCH data, and mock hazard ratios (and their 95% confidence intervals) from TRIDENT. We create four strata for this example.</w:t>
-      </w:r>
-    </w:p>
-    <w:bookmarkStart w:id="35" w:name="time-period-definitions"/>
+        <w:t xml:space="preserve">We now show the method for calibration through a worked example using real LATCH data, and mock hazard ratios (and their 95% confidence intervals) from TRIDENT. We create age/sex four strata for this example.</w:t>
+      </w:r>
+    </w:p>
+    <w:bookmarkStart w:id="34" w:name="time-period-definitions"/>
     <w:p>
       <w:pPr>
         <w:pStyle w:val="Heading3"/>
@@ -1094,8 +1091,8 @@
         <w:t xml:space="preserve">.</w:t>
       </w:r>
     </w:p>
-    <w:bookmarkEnd w:id="35"/>
-    <w:bookmarkStart w:id="36" w:name="data-tidying"/>
+    <w:bookmarkEnd w:id="34"/>
+    <w:bookmarkStart w:id="35" w:name="data-tidying"/>
     <w:p>
       <w:pPr>
         <w:pStyle w:val="Heading3"/>
@@ -1121,8 +1118,8 @@
         <w:t xml:space="preserve">First we filter LATCH to only those who survived 7 days, format dates correctly, set censoring dates, and split into strata (under 65 and 65 and over, male and female). For this study, we censor LATCH follow up at the maximum TRIDENT follow-up time of six years.</w:t>
       </w:r>
     </w:p>
-    <w:bookmarkEnd w:id="36"/>
-    <w:bookmarkStart w:id="50" w:name="parametric-survival-model-for-latch"/>
+    <w:bookmarkEnd w:id="35"/>
+    <w:bookmarkStart w:id="49" w:name="parametric-survival-model-for-latch"/>
     <w:p>
       <w:pPr>
         <w:pStyle w:val="Heading3"/>
@@ -1172,7 +1169,7 @@
         <w:t xml:space="preserve">The exponential model allows much simpler calculations other models. The AICs are all similar (gamma is the lowest). Although other models have marginally better fits, the exponential model fit is acceptable, and for analytical simplicity, we choose an exponential model.</w:t>
       </w:r>
     </w:p>
-    <w:bookmarkStart w:id="40" w:name="kaplan-meier-curve"/>
+    <w:bookmarkStart w:id="39" w:name="kaplan-meier-curve"/>
     <w:p>
       <w:pPr>
         <w:pStyle w:val="Heading4"/>
@@ -1199,18 +1196,18 @@
           <wp:inline>
             <wp:extent cx="5334000" cy="3556000"/>
             <wp:effectExtent b="0" l="0" r="0" t="0"/>
-            <wp:docPr descr="" title="" id="38" name="Picture"/>
+            <wp:docPr descr="" title="" id="37" name="Picture"/>
             <a:graphic>
               <a:graphicData uri="http://schemas.openxmlformats.org/drawingml/2006/picture">
                 <pic:pic>
                   <pic:nvPicPr>
-                    <pic:cNvPr descr="treatment-calibration-trident-protocol_files/figure-docx/KM%20for%20whole%20population-1.png" id="39" name="Picture"/>
+                    <pic:cNvPr descr="treatment-calibration-trident-protocol_files/figure-docx/KM%20for%20whole%20population-1.png" id="38" name="Picture"/>
                     <pic:cNvPicPr>
                       <a:picLocks noChangeArrowheads="1" noChangeAspect="1"/>
                     </pic:cNvPicPr>
                   </pic:nvPicPr>
                   <pic:blipFill>
-                    <a:blip r:embed="rId37"/>
+                    <a:blip r:embed="rId36"/>
                     <a:stretch>
                       <a:fillRect/>
                     </a:stretch>
@@ -1237,8 +1234,8 @@
         </w:drawing>
       </w:r>
     </w:p>
-    <w:bookmarkEnd w:id="40"/>
-    <w:bookmarkStart w:id="44" w:name="X700ccd55d3eb4d40dec856831639ba31899197c"/>
+    <w:bookmarkEnd w:id="39"/>
+    <w:bookmarkStart w:id="43" w:name="X700ccd55d3eb4d40dec856831639ba31899197c"/>
     <w:p>
       <w:pPr>
         <w:pStyle w:val="Heading4"/>
@@ -1265,18 +1262,18 @@
           <wp:inline>
             <wp:extent cx="5334000" cy="2667000"/>
             <wp:effectExtent b="0" l="0" r="0" t="0"/>
-            <wp:docPr descr="" title="" id="42" name="Picture"/>
+            <wp:docPr descr="" title="" id="41" name="Picture"/>
             <a:graphic>
               <a:graphicData uri="http://schemas.openxmlformats.org/drawingml/2006/picture">
                 <pic:pic>
                   <pic:nvPicPr>
-                    <pic:cNvPr descr="treatment-calibration-trident-protocol_files/figure-docx/survival%20plots-1.png" id="43" name="Picture"/>
+                    <pic:cNvPr descr="treatment-calibration-trident-protocol_files/figure-docx/survival%20plots-1.png" id="42" name="Picture"/>
                     <pic:cNvPicPr>
                       <a:picLocks noChangeArrowheads="1" noChangeAspect="1"/>
                     </pic:cNvPicPr>
                   </pic:nvPicPr>
                   <pic:blipFill>
-                    <a:blip r:embed="rId41"/>
+                    <a:blip r:embed="rId40"/>
                     <a:stretch>
                       <a:fillRect/>
                     </a:stretch>
@@ -1303,8 +1300,8 @@
         </w:drawing>
       </w:r>
     </w:p>
-    <w:bookmarkEnd w:id="44"/>
-    <w:bookmarkStart w:id="48" w:name="plot-of-hazards-of-various-distributions"/>
+    <w:bookmarkEnd w:id="43"/>
+    <w:bookmarkStart w:id="47" w:name="plot-of-hazards-of-various-distributions"/>
     <w:p>
       <w:pPr>
         <w:pStyle w:val="Heading4"/>
@@ -1331,18 +1328,18 @@
           <wp:inline>
             <wp:extent cx="5334000" cy="2667000"/>
             <wp:effectExtent b="0" l="0" r="0" t="0"/>
-            <wp:docPr descr="" title="" id="46" name="Picture"/>
+            <wp:docPr descr="" title="" id="45" name="Picture"/>
             <a:graphic>
               <a:graphicData uri="http://schemas.openxmlformats.org/drawingml/2006/picture">
                 <pic:pic>
                   <pic:nvPicPr>
-                    <pic:cNvPr descr="treatment-calibration-trident-protocol_files/figure-docx/hazard%20plot-1.png" id="47" name="Picture"/>
+                    <pic:cNvPr descr="treatment-calibration-trident-protocol_files/figure-docx/hazard%20plot-1.png" id="46" name="Picture"/>
                     <pic:cNvPicPr>
                       <a:picLocks noChangeArrowheads="1" noChangeAspect="1"/>
                     </pic:cNvPicPr>
                   </pic:nvPicPr>
                   <pic:blipFill>
-                    <a:blip r:embed="rId45"/>
+                    <a:blip r:embed="rId44"/>
                     <a:stretch>
                       <a:fillRect/>
                     </a:stretch>
@@ -1369,8 +1366,8 @@
         </w:drawing>
       </w:r>
     </w:p>
-    <w:bookmarkEnd w:id="48"/>
-    <w:bookmarkStart w:id="49" w:name="comparison-of-aic"/>
+    <w:bookmarkEnd w:id="47"/>
+    <w:bookmarkStart w:id="48" w:name="comparison-of-aic"/>
     <w:p>
       <w:pPr>
         <w:pStyle w:val="Heading4"/>
@@ -2304,9 +2301,9 @@
         </w:tc>
       </w:tr>
     </w:tbl>
+    <w:bookmarkEnd w:id="48"/>
     <w:bookmarkEnd w:id="49"/>
-    <w:bookmarkEnd w:id="50"/>
-    <w:bookmarkStart w:id="56" w:name="event-rates-in-latch"/>
+    <w:bookmarkStart w:id="55" w:name="event-rates-in-latch"/>
     <w:p>
       <w:pPr>
         <w:pStyle w:val="Heading3"/>
@@ -2636,7 +2633,7 @@
         <w:t xml:space="preserve">We can then simulate a normally distributed sample for the event rates.</w:t>
       </w:r>
     </w:p>
-    <w:bookmarkStart w:id="51" w:name="table-of-event-rates-for-each-stratum"/>
+    <w:bookmarkStart w:id="50" w:name="table-of-event-rates-for-each-stratum"/>
     <w:p>
       <w:pPr>
         <w:pStyle w:val="Heading4"/>
@@ -3773,8 +3770,8 @@
         </w:tc>
       </w:tr>
     </w:tbl>
-    <w:bookmarkEnd w:id="51"/>
-    <w:bookmarkStart w:id="55" w:name="plot-of-log-event-rates-for-each-stratum"/>
+    <w:bookmarkEnd w:id="50"/>
+    <w:bookmarkStart w:id="54" w:name="plot-of-log-event-rates-for-each-stratum"/>
     <w:p>
       <w:pPr>
         <w:pStyle w:val="Heading4"/>
@@ -3801,18 +3798,18 @@
           <wp:inline>
             <wp:extent cx="5334000" cy="3556000"/>
             <wp:effectExtent b="0" l="0" r="0" t="0"/>
-            <wp:docPr descr="" title="" id="53" name="Picture"/>
+            <wp:docPr descr="" title="" id="52" name="Picture"/>
             <a:graphic>
               <a:graphicData uri="http://schemas.openxmlformats.org/drawingml/2006/picture">
                 <pic:pic>
                   <pic:nvPicPr>
-                    <pic:cNvPr descr="treatment-calibration-trident-protocol_files/figure-docx/plot%20of%20event%20rates%20log-1.png" id="54" name="Picture"/>
+                    <pic:cNvPr descr="treatment-calibration-trident-protocol_files/figure-docx/plot%20of%20event%20rates%20log-1.png" id="53" name="Picture"/>
                     <pic:cNvPicPr>
                       <a:picLocks noChangeArrowheads="1" noChangeAspect="1"/>
                     </pic:cNvPicPr>
                   </pic:nvPicPr>
                   <pic:blipFill>
-                    <a:blip r:embed="rId52"/>
+                    <a:blip r:embed="rId51"/>
                     <a:stretch>
                       <a:fillRect/>
                     </a:stretch>
@@ -3839,9 +3836,9 @@
         </w:drawing>
       </w:r>
     </w:p>
+    <w:bookmarkEnd w:id="54"/>
     <w:bookmarkEnd w:id="55"/>
-    <w:bookmarkEnd w:id="56"/>
-    <w:bookmarkStart w:id="75" w:name="hazard-ratios-for-each-stratum"/>
+    <w:bookmarkStart w:id="74" w:name="hazard-ratios-for-each-stratum"/>
     <w:p>
       <w:pPr>
         <w:pStyle w:val="Heading3"/>
@@ -3867,7 +3864,7 @@
         <w:t xml:space="preserve">For this mock-up we estimate hazard ratios for each time period (based roughly on published subgroup analysis). For the real analysis, the strata may be different; this is for demonstration only. We assume HR are independent; and make a guess at the HR for young men. We then split into two time periods: up to 18 months, where the HR are approximately 1; and beyond 18 months. We simulate 10,000 samples assuming a log normal distribution, for t1 and t2.</w:t>
       </w:r>
     </w:p>
-    <w:bookmarkStart w:id="57" w:name="hazard-ratio-for-period-tau_1"/>
+    <w:bookmarkStart w:id="56" w:name="hazard-ratio-for-period-tau_1"/>
     <w:p>
       <w:pPr>
         <w:pStyle w:val="Heading4"/>
@@ -4750,8 +4747,8 @@
         </w:tc>
       </w:tr>
     </w:tbl>
-    <w:bookmarkEnd w:id="57"/>
-    <w:bookmarkStart w:id="58" w:name="hazard-ratio-for-period-tau_2"/>
+    <w:bookmarkEnd w:id="56"/>
+    <w:bookmarkStart w:id="57" w:name="hazard-ratio-for-period-tau_2"/>
     <w:p>
       <w:pPr>
         <w:pStyle w:val="Heading4"/>
@@ -5634,8 +5631,8 @@
         </w:tc>
       </w:tr>
     </w:tbl>
-    <w:bookmarkEnd w:id="58"/>
-    <w:bookmarkStart w:id="62" w:name="Xc312d42b1c8ce96f86a70d63273714f95b6f833"/>
+    <w:bookmarkEnd w:id="57"/>
+    <w:bookmarkStart w:id="61" w:name="Xc312d42b1c8ce96f86a70d63273714f95b6f833"/>
     <w:p>
       <w:pPr>
         <w:pStyle w:val="Heading4"/>
@@ -5679,18 +5676,18 @@
           <wp:inline>
             <wp:extent cx="5334000" cy="3556000"/>
             <wp:effectExtent b="0" l="0" r="0" t="0"/>
-            <wp:docPr descr="" title="" id="60" name="Picture"/>
+            <wp:docPr descr="" title="" id="59" name="Picture"/>
             <a:graphic>
               <a:graphicData uri="http://schemas.openxmlformats.org/drawingml/2006/picture">
                 <pic:pic>
                   <pic:nvPicPr>
-                    <pic:cNvPr descr="treatment-calibration-trident-protocol_files/figure-docx/simulate%20n%20hrs-1.png" id="61" name="Picture"/>
+                    <pic:cNvPr descr="treatment-calibration-trident-protocol_files/figure-docx/simulate%20n%20hrs-1.png" id="60" name="Picture"/>
                     <pic:cNvPicPr>
                       <a:picLocks noChangeArrowheads="1" noChangeAspect="1"/>
                     </pic:cNvPicPr>
                   </pic:nvPicPr>
                   <pic:blipFill>
-                    <a:blip r:embed="rId59"/>
+                    <a:blip r:embed="rId58"/>
                     <a:stretch>
                       <a:fillRect/>
                     </a:stretch>
@@ -5717,8 +5714,8 @@
         </w:drawing>
       </w:r>
     </w:p>
-    <w:bookmarkEnd w:id="62"/>
-    <w:bookmarkStart w:id="66" w:name="X52fbbf4e6b503320f9e40ff57bf665b53b661a5"/>
+    <w:bookmarkEnd w:id="61"/>
+    <w:bookmarkStart w:id="65" w:name="X52fbbf4e6b503320f9e40ff57bf665b53b661a5"/>
     <w:p>
       <w:pPr>
         <w:pStyle w:val="Heading4"/>
@@ -5762,18 +5759,18 @@
           <wp:inline>
             <wp:extent cx="5334000" cy="3556000"/>
             <wp:effectExtent b="0" l="0" r="0" t="0"/>
-            <wp:docPr descr="" title="" id="64" name="Picture"/>
+            <wp:docPr descr="" title="" id="63" name="Picture"/>
             <a:graphic>
               <a:graphicData uri="http://schemas.openxmlformats.org/drawingml/2006/picture">
                 <pic:pic>
                   <pic:nvPicPr>
-                    <pic:cNvPr descr="treatment-calibration-trident-protocol_files/figure-docx/hist%20hr%20t1%20exponentiated-1.png" id="65" name="Picture"/>
+                    <pic:cNvPr descr="treatment-calibration-trident-protocol_files/figure-docx/hist%20hr%20t1%20exponentiated-1.png" id="64" name="Picture"/>
                     <pic:cNvPicPr>
                       <a:picLocks noChangeArrowheads="1" noChangeAspect="1"/>
                     </pic:cNvPicPr>
                   </pic:nvPicPr>
                   <pic:blipFill>
-                    <a:blip r:embed="rId63"/>
+                    <a:blip r:embed="rId62"/>
                     <a:stretch>
                       <a:fillRect/>
                     </a:stretch>
@@ -5800,8 +5797,8 @@
         </w:drawing>
       </w:r>
     </w:p>
-    <w:bookmarkEnd w:id="66"/>
-    <w:bookmarkStart w:id="70" w:name="X5a44fd5c81c9de3016d0e1d1ba3c84e7f57c1fa"/>
+    <w:bookmarkEnd w:id="65"/>
+    <w:bookmarkStart w:id="69" w:name="X5a44fd5c81c9de3016d0e1d1ba3c84e7f57c1fa"/>
     <w:p>
       <w:pPr>
         <w:pStyle w:val="Heading4"/>
@@ -5845,18 +5842,18 @@
           <wp:inline>
             <wp:extent cx="5334000" cy="3556000"/>
             <wp:effectExtent b="0" l="0" r="0" t="0"/>
-            <wp:docPr descr="" title="" id="68" name="Picture"/>
+            <wp:docPr descr="" title="" id="67" name="Picture"/>
             <a:graphic>
               <a:graphicData uri="http://schemas.openxmlformats.org/drawingml/2006/picture">
                 <pic:pic>
                   <pic:nvPicPr>
-                    <pic:cNvPr descr="treatment-calibration-trident-protocol_files/figure-docx/t2%20hr%20hists-1.png" id="69" name="Picture"/>
+                    <pic:cNvPr descr="treatment-calibration-trident-protocol_files/figure-docx/t2%20hr%20hists-1.png" id="68" name="Picture"/>
                     <pic:cNvPicPr>
                       <a:picLocks noChangeArrowheads="1" noChangeAspect="1"/>
                     </pic:cNvPicPr>
                   </pic:nvPicPr>
                   <pic:blipFill>
-                    <a:blip r:embed="rId67"/>
+                    <a:blip r:embed="rId66"/>
                     <a:stretch>
                       <a:fillRect/>
                     </a:stretch>
@@ -5883,8 +5880,8 @@
         </w:drawing>
       </w:r>
     </w:p>
-    <w:bookmarkEnd w:id="70"/>
-    <w:bookmarkStart w:id="74" w:name="X13aa9156017495ce461a3e3f37d6a245296a496"/>
+    <w:bookmarkEnd w:id="69"/>
+    <w:bookmarkStart w:id="73" w:name="X13aa9156017495ce461a3e3f37d6a245296a496"/>
     <w:p>
       <w:pPr>
         <w:pStyle w:val="Heading4"/>
@@ -5928,18 +5925,18 @@
           <wp:inline>
             <wp:extent cx="5334000" cy="3556000"/>
             <wp:effectExtent b="0" l="0" r="0" t="0"/>
-            <wp:docPr descr="" title="" id="72" name="Picture"/>
+            <wp:docPr descr="" title="" id="71" name="Picture"/>
             <a:graphic>
               <a:graphicData uri="http://schemas.openxmlformats.org/drawingml/2006/picture">
                 <pic:pic>
                   <pic:nvPicPr>
-                    <pic:cNvPr descr="treatment-calibration-trident-protocol_files/figure-docx/t2%20hr%20exponentiated-1.png" id="73" name="Picture"/>
+                    <pic:cNvPr descr="treatment-calibration-trident-protocol_files/figure-docx/t2%20hr%20exponentiated-1.png" id="72" name="Picture"/>
                     <pic:cNvPicPr>
                       <a:picLocks noChangeArrowheads="1" noChangeAspect="1"/>
                     </pic:cNvPicPr>
                   </pic:nvPicPr>
                   <pic:blipFill>
-                    <a:blip r:embed="rId71"/>
+                    <a:blip r:embed="rId70"/>
                     <a:stretch>
                       <a:fillRect/>
                     </a:stretch>
@@ -5966,9 +5963,9 @@
         </w:drawing>
       </w:r>
     </w:p>
+    <w:bookmarkEnd w:id="73"/>
     <w:bookmarkEnd w:id="74"/>
-    <w:bookmarkEnd w:id="75"/>
-    <w:bookmarkStart w:id="84" w:name="X8e6c2e51255b1d83ebf08892992366d4829a5be"/>
+    <w:bookmarkStart w:id="83" w:name="X8e6c2e51255b1d83ebf08892992366d4829a5be"/>
     <w:p>
       <w:pPr>
         <w:pStyle w:val="Heading3"/>
@@ -6674,7 +6671,7 @@
         <w:t xml:space="preserve">We have already simulated 10,000 samples for each hazard ratio and event rate, to generate 10,000 risk ratios.</w:t>
       </w:r>
     </w:p>
-    <w:bookmarkStart w:id="79" w:name="simulated-risk-ratios-for-strata-1-4-t_1"/>
+    <w:bookmarkStart w:id="78" w:name="simulated-risk-ratios-for-strata-1-4-t_1"/>
     <w:p>
       <w:pPr>
         <w:pStyle w:val="Heading4"/>
@@ -6718,18 +6715,18 @@
           <wp:inline>
             <wp:extent cx="5334000" cy="3556000"/>
             <wp:effectExtent b="0" l="0" r="0" t="0"/>
-            <wp:docPr descr="" title="" id="77" name="Picture"/>
+            <wp:docPr descr="" title="" id="76" name="Picture"/>
             <a:graphic>
               <a:graphicData uri="http://schemas.openxmlformats.org/drawingml/2006/picture">
                 <pic:pic>
                   <pic:nvPicPr>
-                    <pic:cNvPr descr="treatment-calibration-trident-protocol_files/figure-docx/risk%20plot%20t1-1.png" id="78" name="Picture"/>
+                    <pic:cNvPr descr="treatment-calibration-trident-protocol_files/figure-docx/risk%20plot%20t1-1.png" id="77" name="Picture"/>
                     <pic:cNvPicPr>
                       <a:picLocks noChangeArrowheads="1" noChangeAspect="1"/>
                     </pic:cNvPicPr>
                   </pic:nvPicPr>
                   <pic:blipFill>
-                    <a:blip r:embed="rId76"/>
+                    <a:blip r:embed="rId75"/>
                     <a:stretch>
                       <a:fillRect/>
                     </a:stretch>
@@ -6756,8 +6753,8 @@
         </w:drawing>
       </w:r>
     </w:p>
-    <w:bookmarkEnd w:id="79"/>
-    <w:bookmarkStart w:id="83" w:name="simulated-risk-ratios-for-strata-1-4-t_2"/>
+    <w:bookmarkEnd w:id="78"/>
+    <w:bookmarkStart w:id="82" w:name="simulated-risk-ratios-for-strata-1-4-t_2"/>
     <w:p>
       <w:pPr>
         <w:pStyle w:val="Heading4"/>
@@ -6801,18 +6798,18 @@
           <wp:inline>
             <wp:extent cx="5334000" cy="3556000"/>
             <wp:effectExtent b="0" l="0" r="0" t="0"/>
-            <wp:docPr descr="" title="" id="81" name="Picture"/>
+            <wp:docPr descr="" title="" id="80" name="Picture"/>
             <a:graphic>
               <a:graphicData uri="http://schemas.openxmlformats.org/drawingml/2006/picture">
                 <pic:pic>
                   <pic:nvPicPr>
-                    <pic:cNvPr descr="treatment-calibration-trident-protocol_files/figure-docx/risk%20plot%20t2-1.png" id="82" name="Picture"/>
+                    <pic:cNvPr descr="treatment-calibration-trident-protocol_files/figure-docx/risk%20plot%20t2-1.png" id="81" name="Picture"/>
                     <pic:cNvPicPr>
                       <a:picLocks noChangeArrowheads="1" noChangeAspect="1"/>
                     </pic:cNvPicPr>
                   </pic:nvPicPr>
                   <pic:blipFill>
-                    <a:blip r:embed="rId80"/>
+                    <a:blip r:embed="rId79"/>
                     <a:stretch>
                       <a:fillRect/>
                     </a:stretch>
@@ -6839,9 +6836,9 @@
         </w:drawing>
       </w:r>
     </w:p>
+    <w:bookmarkEnd w:id="82"/>
     <w:bookmarkEnd w:id="83"/>
-    <w:bookmarkEnd w:id="84"/>
-    <w:bookmarkStart w:id="89" w:name="pooled-risk-ratio"/>
+    <w:bookmarkStart w:id="88" w:name="pooled-risk-ratio"/>
     <w:p>
       <w:pPr>
         <w:pStyle w:val="Heading3"/>
@@ -6973,7 +6970,7 @@
         <w:t xml:space="preserve">We do this for all samples, then generate a mean and confidence intervals for the calibrated relative risk.</w:t>
       </w:r>
     </w:p>
-    <w:bookmarkStart w:id="88" w:name="X3659c3bfde0350aa336b81064c5b80d2f8b3ab2"/>
+    <w:bookmarkStart w:id="87" w:name="X3659c3bfde0350aa336b81064c5b80d2f8b3ab2"/>
     <w:p>
       <w:pPr>
         <w:pStyle w:val="Heading4"/>
@@ -7011,18 +7008,18 @@
           <wp:inline>
             <wp:extent cx="4876800" cy="3657600"/>
             <wp:effectExtent b="0" l="0" r="0" t="0"/>
-            <wp:docPr descr="" title="" id="86" name="Picture"/>
+            <wp:docPr descr="" title="" id="85" name="Picture"/>
             <a:graphic>
               <a:graphicData uri="http://schemas.openxmlformats.org/drawingml/2006/picture">
                 <pic:pic>
                   <pic:nvPicPr>
-                    <pic:cNvPr descr="treatment-calibration-trident-protocol_files/figure-docx/t2%20pooled%20results-1.png" id="87" name="Picture"/>
+                    <pic:cNvPr descr="treatment-calibration-trident-protocol_files/figure-docx/t2%20pooled%20results-1.png" id="86" name="Picture"/>
                     <pic:cNvPicPr>
                       <a:picLocks noChangeArrowheads="1" noChangeAspect="1"/>
                     </pic:cNvPicPr>
                   </pic:nvPicPr>
                   <pic:blipFill>
-                    <a:blip r:embed="rId85"/>
+                    <a:blip r:embed="rId84"/>
                     <a:stretch>
                       <a:fillRect/>
                     </a:stretch>
@@ -7049,9 +7046,9 @@
         </w:drawing>
       </w:r>
     </w:p>
+    <w:bookmarkEnd w:id="87"/>
     <w:bookmarkEnd w:id="88"/>
-    <w:bookmarkEnd w:id="89"/>
-    <w:bookmarkStart w:id="90" w:name="absolute-risk"/>
+    <w:bookmarkStart w:id="89" w:name="absolute-risk"/>
     <w:p>
       <w:pPr>
         <w:pStyle w:val="Heading3"/>
@@ -7244,9 +7241,9 @@
         <w:t xml:space="preserve"> The number needed to treat is 34.11 (95% CI 30.17 - 40.1).</w:t>
       </w:r>
     </w:p>
+    <w:bookmarkEnd w:id="89"/>
     <w:bookmarkEnd w:id="90"/>
-    <w:bookmarkEnd w:id="91"/>
-    <w:bookmarkStart w:id="92" w:name="extension-to-adverse-events"/>
+    <w:bookmarkStart w:id="91" w:name="extension-to-adverse-events"/>
     <w:p>
       <w:pPr>
         <w:pStyle w:val="Heading2"/>
@@ -7269,11 +7266,27 @@
         <w:pStyle w:val="FirstParagraph"/>
       </w:pPr>
       <w:r>
-        <w:t xml:space="preserve">Benefits of treatment must be balanced against potential risks. Adverse events of special interest were hypotension, syncope, headache, hyponatremia, hyperkalemia, injurious falls,and acute kidney injury. There was also a protocol requirement of discontinuation if serum creatinine increased level of 20% or more from the baseline value (creatinine was measured at baseline, 6 weeks and at the end of the trial). We have applied to link the LATCH cohort to routinely-collected data in Lothian, including renal function measurements. If sufficient people in LATCH have repeat measurements of renal function, we could apply a similar method to above, to calibrate the rate of decline in renal function to a specified threshold (eg &gt;20% increase in creatinine, &gt;30% decline in eGFR).</w:t>
-      </w:r>
-    </w:p>
-    <w:bookmarkEnd w:id="92"/>
-    <w:bookmarkStart w:id="122" w:name="references"/>
+        <w:t xml:space="preserve">Benefits of treatment must be balanced against potential risks, and so it might be informative to calibrate adverse events. In TRIDENT, adverse events of special interest were hypotension, syncope, headache, hyponatremia, hyperkalemia, injurious falls,and acute kidney injury. There was also a protocol requirement of discontinuation if serum creatinine increased level of 20% or more from the baseline value (creatinine was measured at baseline, 6 weeks and at the end of the trial).</w:t>
+      </w:r>
+    </w:p>
+    <w:p>
+      <w:pPr>
+        <w:pStyle w:val="BodyText"/>
+      </w:pPr>
+      <w:r>
+        <w:t xml:space="preserve">Most of these adverse events were not measured in LATCH, but we have applied to link the LATCH cohort to routinely-collected data in Lothian, including renal function measurements. While a decline in renal function might not lead to discontinuation of a drug, it might have important implications for drug monitoring.</w:t>
+      </w:r>
+    </w:p>
+    <w:p>
+      <w:pPr>
+        <w:pStyle w:val="BodyText"/>
+      </w:pPr>
+      <w:r>
+        <w:t xml:space="preserve">If sufficient people in LATCH have repeat measurements of renal function, we could apply a similar method to above, to calibrate the rate of decline in renal function to a specified threshold (eg &gt;20% increase in creatinine, &gt;30% decline in eGFR).</w:t>
+      </w:r>
+    </w:p>
+    <w:bookmarkEnd w:id="91"/>
+    <w:bookmarkStart w:id="121" w:name="references"/>
     <w:p>
       <w:pPr>
         <w:pStyle w:val="Heading2"/>
@@ -7291,8 +7304,8 @@
         <w:t xml:space="preserve">References</w:t>
       </w:r>
     </w:p>
-    <w:bookmarkStart w:id="121" w:name="refs"/>
-    <w:bookmarkStart w:id="94" w:name="ref-Feigin2024"/>
+    <w:bookmarkStart w:id="120" w:name="refs"/>
+    <w:bookmarkStart w:id="93" w:name="ref-Feigin2024"/>
     <w:p>
       <w:pPr>
         <w:pStyle w:val="Bibliography"/>
@@ -7322,7 +7335,7 @@
       <w:r>
         <w:t xml:space="preserve">. 2024;23:973-1003. doi:</w:t>
       </w:r>
-      <w:hyperlink r:id="rId93">
+      <w:hyperlink r:id="rId92">
         <w:r>
           <w:rPr>
             <w:rStyle w:val="Hyperlink"/>
@@ -7331,8 +7344,8 @@
         </w:r>
       </w:hyperlink>
     </w:p>
-    <w:bookmarkEnd w:id="94"/>
-    <w:bookmarkStart w:id="96" w:name="ref-Putri2026"/>
+    <w:bookmarkEnd w:id="93"/>
+    <w:bookmarkStart w:id="95" w:name="ref-Putri2026"/>
     <w:p>
       <w:pPr>
         <w:pStyle w:val="Bibliography"/>
@@ -7362,7 +7375,7 @@
       <w:r>
         <w:t xml:space="preserve">. October 2026. doi:</w:t>
       </w:r>
-      <w:hyperlink r:id="rId95">
+      <w:hyperlink r:id="rId94">
         <w:r>
           <w:rPr>
             <w:rStyle w:val="Hyperlink"/>
@@ -7371,8 +7384,8 @@
         </w:r>
       </w:hyperlink>
     </w:p>
-    <w:bookmarkEnd w:id="96"/>
-    <w:bookmarkStart w:id="98" w:name="ref-Anderson2022"/>
+    <w:bookmarkEnd w:id="95"/>
+    <w:bookmarkStart w:id="97" w:name="ref-Anderson2022"/>
     <w:p>
       <w:pPr>
         <w:pStyle w:val="Bibliography"/>
@@ -7402,7 +7415,7 @@
       <w:r>
         <w:t xml:space="preserve">. 2022;17:1156-1162. doi:</w:t>
       </w:r>
-      <w:hyperlink r:id="rId97">
+      <w:hyperlink r:id="rId96">
         <w:r>
           <w:rPr>
             <w:rStyle w:val="Hyperlink"/>
@@ -7411,8 +7424,8 @@
         </w:r>
       </w:hyperlink>
     </w:p>
-    <w:bookmarkEnd w:id="98"/>
-    <w:bookmarkStart w:id="100" w:name="ref-Westreich2019"/>
+    <w:bookmarkEnd w:id="97"/>
+    <w:bookmarkStart w:id="99" w:name="ref-Westreich2019"/>
     <w:p>
       <w:pPr>
         <w:pStyle w:val="Bibliography"/>
@@ -7442,7 +7455,7 @@
       <w:r>
         <w:t xml:space="preserve">. 2019;188:438-443. doi:</w:t>
       </w:r>
-      <w:hyperlink r:id="rId99">
+      <w:hyperlink r:id="rId98">
         <w:r>
           <w:rPr>
             <w:rStyle w:val="Hyperlink"/>
@@ -7451,8 +7464,8 @@
         </w:r>
       </w:hyperlink>
     </w:p>
-    <w:bookmarkEnd w:id="100"/>
-    <w:bookmarkStart w:id="102" w:name="ref-Bareinboim2016"/>
+    <w:bookmarkEnd w:id="99"/>
+    <w:bookmarkStart w:id="101" w:name="ref-Bareinboim2016"/>
     <w:p>
       <w:pPr>
         <w:pStyle w:val="Bibliography"/>
@@ -7482,7 +7495,7 @@
       <w:r>
         <w:t xml:space="preserve">. 2016;113:7345-7352. doi:</w:t>
       </w:r>
-      <w:hyperlink r:id="rId101">
+      <w:hyperlink r:id="rId100">
         <w:r>
           <w:rPr>
             <w:rStyle w:val="Hyperlink"/>
@@ -7491,8 +7504,8 @@
         </w:r>
       </w:hyperlink>
     </w:p>
-    <w:bookmarkEnd w:id="102"/>
-    <w:bookmarkStart w:id="104" w:name="ref-Rothwell2005"/>
+    <w:bookmarkEnd w:id="101"/>
+    <w:bookmarkStart w:id="103" w:name="ref-Rothwell2005"/>
     <w:p>
       <w:pPr>
         <w:pStyle w:val="Bibliography"/>
@@ -7522,7 +7535,7 @@
       <w:r>
         <w:t xml:space="preserve">. 2005;365:82-93. doi:</w:t>
       </w:r>
-      <w:hyperlink r:id="rId103">
+      <w:hyperlink r:id="rId102">
         <w:r>
           <w:rPr>
             <w:rStyle w:val="Hyperlink"/>
@@ -7531,8 +7544,8 @@
         </w:r>
       </w:hyperlink>
     </w:p>
-    <w:bookmarkEnd w:id="104"/>
-    <w:bookmarkStart w:id="106" w:name="ref-Sheppard2020"/>
+    <w:bookmarkEnd w:id="103"/>
+    <w:bookmarkStart w:id="105" w:name="ref-Sheppard2020"/>
     <w:p>
       <w:pPr>
         <w:pStyle w:val="Bibliography"/>
@@ -7562,7 +7575,7 @@
       <w:r>
         <w:t xml:space="preserve">. 2020;68:2508-2515. doi:</w:t>
       </w:r>
-      <w:hyperlink r:id="rId105">
+      <w:hyperlink r:id="rId104">
         <w:r>
           <w:rPr>
             <w:rStyle w:val="Hyperlink"/>
@@ -7571,8 +7584,8 @@
         </w:r>
       </w:hyperlink>
     </w:p>
-    <w:bookmarkEnd w:id="106"/>
-    <w:bookmarkStart w:id="108" w:name="ref-Sardar2014"/>
+    <w:bookmarkEnd w:id="105"/>
+    <w:bookmarkStart w:id="107" w:name="ref-Sardar2014"/>
     <w:p>
       <w:pPr>
         <w:pStyle w:val="Bibliography"/>
@@ -7602,7 +7615,7 @@
       <w:r>
         <w:t xml:space="preserve">. 2014;174:1868-1870. doi:</w:t>
       </w:r>
-      <w:hyperlink r:id="rId107">
+      <w:hyperlink r:id="rId106">
         <w:r>
           <w:rPr>
             <w:rStyle w:val="Hyperlink"/>
@@ -7611,8 +7624,8 @@
         </w:r>
       </w:hyperlink>
     </w:p>
-    <w:bookmarkEnd w:id="108"/>
-    <w:bookmarkStart w:id="110" w:name="ref-Carcel2021"/>
+    <w:bookmarkEnd w:id="107"/>
+    <w:bookmarkStart w:id="109" w:name="ref-Carcel2021"/>
     <w:p>
       <w:pPr>
         <w:pStyle w:val="Bibliography"/>
@@ -7642,7 +7655,7 @@
       <w:r>
         <w:t xml:space="preserve">. 2021;52:452-457. doi:</w:t>
       </w:r>
-      <w:hyperlink r:id="rId109">
+      <w:hyperlink r:id="rId108">
         <w:r>
           <w:rPr>
             <w:rStyle w:val="Hyperlink"/>
@@ -7651,8 +7664,8 @@
         </w:r>
       </w:hyperlink>
     </w:p>
-    <w:bookmarkEnd w:id="110"/>
-    <w:bookmarkStart w:id="112" w:name="ref-Cole2010"/>
+    <w:bookmarkEnd w:id="109"/>
+    <w:bookmarkStart w:id="111" w:name="ref-Cole2010"/>
     <w:p>
       <w:pPr>
         <w:pStyle w:val="Bibliography"/>
@@ -7682,7 +7695,7 @@
       <w:r>
         <w:t xml:space="preserve">. 2010;172:107-115. doi:</w:t>
       </w:r>
-      <w:hyperlink r:id="rId111">
+      <w:hyperlink r:id="rId110">
         <w:r>
           <w:rPr>
             <w:rStyle w:val="Hyperlink"/>
@@ -7691,8 +7704,8 @@
         </w:r>
       </w:hyperlink>
     </w:p>
-    <w:bookmarkEnd w:id="112"/>
-    <w:bookmarkStart w:id="114" w:name="ref-Manke-Reimers2025"/>
+    <w:bookmarkEnd w:id="111"/>
+    <w:bookmarkStart w:id="113" w:name="ref-Manke-Reimers2025"/>
     <w:p>
       <w:pPr>
         <w:pStyle w:val="Bibliography"/>
@@ -7722,7 +7735,7 @@
       <w:r>
         <w:t xml:space="preserve">. 2025;40:255-273. doi:</w:t>
       </w:r>
-      <w:hyperlink r:id="rId113">
+      <w:hyperlink r:id="rId112">
         <w:r>
           <w:rPr>
             <w:rStyle w:val="Hyperlink"/>
@@ -7731,8 +7744,8 @@
         </w:r>
       </w:hyperlink>
     </w:p>
-    <w:bookmarkEnd w:id="114"/>
-    <w:bookmarkStart w:id="116" w:name="ref-Wei2023"/>
+    <w:bookmarkEnd w:id="113"/>
+    <w:bookmarkStart w:id="115" w:name="ref-Wei2023"/>
     <w:p>
       <w:pPr>
         <w:pStyle w:val="Bibliography"/>
@@ -7762,7 +7775,7 @@
       <w:r>
         <w:t xml:space="preserve">. 2023;162:160-168. doi:</w:t>
       </w:r>
-      <w:hyperlink r:id="rId115">
+      <w:hyperlink r:id="rId114">
         <w:r>
           <w:rPr>
             <w:rStyle w:val="Hyperlink"/>
@@ -7771,8 +7784,8 @@
         </w:r>
       </w:hyperlink>
     </w:p>
-    <w:bookmarkEnd w:id="116"/>
-    <w:bookmarkStart w:id="118" w:name="ref-Samarasekera2015"/>
+    <w:bookmarkEnd w:id="115"/>
+    <w:bookmarkStart w:id="117" w:name="ref-Samarasekera2015"/>
     <w:p>
       <w:pPr>
         <w:pStyle w:val="Bibliography"/>
@@ -7802,7 +7815,7 @@
       <w:r>
         <w:t xml:space="preserve">. 2015;46:361-368. doi:</w:t>
       </w:r>
-      <w:hyperlink r:id="rId117">
+      <w:hyperlink r:id="rId116">
         <w:r>
           <w:rPr>
             <w:rStyle w:val="Hyperlink"/>
@@ -7811,8 +7824,8 @@
         </w:r>
       </w:hyperlink>
     </w:p>
-    <w:bookmarkEnd w:id="118"/>
-    <w:bookmarkStart w:id="120" w:name="ref-Turner2015"/>
+    <w:bookmarkEnd w:id="117"/>
+    <w:bookmarkStart w:id="119" w:name="ref-Turner2015"/>
     <w:p>
       <w:pPr>
         <w:pStyle w:val="Bibliography"/>
@@ -7842,7 +7855,7 @@
       <w:r>
         <w:t xml:space="preserve">. 2015;15. doi:</w:t>
       </w:r>
-      <w:hyperlink r:id="rId119">
+      <w:hyperlink r:id="rId118">
         <w:r>
           <w:rPr>
             <w:rStyle w:val="Hyperlink"/>
@@ -7851,10 +7864,10 @@
         </w:r>
       </w:hyperlink>
     </w:p>
+    <w:bookmarkEnd w:id="119"/>
     <w:bookmarkEnd w:id="120"/>
     <w:bookmarkEnd w:id="121"/>
-    <w:bookmarkEnd w:id="122"/>
-    <w:bookmarkStart w:id="126" w:name="appendix"/>
+    <w:bookmarkStart w:id="125" w:name="appendix"/>
     <w:p>
       <w:pPr>
         <w:pStyle w:val="Heading2"/>
@@ -7920,18 +7933,18 @@
           <wp:inline>
             <wp:extent cx="3657600" cy="2438400"/>
             <wp:effectExtent b="0" l="0" r="0" t="0"/>
-            <wp:docPr descr="" title="" id="124" name="Picture"/>
+            <wp:docPr descr="" title="" id="123" name="Picture"/>
             <a:graphic>
               <a:graphicData uri="http://schemas.openxmlformats.org/drawingml/2006/picture">
                 <pic:pic>
                   <pic:nvPicPr>
-                    <pic:cNvPr descr="treatment-calibration-trident-protocol_files/figure-docx/t1%20pooled%20results-1.png" id="125" name="Picture"/>
+                    <pic:cNvPr descr="treatment-calibration-trident-protocol_files/figure-docx/t1%20pooled%20results-1.png" id="124" name="Picture"/>
                     <pic:cNvPicPr>
                       <a:picLocks noChangeArrowheads="1" noChangeAspect="1"/>
                     </pic:cNvPicPr>
                   </pic:nvPicPr>
                   <pic:blipFill>
-                    <a:blip r:embed="rId123"/>
+                    <a:blip r:embed="rId122"/>
                     <a:stretch>
                       <a:fillRect/>
                     </a:stretch>
@@ -7958,7 +7971,7 @@
         </w:drawing>
       </w:r>
     </w:p>
-    <w:bookmarkEnd w:id="126"/>
+    <w:bookmarkEnd w:id="125"/>
     <w:sectPr>
       <w:footnotePr>
         <w:numRestart w:val="eachSect"/>
@@ -8188,6 +8201,9 @@
     <w:abstractNumId w:val="991"/>
   </w:num>
   <w:num w:numId="1005">
+    <w:abstractNumId w:val="991"/>
+  </w:num>
+  <w:num w:numId="1006">
     <w:abstractNumId w:val="991"/>
   </w:num>
 </w:numbering>

</xml_diff>

<commit_message>
Added reference to TRIDENT NEJM paper
</commit_message>
<xml_diff>
--- a/treatment-calibration-trident-protocol.docx
+++ b/treatment-calibration-trident-protocol.docx
@@ -23,7 +23,7 @@
         <w:pStyle w:val="Date"/>
       </w:pPr>
       <w:r>
-        <w:t xml:space="preserve">2026-04-22</w:t>
+        <w:t xml:space="preserve">2026-04-23</w:t>
       </w:r>
     </w:p>
     <w:sdt>
@@ -7385,7 +7385,7 @@
       </w:hyperlink>
     </w:p>
     <w:bookmarkEnd w:id="95"/>
-    <w:bookmarkStart w:id="97" w:name="ref-Anderson2022"/>
+    <w:bookmarkStart w:id="97" w:name="ref-Chalmers2026"/>
     <w:p>
       <w:pPr>
         <w:pStyle w:val="Bibliography"/>
@@ -7400,7 +7400,7 @@
         <w:t xml:space="preserve">	</w:t>
       </w:r>
       <w:r>
-        <w:t xml:space="preserve">Anderson CS, Rodgers A, Silva HA de, et al. Triple therapy prevention of recurrent intracerebral disease events trial: Rationale, design and progress.</w:t>
+        <w:t xml:space="preserve">The Trident Research Group. Three low-dose antihypertensive agents in a single pill after intracerebral hemorrhage.</w:t>
       </w:r>
       <w:r>
         <w:t xml:space="preserve"> </w:t>
@@ -7410,17 +7410,17 @@
           <w:i/>
           <w:iCs/>
         </w:rPr>
-        <w:t xml:space="preserve">International journal of stroke : official journal of the International Stroke Society</w:t>
-      </w:r>
-      <w:r>
-        <w:t xml:space="preserve">. 2022;17:1156-1162. doi:</w:t>
+        <w:t xml:space="preserve">New England Journal of Medicine</w:t>
+      </w:r>
+      <w:r>
+        <w:t xml:space="preserve">. 2026;394:1571-1582. doi:</w:t>
       </w:r>
       <w:hyperlink r:id="rId96">
         <w:r>
           <w:rPr>
             <w:rStyle w:val="Hyperlink"/>
           </w:rPr>
-          <w:t xml:space="preserve">10.1177/17474930211068671</w:t>
+          <w:t xml:space="preserve">10.1056/NEJMOA2515043</w:t>
         </w:r>
       </w:hyperlink>
     </w:p>

</xml_diff>